<commit_message>
Lay out Part 1 numbers in two columns
Co-authored-by: sin-boo <sin-boo@users.noreply.github.com>
</commit_message>
<xml_diff>
--- a/japanese_docs/japanese_numbers_worksheet.docx
+++ b/japanese_docs/japanese_numbers_worksheet.docx
@@ -409,1904 +409,2184 @@
         <w:t>Part 1 — Write the Numbers</w:t>
       </w:r>
     </w:p>
-    <w:p>
-      <w:pPr>
-        <w:spacing w:before="60" w:after="0"/>
-      </w:pPr>
-      <w:r>
-        <w:rPr>
-          <w:rFonts w:ascii="Calibri" w:hAnsi="Calibri"/>
-          <w:b/>
-          <w:i w:val="0"/>
-          <w:color w:val="007A87"/>
-          <w:sz w:val="20"/>
-        </w:rPr>
-        <w:t xml:space="preserve"> 1.  </w:t>
-      </w:r>
-      <w:r>
-        <w:rPr>
-          <w:rFonts w:ascii="Calibri" w:hAnsi="Calibri"/>
-          <w:b w:val="0"/>
-          <w:i w:val="0"/>
-          <w:color w:val="1A1A2E"/>
-          <w:sz w:val="20"/>
-        </w:rPr>
-        <w:t>1  — One</w:t>
-      </w:r>
-    </w:p>
-    <w:p>
-      <w:pPr>
-        <w:spacing w:before="0" w:after="0"/>
-        <w:ind w:left="567"/>
-      </w:pPr>
-      <w:r>
-        <w:rPr>
-          <w:rFonts w:ascii="Calibri" w:hAnsi="Calibri"/>
-          <w:b/>
-          <w:i w:val="0"/>
-          <w:color w:val="007A87"/>
-          <w:sz w:val="18"/>
-        </w:rPr>
-        <w:t xml:space="preserve">Kanji:    </w:t>
-      </w:r>
-      <w:r>
-        <w:rPr>
-          <w:rFonts w:ascii="Calibri" w:hAnsi="Calibri"/>
-          <w:b w:val="0"/>
-          <w:i w:val="0"/>
-          <w:color w:val="1A1A2E"/>
-          <w:sz w:val="18"/>
-        </w:rPr>
-        <w:t>___________________________________</w:t>
-      </w:r>
-    </w:p>
-    <w:p>
-      <w:pPr>
-        <w:spacing w:before="0" w:after="0"/>
-        <w:ind w:left="567"/>
-      </w:pPr>
-      <w:r>
-        <w:rPr>
-          <w:rFonts w:ascii="Calibri" w:hAnsi="Calibri"/>
-          <w:b/>
-          <w:i w:val="0"/>
-          <w:color w:val="007A87"/>
-          <w:sz w:val="18"/>
-        </w:rPr>
-        <w:t>Hiragana:</w:t>
-      </w:r>
-      <w:r>
-        <w:rPr>
-          <w:rFonts w:ascii="Calibri" w:hAnsi="Calibri"/>
-          <w:b w:val="0"/>
-          <w:i w:val="0"/>
-          <w:color w:val="1A1A2E"/>
-          <w:sz w:val="18"/>
-        </w:rPr>
-        <w:t>___________________________________</w:t>
-      </w:r>
-    </w:p>
-    <w:p>
-      <w:pPr>
-        <w:spacing w:before="0" w:after="0"/>
-        <w:ind w:left="567"/>
-      </w:pPr>
-      <w:r>
-        <w:rPr>
-          <w:rFonts w:ascii="Calibri" w:hAnsi="Calibri"/>
-          <w:b/>
-          <w:i w:val="0"/>
-          <w:color w:val="007A87"/>
-          <w:sz w:val="18"/>
-        </w:rPr>
-        <w:t xml:space="preserve">Romaji:  </w:t>
-      </w:r>
-      <w:r>
-        <w:rPr>
-          <w:rFonts w:ascii="Calibri" w:hAnsi="Calibri"/>
-          <w:b w:val="0"/>
-          <w:i w:val="0"/>
-          <w:color w:val="1A1A2E"/>
-          <w:sz w:val="18"/>
-        </w:rPr>
-        <w:t>___________________________________</w:t>
-      </w:r>
-      <w:r>
-        <w:rPr>
-          <w:rFonts w:ascii="Calibri" w:hAnsi="Calibri"/>
-          <w:b w:val="0"/>
-          <w:i/>
-          <w:color w:val="6B7B8D"/>
-          <w:sz w:val="16"/>
-        </w:rPr>
-        <w:t xml:space="preserve">  (ichi)</w:t>
-      </w:r>
-    </w:p>
-    <w:p>
-      <w:pPr>
-        <w:spacing w:before="60" w:after="0"/>
-      </w:pPr>
-      <w:r>
-        <w:rPr>
-          <w:rFonts w:ascii="Calibri" w:hAnsi="Calibri"/>
-          <w:b/>
-          <w:i w:val="0"/>
-          <w:color w:val="007A87"/>
-          <w:sz w:val="20"/>
-        </w:rPr>
-        <w:t xml:space="preserve"> 2.  </w:t>
-      </w:r>
-      <w:r>
-        <w:rPr>
-          <w:rFonts w:ascii="Calibri" w:hAnsi="Calibri"/>
-          <w:b w:val="0"/>
-          <w:i w:val="0"/>
-          <w:color w:val="1A1A2E"/>
-          <w:sz w:val="20"/>
-        </w:rPr>
-        <w:t>2  — Two</w:t>
-      </w:r>
-    </w:p>
-    <w:p>
-      <w:pPr>
-        <w:spacing w:before="0" w:after="0"/>
-        <w:ind w:left="567"/>
-      </w:pPr>
-      <w:r>
-        <w:rPr>
-          <w:rFonts w:ascii="Calibri" w:hAnsi="Calibri"/>
-          <w:b/>
-          <w:i w:val="0"/>
-          <w:color w:val="007A87"/>
-          <w:sz w:val="18"/>
-        </w:rPr>
-        <w:t xml:space="preserve">Kanji:    </w:t>
-      </w:r>
-      <w:r>
-        <w:rPr>
-          <w:rFonts w:ascii="Calibri" w:hAnsi="Calibri"/>
-          <w:b w:val="0"/>
-          <w:i w:val="0"/>
-          <w:color w:val="1A1A2E"/>
-          <w:sz w:val="18"/>
-        </w:rPr>
-        <w:t>___________________________________</w:t>
-      </w:r>
-    </w:p>
-    <w:p>
-      <w:pPr>
-        <w:spacing w:before="0" w:after="0"/>
-        <w:ind w:left="567"/>
-      </w:pPr>
-      <w:r>
-        <w:rPr>
-          <w:rFonts w:ascii="Calibri" w:hAnsi="Calibri"/>
-          <w:b/>
-          <w:i w:val="0"/>
-          <w:color w:val="007A87"/>
-          <w:sz w:val="18"/>
-        </w:rPr>
-        <w:t>Hiragana:</w:t>
-      </w:r>
-      <w:r>
-        <w:rPr>
-          <w:rFonts w:ascii="Calibri" w:hAnsi="Calibri"/>
-          <w:b w:val="0"/>
-          <w:i w:val="0"/>
-          <w:color w:val="1A1A2E"/>
-          <w:sz w:val="18"/>
-        </w:rPr>
-        <w:t>___________________________________</w:t>
-      </w:r>
-    </w:p>
-    <w:p>
-      <w:pPr>
-        <w:spacing w:before="0" w:after="0"/>
-        <w:ind w:left="567"/>
-      </w:pPr>
-      <w:r>
-        <w:rPr>
-          <w:rFonts w:ascii="Calibri" w:hAnsi="Calibri"/>
-          <w:b/>
-          <w:i w:val="0"/>
-          <w:color w:val="007A87"/>
-          <w:sz w:val="18"/>
-        </w:rPr>
-        <w:t xml:space="preserve">Romaji:  </w:t>
-      </w:r>
-      <w:r>
-        <w:rPr>
-          <w:rFonts w:ascii="Calibri" w:hAnsi="Calibri"/>
-          <w:b w:val="0"/>
-          <w:i w:val="0"/>
-          <w:color w:val="1A1A2E"/>
-          <w:sz w:val="18"/>
-        </w:rPr>
-        <w:t>___________________________________</w:t>
-      </w:r>
-      <w:r>
-        <w:rPr>
-          <w:rFonts w:ascii="Calibri" w:hAnsi="Calibri"/>
-          <w:b w:val="0"/>
-          <w:i/>
-          <w:color w:val="6B7B8D"/>
-          <w:sz w:val="16"/>
-        </w:rPr>
-        <w:t xml:space="preserve">  (ni)</w:t>
-      </w:r>
-    </w:p>
-    <w:p>
-      <w:pPr>
-        <w:spacing w:before="60" w:after="0"/>
-      </w:pPr>
-      <w:r>
-        <w:rPr>
-          <w:rFonts w:ascii="Calibri" w:hAnsi="Calibri"/>
-          <w:b/>
-          <w:i w:val="0"/>
-          <w:color w:val="007A87"/>
-          <w:sz w:val="20"/>
-        </w:rPr>
-        <w:t xml:space="preserve"> 3.  </w:t>
-      </w:r>
-      <w:r>
-        <w:rPr>
-          <w:rFonts w:ascii="Calibri" w:hAnsi="Calibri"/>
-          <w:b w:val="0"/>
-          <w:i w:val="0"/>
-          <w:color w:val="1A1A2E"/>
-          <w:sz w:val="20"/>
-        </w:rPr>
-        <w:t>3  — Three</w:t>
-      </w:r>
-    </w:p>
-    <w:p>
-      <w:pPr>
-        <w:spacing w:before="0" w:after="0"/>
-        <w:ind w:left="567"/>
-      </w:pPr>
-      <w:r>
-        <w:rPr>
-          <w:rFonts w:ascii="Calibri" w:hAnsi="Calibri"/>
-          <w:b/>
-          <w:i w:val="0"/>
-          <w:color w:val="007A87"/>
-          <w:sz w:val="18"/>
-        </w:rPr>
-        <w:t xml:space="preserve">Kanji:    </w:t>
-      </w:r>
-      <w:r>
-        <w:rPr>
-          <w:rFonts w:ascii="Calibri" w:hAnsi="Calibri"/>
-          <w:b w:val="0"/>
-          <w:i w:val="0"/>
-          <w:color w:val="1A1A2E"/>
-          <w:sz w:val="18"/>
-        </w:rPr>
-        <w:t>___________________________________</w:t>
-      </w:r>
-    </w:p>
-    <w:p>
-      <w:pPr>
-        <w:spacing w:before="0" w:after="0"/>
-        <w:ind w:left="567"/>
-      </w:pPr>
-      <w:r>
-        <w:rPr>
-          <w:rFonts w:ascii="Calibri" w:hAnsi="Calibri"/>
-          <w:b/>
-          <w:i w:val="0"/>
-          <w:color w:val="007A87"/>
-          <w:sz w:val="18"/>
-        </w:rPr>
-        <w:t>Hiragana:</w:t>
-      </w:r>
-      <w:r>
-        <w:rPr>
-          <w:rFonts w:ascii="Calibri" w:hAnsi="Calibri"/>
-          <w:b w:val="0"/>
-          <w:i w:val="0"/>
-          <w:color w:val="1A1A2E"/>
-          <w:sz w:val="18"/>
-        </w:rPr>
-        <w:t>___________________________________</w:t>
-      </w:r>
-    </w:p>
-    <w:p>
-      <w:pPr>
-        <w:spacing w:before="0" w:after="0"/>
-        <w:ind w:left="567"/>
-      </w:pPr>
-      <w:r>
-        <w:rPr>
-          <w:rFonts w:ascii="Calibri" w:hAnsi="Calibri"/>
-          <w:b/>
-          <w:i w:val="0"/>
-          <w:color w:val="007A87"/>
-          <w:sz w:val="18"/>
-        </w:rPr>
-        <w:t xml:space="preserve">Romaji:  </w:t>
-      </w:r>
-      <w:r>
-        <w:rPr>
-          <w:rFonts w:ascii="Calibri" w:hAnsi="Calibri"/>
-          <w:b w:val="0"/>
-          <w:i w:val="0"/>
-          <w:color w:val="1A1A2E"/>
-          <w:sz w:val="18"/>
-        </w:rPr>
-        <w:t>___________________________________</w:t>
-      </w:r>
-      <w:r>
-        <w:rPr>
-          <w:rFonts w:ascii="Calibri" w:hAnsi="Calibri"/>
-          <w:b w:val="0"/>
-          <w:i/>
-          <w:color w:val="6B7B8D"/>
-          <w:sz w:val="16"/>
-        </w:rPr>
-        <w:t xml:space="preserve">  (san)</w:t>
-      </w:r>
-    </w:p>
-    <w:p>
-      <w:pPr>
-        <w:spacing w:before="60" w:after="0"/>
-      </w:pPr>
-      <w:r>
-        <w:rPr>
-          <w:rFonts w:ascii="Calibri" w:hAnsi="Calibri"/>
-          <w:b/>
-          <w:i w:val="0"/>
-          <w:color w:val="007A87"/>
-          <w:sz w:val="20"/>
-        </w:rPr>
-        <w:t xml:space="preserve"> 4.  </w:t>
-      </w:r>
-      <w:r>
-        <w:rPr>
-          <w:rFonts w:ascii="Calibri" w:hAnsi="Calibri"/>
-          <w:b w:val="0"/>
-          <w:i w:val="0"/>
-          <w:color w:val="1A1A2E"/>
-          <w:sz w:val="20"/>
-        </w:rPr>
-        <w:t>4  — Four</w:t>
-      </w:r>
-      <w:r>
-        <w:rPr>
-          <w:rFonts w:ascii="Calibri" w:hAnsi="Calibri"/>
-          <w:b w:val="0"/>
-          <w:i/>
-          <w:color w:val="6B7B8D"/>
-          <w:sz w:val="16"/>
-        </w:rPr>
-        <w:t xml:space="preserve">  ★ Both are used; よん is safer in daily speech.</w:t>
-      </w:r>
-    </w:p>
-    <w:p>
-      <w:pPr>
-        <w:spacing w:before="0" w:after="0"/>
-        <w:ind w:left="567"/>
-      </w:pPr>
-      <w:r>
-        <w:rPr>
-          <w:rFonts w:ascii="Calibri" w:hAnsi="Calibri"/>
-          <w:b/>
-          <w:i w:val="0"/>
-          <w:color w:val="007A87"/>
-          <w:sz w:val="18"/>
-        </w:rPr>
-        <w:t xml:space="preserve">Kanji:    </w:t>
-      </w:r>
-      <w:r>
-        <w:rPr>
-          <w:rFonts w:ascii="Calibri" w:hAnsi="Calibri"/>
-          <w:b w:val="0"/>
-          <w:i w:val="0"/>
-          <w:color w:val="1A1A2E"/>
-          <w:sz w:val="18"/>
-        </w:rPr>
-        <w:t>___________________________________</w:t>
-      </w:r>
-    </w:p>
-    <w:p>
-      <w:pPr>
-        <w:spacing w:before="0" w:after="0"/>
-        <w:ind w:left="567"/>
-      </w:pPr>
-      <w:r>
-        <w:rPr>
-          <w:rFonts w:ascii="Calibri" w:hAnsi="Calibri"/>
-          <w:b/>
-          <w:i w:val="0"/>
-          <w:color w:val="007A87"/>
-          <w:sz w:val="18"/>
-        </w:rPr>
-        <w:t>Hiragana:</w:t>
-      </w:r>
-      <w:r>
-        <w:rPr>
-          <w:rFonts w:ascii="Calibri" w:hAnsi="Calibri"/>
-          <w:b w:val="0"/>
-          <w:i w:val="0"/>
-          <w:color w:val="1A1A2E"/>
-          <w:sz w:val="18"/>
-        </w:rPr>
-        <w:t>___________________________________</w:t>
-      </w:r>
-    </w:p>
-    <w:p>
-      <w:pPr>
-        <w:spacing w:before="0" w:after="0"/>
-        <w:ind w:left="567"/>
-      </w:pPr>
-      <w:r>
-        <w:rPr>
-          <w:rFonts w:ascii="Calibri" w:hAnsi="Calibri"/>
-          <w:b/>
-          <w:i w:val="0"/>
-          <w:color w:val="007A87"/>
-          <w:sz w:val="18"/>
-        </w:rPr>
-        <w:t xml:space="preserve">Romaji:  </w:t>
-      </w:r>
-      <w:r>
-        <w:rPr>
-          <w:rFonts w:ascii="Calibri" w:hAnsi="Calibri"/>
-          <w:b w:val="0"/>
-          <w:i w:val="0"/>
-          <w:color w:val="1A1A2E"/>
-          <w:sz w:val="18"/>
-        </w:rPr>
-        <w:t>___________________________________</w:t>
-      </w:r>
-      <w:r>
-        <w:rPr>
-          <w:rFonts w:ascii="Calibri" w:hAnsi="Calibri"/>
-          <w:b w:val="0"/>
-          <w:i/>
-          <w:color w:val="6B7B8D"/>
-          <w:sz w:val="16"/>
-        </w:rPr>
-        <w:t xml:space="preserve">  (shi / yon)</w:t>
-      </w:r>
-    </w:p>
-    <w:p>
-      <w:pPr>
-        <w:spacing w:before="60" w:after="0"/>
-      </w:pPr>
-      <w:r>
-        <w:rPr>
-          <w:rFonts w:ascii="Calibri" w:hAnsi="Calibri"/>
-          <w:b/>
-          <w:i w:val="0"/>
-          <w:color w:val="007A87"/>
-          <w:sz w:val="20"/>
-        </w:rPr>
-        <w:t xml:space="preserve"> 5.  </w:t>
-      </w:r>
-      <w:r>
-        <w:rPr>
-          <w:rFonts w:ascii="Calibri" w:hAnsi="Calibri"/>
-          <w:b w:val="0"/>
-          <w:i w:val="0"/>
-          <w:color w:val="1A1A2E"/>
-          <w:sz w:val="20"/>
-        </w:rPr>
-        <w:t>5  — Five</w:t>
-      </w:r>
-    </w:p>
-    <w:p>
-      <w:pPr>
-        <w:spacing w:before="0" w:after="0"/>
-        <w:ind w:left="567"/>
-      </w:pPr>
-      <w:r>
-        <w:rPr>
-          <w:rFonts w:ascii="Calibri" w:hAnsi="Calibri"/>
-          <w:b/>
-          <w:i w:val="0"/>
-          <w:color w:val="007A87"/>
-          <w:sz w:val="18"/>
-        </w:rPr>
-        <w:t xml:space="preserve">Kanji:    </w:t>
-      </w:r>
-      <w:r>
-        <w:rPr>
-          <w:rFonts w:ascii="Calibri" w:hAnsi="Calibri"/>
-          <w:b w:val="0"/>
-          <w:i w:val="0"/>
-          <w:color w:val="1A1A2E"/>
-          <w:sz w:val="18"/>
-        </w:rPr>
-        <w:t>___________________________________</w:t>
-      </w:r>
-    </w:p>
-    <w:p>
-      <w:pPr>
-        <w:spacing w:before="0" w:after="0"/>
-        <w:ind w:left="567"/>
-      </w:pPr>
-      <w:r>
-        <w:rPr>
-          <w:rFonts w:ascii="Calibri" w:hAnsi="Calibri"/>
-          <w:b/>
-          <w:i w:val="0"/>
-          <w:color w:val="007A87"/>
-          <w:sz w:val="18"/>
-        </w:rPr>
-        <w:t>Hiragana:</w:t>
-      </w:r>
-      <w:r>
-        <w:rPr>
-          <w:rFonts w:ascii="Calibri" w:hAnsi="Calibri"/>
-          <w:b w:val="0"/>
-          <w:i w:val="0"/>
-          <w:color w:val="1A1A2E"/>
-          <w:sz w:val="18"/>
-        </w:rPr>
-        <w:t>___________________________________</w:t>
-      </w:r>
-    </w:p>
-    <w:p>
-      <w:pPr>
-        <w:spacing w:before="0" w:after="0"/>
-        <w:ind w:left="567"/>
-      </w:pPr>
-      <w:r>
-        <w:rPr>
-          <w:rFonts w:ascii="Calibri" w:hAnsi="Calibri"/>
-          <w:b/>
-          <w:i w:val="0"/>
-          <w:color w:val="007A87"/>
-          <w:sz w:val="18"/>
-        </w:rPr>
-        <w:t xml:space="preserve">Romaji:  </w:t>
-      </w:r>
-      <w:r>
-        <w:rPr>
-          <w:rFonts w:ascii="Calibri" w:hAnsi="Calibri"/>
-          <w:b w:val="0"/>
-          <w:i w:val="0"/>
-          <w:color w:val="1A1A2E"/>
-          <w:sz w:val="18"/>
-        </w:rPr>
-        <w:t>___________________________________</w:t>
-      </w:r>
-      <w:r>
-        <w:rPr>
-          <w:rFonts w:ascii="Calibri" w:hAnsi="Calibri"/>
-          <w:b w:val="0"/>
-          <w:i/>
-          <w:color w:val="6B7B8D"/>
-          <w:sz w:val="16"/>
-        </w:rPr>
-        <w:t xml:space="preserve">  (go)</w:t>
-      </w:r>
-    </w:p>
-    <w:p>
-      <w:pPr>
-        <w:spacing w:before="60" w:after="0"/>
-      </w:pPr>
-      <w:r>
-        <w:rPr>
-          <w:rFonts w:ascii="Calibri" w:hAnsi="Calibri"/>
-          <w:b/>
-          <w:i w:val="0"/>
-          <w:color w:val="007A87"/>
-          <w:sz w:val="20"/>
-        </w:rPr>
-        <w:t xml:space="preserve"> 6.  </w:t>
-      </w:r>
-      <w:r>
-        <w:rPr>
-          <w:rFonts w:ascii="Calibri" w:hAnsi="Calibri"/>
-          <w:b w:val="0"/>
-          <w:i w:val="0"/>
-          <w:color w:val="1A1A2E"/>
-          <w:sz w:val="20"/>
-        </w:rPr>
-        <w:t>6  — Six</w:t>
-      </w:r>
-    </w:p>
-    <w:p>
-      <w:pPr>
-        <w:spacing w:before="0" w:after="0"/>
-        <w:ind w:left="567"/>
-      </w:pPr>
-      <w:r>
-        <w:rPr>
-          <w:rFonts w:ascii="Calibri" w:hAnsi="Calibri"/>
-          <w:b/>
-          <w:i w:val="0"/>
-          <w:color w:val="007A87"/>
-          <w:sz w:val="18"/>
-        </w:rPr>
-        <w:t xml:space="preserve">Kanji:    </w:t>
-      </w:r>
-      <w:r>
-        <w:rPr>
-          <w:rFonts w:ascii="Calibri" w:hAnsi="Calibri"/>
-          <w:b w:val="0"/>
-          <w:i w:val="0"/>
-          <w:color w:val="1A1A2E"/>
-          <w:sz w:val="18"/>
-        </w:rPr>
-        <w:t>___________________________________</w:t>
-      </w:r>
-    </w:p>
-    <w:p>
-      <w:pPr>
-        <w:spacing w:before="0" w:after="0"/>
-        <w:ind w:left="567"/>
-      </w:pPr>
-      <w:r>
-        <w:rPr>
-          <w:rFonts w:ascii="Calibri" w:hAnsi="Calibri"/>
-          <w:b/>
-          <w:i w:val="0"/>
-          <w:color w:val="007A87"/>
-          <w:sz w:val="18"/>
-        </w:rPr>
-        <w:t>Hiragana:</w:t>
-      </w:r>
-      <w:r>
-        <w:rPr>
-          <w:rFonts w:ascii="Calibri" w:hAnsi="Calibri"/>
-          <w:b w:val="0"/>
-          <w:i w:val="0"/>
-          <w:color w:val="1A1A2E"/>
-          <w:sz w:val="18"/>
-        </w:rPr>
-        <w:t>___________________________________</w:t>
-      </w:r>
-    </w:p>
-    <w:p>
-      <w:pPr>
-        <w:spacing w:before="0" w:after="0"/>
-        <w:ind w:left="567"/>
-      </w:pPr>
-      <w:r>
-        <w:rPr>
-          <w:rFonts w:ascii="Calibri" w:hAnsi="Calibri"/>
-          <w:b/>
-          <w:i w:val="0"/>
-          <w:color w:val="007A87"/>
-          <w:sz w:val="18"/>
-        </w:rPr>
-        <w:t xml:space="preserve">Romaji:  </w:t>
-      </w:r>
-      <w:r>
-        <w:rPr>
-          <w:rFonts w:ascii="Calibri" w:hAnsi="Calibri"/>
-          <w:b w:val="0"/>
-          <w:i w:val="0"/>
-          <w:color w:val="1A1A2E"/>
-          <w:sz w:val="18"/>
-        </w:rPr>
-        <w:t>___________________________________</w:t>
-      </w:r>
-      <w:r>
-        <w:rPr>
-          <w:rFonts w:ascii="Calibri" w:hAnsi="Calibri"/>
-          <w:b w:val="0"/>
-          <w:i/>
-          <w:color w:val="6B7B8D"/>
-          <w:sz w:val="16"/>
-        </w:rPr>
-        <w:t xml:space="preserve">  (roku)</w:t>
-      </w:r>
-    </w:p>
-    <w:p>
-      <w:pPr>
-        <w:spacing w:before="60" w:after="0"/>
-      </w:pPr>
-      <w:r>
-        <w:rPr>
-          <w:rFonts w:ascii="Calibri" w:hAnsi="Calibri"/>
-          <w:b/>
-          <w:i w:val="0"/>
-          <w:color w:val="007A87"/>
-          <w:sz w:val="20"/>
-        </w:rPr>
-        <w:t xml:space="preserve"> 7.  </w:t>
-      </w:r>
-      <w:r>
-        <w:rPr>
-          <w:rFonts w:ascii="Calibri" w:hAnsi="Calibri"/>
-          <w:b w:val="0"/>
-          <w:i w:val="0"/>
-          <w:color w:val="1A1A2E"/>
-          <w:sz w:val="20"/>
-        </w:rPr>
-        <w:t>7  — Seven</w:t>
-      </w:r>
-      <w:r>
-        <w:rPr>
-          <w:rFonts w:ascii="Calibri" w:hAnsi="Calibri"/>
-          <w:b w:val="0"/>
-          <w:i/>
-          <w:color w:val="6B7B8D"/>
-          <w:sz w:val="16"/>
-        </w:rPr>
-        <w:t xml:space="preserve">  ★ なな is more common in daily speech.</w:t>
-      </w:r>
-    </w:p>
-    <w:p>
-      <w:pPr>
-        <w:spacing w:before="0" w:after="0"/>
-        <w:ind w:left="567"/>
-      </w:pPr>
-      <w:r>
-        <w:rPr>
-          <w:rFonts w:ascii="Calibri" w:hAnsi="Calibri"/>
-          <w:b/>
-          <w:i w:val="0"/>
-          <w:color w:val="007A87"/>
-          <w:sz w:val="18"/>
-        </w:rPr>
-        <w:t xml:space="preserve">Kanji:    </w:t>
-      </w:r>
-      <w:r>
-        <w:rPr>
-          <w:rFonts w:ascii="Calibri" w:hAnsi="Calibri"/>
-          <w:b w:val="0"/>
-          <w:i w:val="0"/>
-          <w:color w:val="1A1A2E"/>
-          <w:sz w:val="18"/>
-        </w:rPr>
-        <w:t>___________________________________</w:t>
-      </w:r>
-    </w:p>
-    <w:p>
-      <w:pPr>
-        <w:spacing w:before="0" w:after="0"/>
-        <w:ind w:left="567"/>
-      </w:pPr>
-      <w:r>
-        <w:rPr>
-          <w:rFonts w:ascii="Calibri" w:hAnsi="Calibri"/>
-          <w:b/>
-          <w:i w:val="0"/>
-          <w:color w:val="007A87"/>
-          <w:sz w:val="18"/>
-        </w:rPr>
-        <w:t>Hiragana:</w:t>
-      </w:r>
-      <w:r>
-        <w:rPr>
-          <w:rFonts w:ascii="Calibri" w:hAnsi="Calibri"/>
-          <w:b w:val="0"/>
-          <w:i w:val="0"/>
-          <w:color w:val="1A1A2E"/>
-          <w:sz w:val="18"/>
-        </w:rPr>
-        <w:t>___________________________________</w:t>
-      </w:r>
-    </w:p>
-    <w:p>
-      <w:pPr>
-        <w:spacing w:before="0" w:after="0"/>
-        <w:ind w:left="567"/>
-      </w:pPr>
-      <w:r>
-        <w:rPr>
-          <w:rFonts w:ascii="Calibri" w:hAnsi="Calibri"/>
-          <w:b/>
-          <w:i w:val="0"/>
-          <w:color w:val="007A87"/>
-          <w:sz w:val="18"/>
-        </w:rPr>
-        <w:t xml:space="preserve">Romaji:  </w:t>
-      </w:r>
-      <w:r>
-        <w:rPr>
-          <w:rFonts w:ascii="Calibri" w:hAnsi="Calibri"/>
-          <w:b w:val="0"/>
-          <w:i w:val="0"/>
-          <w:color w:val="1A1A2E"/>
-          <w:sz w:val="18"/>
-        </w:rPr>
-        <w:t>___________________________________</w:t>
-      </w:r>
-      <w:r>
-        <w:rPr>
-          <w:rFonts w:ascii="Calibri" w:hAnsi="Calibri"/>
-          <w:b w:val="0"/>
-          <w:i/>
-          <w:color w:val="6B7B8D"/>
-          <w:sz w:val="16"/>
-        </w:rPr>
-        <w:t xml:space="preserve">  (shichi / nana)</w:t>
-      </w:r>
-    </w:p>
-    <w:p>
-      <w:pPr>
-        <w:spacing w:before="60" w:after="0"/>
-      </w:pPr>
-      <w:r>
-        <w:rPr>
-          <w:rFonts w:ascii="Calibri" w:hAnsi="Calibri"/>
-          <w:b/>
-          <w:i w:val="0"/>
-          <w:color w:val="007A87"/>
-          <w:sz w:val="20"/>
-        </w:rPr>
-        <w:t xml:space="preserve"> 8.  </w:t>
-      </w:r>
-      <w:r>
-        <w:rPr>
-          <w:rFonts w:ascii="Calibri" w:hAnsi="Calibri"/>
-          <w:b w:val="0"/>
-          <w:i w:val="0"/>
-          <w:color w:val="1A1A2E"/>
-          <w:sz w:val="20"/>
-        </w:rPr>
-        <w:t>8  — Eight</w:t>
-      </w:r>
-    </w:p>
-    <w:p>
-      <w:pPr>
-        <w:spacing w:before="0" w:after="0"/>
-        <w:ind w:left="567"/>
-      </w:pPr>
-      <w:r>
-        <w:rPr>
-          <w:rFonts w:ascii="Calibri" w:hAnsi="Calibri"/>
-          <w:b/>
-          <w:i w:val="0"/>
-          <w:color w:val="007A87"/>
-          <w:sz w:val="18"/>
-        </w:rPr>
-        <w:t xml:space="preserve">Kanji:    </w:t>
-      </w:r>
-      <w:r>
-        <w:rPr>
-          <w:rFonts w:ascii="Calibri" w:hAnsi="Calibri"/>
-          <w:b w:val="0"/>
-          <w:i w:val="0"/>
-          <w:color w:val="1A1A2E"/>
-          <w:sz w:val="18"/>
-        </w:rPr>
-        <w:t>___________________________________</w:t>
-      </w:r>
-    </w:p>
-    <w:p>
-      <w:pPr>
-        <w:spacing w:before="0" w:after="0"/>
-        <w:ind w:left="567"/>
-      </w:pPr>
-      <w:r>
-        <w:rPr>
-          <w:rFonts w:ascii="Calibri" w:hAnsi="Calibri"/>
-          <w:b/>
-          <w:i w:val="0"/>
-          <w:color w:val="007A87"/>
-          <w:sz w:val="18"/>
-        </w:rPr>
-        <w:t>Hiragana:</w:t>
-      </w:r>
-      <w:r>
-        <w:rPr>
-          <w:rFonts w:ascii="Calibri" w:hAnsi="Calibri"/>
-          <w:b w:val="0"/>
-          <w:i w:val="0"/>
-          <w:color w:val="1A1A2E"/>
-          <w:sz w:val="18"/>
-        </w:rPr>
-        <w:t>___________________________________</w:t>
-      </w:r>
-    </w:p>
-    <w:p>
-      <w:pPr>
-        <w:spacing w:before="0" w:after="0"/>
-        <w:ind w:left="567"/>
-      </w:pPr>
-      <w:r>
-        <w:rPr>
-          <w:rFonts w:ascii="Calibri" w:hAnsi="Calibri"/>
-          <w:b/>
-          <w:i w:val="0"/>
-          <w:color w:val="007A87"/>
-          <w:sz w:val="18"/>
-        </w:rPr>
-        <w:t xml:space="preserve">Romaji:  </w:t>
-      </w:r>
-      <w:r>
-        <w:rPr>
-          <w:rFonts w:ascii="Calibri" w:hAnsi="Calibri"/>
-          <w:b w:val="0"/>
-          <w:i w:val="0"/>
-          <w:color w:val="1A1A2E"/>
-          <w:sz w:val="18"/>
-        </w:rPr>
-        <w:t>___________________________________</w:t>
-      </w:r>
-      <w:r>
-        <w:rPr>
-          <w:rFonts w:ascii="Calibri" w:hAnsi="Calibri"/>
-          <w:b w:val="0"/>
-          <w:i/>
-          <w:color w:val="6B7B8D"/>
-          <w:sz w:val="16"/>
-        </w:rPr>
-        <w:t xml:space="preserve">  (hachi)</w:t>
-      </w:r>
-    </w:p>
-    <w:p>
-      <w:pPr>
-        <w:spacing w:before="60" w:after="0"/>
-      </w:pPr>
-      <w:r>
-        <w:rPr>
-          <w:rFonts w:ascii="Calibri" w:hAnsi="Calibri"/>
-          <w:b/>
-          <w:i w:val="0"/>
-          <w:color w:val="007A87"/>
-          <w:sz w:val="20"/>
-        </w:rPr>
-        <w:t xml:space="preserve"> 9.  </w:t>
-      </w:r>
-      <w:r>
-        <w:rPr>
-          <w:rFonts w:ascii="Calibri" w:hAnsi="Calibri"/>
-          <w:b w:val="0"/>
-          <w:i w:val="0"/>
-          <w:color w:val="1A1A2E"/>
-          <w:sz w:val="20"/>
-        </w:rPr>
-        <w:t>9  — Nine</w:t>
-      </w:r>
-      <w:r>
-        <w:rPr>
-          <w:rFonts w:ascii="Calibri" w:hAnsi="Calibri"/>
-          <w:b w:val="0"/>
-          <w:i/>
-          <w:color w:val="6B7B8D"/>
-          <w:sz w:val="16"/>
-        </w:rPr>
-        <w:t xml:space="preserve">  ★ きゅう is preferred in most contexts.</w:t>
-      </w:r>
-    </w:p>
-    <w:p>
-      <w:pPr>
-        <w:spacing w:before="0" w:after="0"/>
-        <w:ind w:left="567"/>
-      </w:pPr>
-      <w:r>
-        <w:rPr>
-          <w:rFonts w:ascii="Calibri" w:hAnsi="Calibri"/>
-          <w:b/>
-          <w:i w:val="0"/>
-          <w:color w:val="007A87"/>
-          <w:sz w:val="18"/>
-        </w:rPr>
-        <w:t xml:space="preserve">Kanji:    </w:t>
-      </w:r>
-      <w:r>
-        <w:rPr>
-          <w:rFonts w:ascii="Calibri" w:hAnsi="Calibri"/>
-          <w:b w:val="0"/>
-          <w:i w:val="0"/>
-          <w:color w:val="1A1A2E"/>
-          <w:sz w:val="18"/>
-        </w:rPr>
-        <w:t>___________________________________</w:t>
-      </w:r>
-    </w:p>
-    <w:p>
-      <w:pPr>
-        <w:spacing w:before="0" w:after="0"/>
-        <w:ind w:left="567"/>
-      </w:pPr>
-      <w:r>
-        <w:rPr>
-          <w:rFonts w:ascii="Calibri" w:hAnsi="Calibri"/>
-          <w:b/>
-          <w:i w:val="0"/>
-          <w:color w:val="007A87"/>
-          <w:sz w:val="18"/>
-        </w:rPr>
-        <w:t>Hiragana:</w:t>
-      </w:r>
-      <w:r>
-        <w:rPr>
-          <w:rFonts w:ascii="Calibri" w:hAnsi="Calibri"/>
-          <w:b w:val="0"/>
-          <w:i w:val="0"/>
-          <w:color w:val="1A1A2E"/>
-          <w:sz w:val="18"/>
-        </w:rPr>
-        <w:t>___________________________________</w:t>
-      </w:r>
-    </w:p>
-    <w:p>
-      <w:pPr>
-        <w:spacing w:before="0" w:after="0"/>
-        <w:ind w:left="567"/>
-      </w:pPr>
-      <w:r>
-        <w:rPr>
-          <w:rFonts w:ascii="Calibri" w:hAnsi="Calibri"/>
-          <w:b/>
-          <w:i w:val="0"/>
-          <w:color w:val="007A87"/>
-          <w:sz w:val="18"/>
-        </w:rPr>
-        <w:t xml:space="preserve">Romaji:  </w:t>
-      </w:r>
-      <w:r>
-        <w:rPr>
-          <w:rFonts w:ascii="Calibri" w:hAnsi="Calibri"/>
-          <w:b w:val="0"/>
-          <w:i w:val="0"/>
-          <w:color w:val="1A1A2E"/>
-          <w:sz w:val="18"/>
-        </w:rPr>
-        <w:t>___________________________________</w:t>
-      </w:r>
-      <w:r>
-        <w:rPr>
-          <w:rFonts w:ascii="Calibri" w:hAnsi="Calibri"/>
-          <w:b w:val="0"/>
-          <w:i/>
-          <w:color w:val="6B7B8D"/>
-          <w:sz w:val="16"/>
-        </w:rPr>
-        <w:t xml:space="preserve">  (ku / kyuu)</w:t>
-      </w:r>
-    </w:p>
-    <w:p>
-      <w:pPr>
-        <w:spacing w:before="60" w:after="0"/>
-      </w:pPr>
-      <w:r>
-        <w:rPr>
-          <w:rFonts w:ascii="Calibri" w:hAnsi="Calibri"/>
-          <w:b/>
-          <w:i w:val="0"/>
-          <w:color w:val="007A87"/>
-          <w:sz w:val="20"/>
-        </w:rPr>
-        <w:t xml:space="preserve">10.  </w:t>
-      </w:r>
-      <w:r>
-        <w:rPr>
-          <w:rFonts w:ascii="Calibri" w:hAnsi="Calibri"/>
-          <w:b w:val="0"/>
-          <w:i w:val="0"/>
-          <w:color w:val="1A1A2E"/>
-          <w:sz w:val="20"/>
-        </w:rPr>
-        <w:t>10 — Ten</w:t>
-      </w:r>
-    </w:p>
-    <w:p>
-      <w:pPr>
-        <w:spacing w:before="0" w:after="0"/>
-        <w:ind w:left="567"/>
-      </w:pPr>
-      <w:r>
-        <w:rPr>
-          <w:rFonts w:ascii="Calibri" w:hAnsi="Calibri"/>
-          <w:b/>
-          <w:i w:val="0"/>
-          <w:color w:val="007A87"/>
-          <w:sz w:val="18"/>
-        </w:rPr>
-        <w:t xml:space="preserve">Kanji:    </w:t>
-      </w:r>
-      <w:r>
-        <w:rPr>
-          <w:rFonts w:ascii="Calibri" w:hAnsi="Calibri"/>
-          <w:b w:val="0"/>
-          <w:i w:val="0"/>
-          <w:color w:val="1A1A2E"/>
-          <w:sz w:val="18"/>
-        </w:rPr>
-        <w:t>___________________________________</w:t>
-      </w:r>
-    </w:p>
-    <w:p>
-      <w:pPr>
-        <w:spacing w:before="0" w:after="0"/>
-        <w:ind w:left="567"/>
-      </w:pPr>
-      <w:r>
-        <w:rPr>
-          <w:rFonts w:ascii="Calibri" w:hAnsi="Calibri"/>
-          <w:b/>
-          <w:i w:val="0"/>
-          <w:color w:val="007A87"/>
-          <w:sz w:val="18"/>
-        </w:rPr>
-        <w:t>Hiragana:</w:t>
-      </w:r>
-      <w:r>
-        <w:rPr>
-          <w:rFonts w:ascii="Calibri" w:hAnsi="Calibri"/>
-          <w:b w:val="0"/>
-          <w:i w:val="0"/>
-          <w:color w:val="1A1A2E"/>
-          <w:sz w:val="18"/>
-        </w:rPr>
-        <w:t>___________________________________</w:t>
-      </w:r>
-    </w:p>
-    <w:p>
-      <w:pPr>
-        <w:spacing w:before="0" w:after="0"/>
-        <w:ind w:left="567"/>
-      </w:pPr>
-      <w:r>
-        <w:rPr>
-          <w:rFonts w:ascii="Calibri" w:hAnsi="Calibri"/>
-          <w:b/>
-          <w:i w:val="0"/>
-          <w:color w:val="007A87"/>
-          <w:sz w:val="18"/>
-        </w:rPr>
-        <w:t xml:space="preserve">Romaji:  </w:t>
-      </w:r>
-      <w:r>
-        <w:rPr>
-          <w:rFonts w:ascii="Calibri" w:hAnsi="Calibri"/>
-          <w:b w:val="0"/>
-          <w:i w:val="0"/>
-          <w:color w:val="1A1A2E"/>
-          <w:sz w:val="18"/>
-        </w:rPr>
-        <w:t>___________________________________</w:t>
-      </w:r>
-      <w:r>
-        <w:rPr>
-          <w:rFonts w:ascii="Calibri" w:hAnsi="Calibri"/>
-          <w:b w:val="0"/>
-          <w:i/>
-          <w:color w:val="6B7B8D"/>
-          <w:sz w:val="16"/>
-        </w:rPr>
-        <w:t xml:space="preserve">  (juu)</w:t>
-      </w:r>
-    </w:p>
-    <w:p>
-      <w:pPr>
-        <w:spacing w:before="60" w:after="0"/>
-      </w:pPr>
-      <w:r>
-        <w:rPr>
-          <w:rFonts w:ascii="Calibri" w:hAnsi="Calibri"/>
-          <w:b/>
-          <w:i w:val="0"/>
-          <w:color w:val="007A87"/>
-          <w:sz w:val="20"/>
-        </w:rPr>
-        <w:t xml:space="preserve">11.  </w:t>
-      </w:r>
-      <w:r>
-        <w:rPr>
-          <w:rFonts w:ascii="Calibri" w:hAnsi="Calibri"/>
-          <w:b w:val="0"/>
-          <w:i w:val="0"/>
-          <w:color w:val="1A1A2E"/>
-          <w:sz w:val="20"/>
-        </w:rPr>
-        <w:t>11 — Eleven</w:t>
-      </w:r>
-      <w:r>
-        <w:rPr>
-          <w:rFonts w:ascii="Calibri" w:hAnsi="Calibri"/>
-          <w:b w:val="0"/>
-          <w:i/>
-          <w:color w:val="6B7B8D"/>
-          <w:sz w:val="16"/>
-        </w:rPr>
-        <w:t xml:space="preserve">  ★ Ten + one.</w:t>
-      </w:r>
-    </w:p>
-    <w:p>
-      <w:pPr>
-        <w:spacing w:before="0" w:after="0"/>
-        <w:ind w:left="567"/>
-      </w:pPr>
-      <w:r>
-        <w:rPr>
-          <w:rFonts w:ascii="Calibri" w:hAnsi="Calibri"/>
-          <w:b/>
-          <w:i w:val="0"/>
-          <w:color w:val="007A87"/>
-          <w:sz w:val="18"/>
-        </w:rPr>
-        <w:t xml:space="preserve">Kanji:    </w:t>
-      </w:r>
-      <w:r>
-        <w:rPr>
-          <w:rFonts w:ascii="Calibri" w:hAnsi="Calibri"/>
-          <w:b w:val="0"/>
-          <w:i w:val="0"/>
-          <w:color w:val="1A1A2E"/>
-          <w:sz w:val="18"/>
-        </w:rPr>
-        <w:t>___________________________________</w:t>
-      </w:r>
-    </w:p>
-    <w:p>
-      <w:pPr>
-        <w:spacing w:before="0" w:after="0"/>
-        <w:ind w:left="567"/>
-      </w:pPr>
-      <w:r>
-        <w:rPr>
-          <w:rFonts w:ascii="Calibri" w:hAnsi="Calibri"/>
-          <w:b/>
-          <w:i w:val="0"/>
-          <w:color w:val="007A87"/>
-          <w:sz w:val="18"/>
-        </w:rPr>
-        <w:t>Hiragana:</w:t>
-      </w:r>
-      <w:r>
-        <w:rPr>
-          <w:rFonts w:ascii="Calibri" w:hAnsi="Calibri"/>
-          <w:b w:val="0"/>
-          <w:i w:val="0"/>
-          <w:color w:val="1A1A2E"/>
-          <w:sz w:val="18"/>
-        </w:rPr>
-        <w:t>___________________________________</w:t>
-      </w:r>
-    </w:p>
-    <w:p>
-      <w:pPr>
-        <w:spacing w:before="0" w:after="0"/>
-        <w:ind w:left="567"/>
-      </w:pPr>
-      <w:r>
-        <w:rPr>
-          <w:rFonts w:ascii="Calibri" w:hAnsi="Calibri"/>
-          <w:b/>
-          <w:i w:val="0"/>
-          <w:color w:val="007A87"/>
-          <w:sz w:val="18"/>
-        </w:rPr>
-        <w:t xml:space="preserve">Romaji:  </w:t>
-      </w:r>
-      <w:r>
-        <w:rPr>
-          <w:rFonts w:ascii="Calibri" w:hAnsi="Calibri"/>
-          <w:b w:val="0"/>
-          <w:i w:val="0"/>
-          <w:color w:val="1A1A2E"/>
-          <w:sz w:val="18"/>
-        </w:rPr>
-        <w:t>___________________________________</w:t>
-      </w:r>
-      <w:r>
-        <w:rPr>
-          <w:rFonts w:ascii="Calibri" w:hAnsi="Calibri"/>
-          <w:b w:val="0"/>
-          <w:i/>
-          <w:color w:val="6B7B8D"/>
-          <w:sz w:val="16"/>
-        </w:rPr>
-        <w:t xml:space="preserve">  (juu-ichi)</w:t>
-      </w:r>
-    </w:p>
-    <w:p>
-      <w:pPr>
-        <w:spacing w:before="60" w:after="0"/>
-      </w:pPr>
-      <w:r>
-        <w:rPr>
-          <w:rFonts w:ascii="Calibri" w:hAnsi="Calibri"/>
-          <w:b/>
-          <w:i w:val="0"/>
-          <w:color w:val="007A87"/>
-          <w:sz w:val="20"/>
-        </w:rPr>
-        <w:t xml:space="preserve">12.  </w:t>
-      </w:r>
-      <w:r>
-        <w:rPr>
-          <w:rFonts w:ascii="Calibri" w:hAnsi="Calibri"/>
-          <w:b w:val="0"/>
-          <w:i w:val="0"/>
-          <w:color w:val="1A1A2E"/>
-          <w:sz w:val="20"/>
-        </w:rPr>
-        <w:t>12 — Twelve</w:t>
-      </w:r>
-      <w:r>
-        <w:rPr>
-          <w:rFonts w:ascii="Calibri" w:hAnsi="Calibri"/>
-          <w:b w:val="0"/>
-          <w:i/>
-          <w:color w:val="6B7B8D"/>
-          <w:sz w:val="16"/>
-        </w:rPr>
-        <w:t xml:space="preserve">  ★ Ten + two.</w:t>
-      </w:r>
-    </w:p>
-    <w:p>
-      <w:pPr>
-        <w:spacing w:before="0" w:after="0"/>
-        <w:ind w:left="567"/>
-      </w:pPr>
-      <w:r>
-        <w:rPr>
-          <w:rFonts w:ascii="Calibri" w:hAnsi="Calibri"/>
-          <w:b/>
-          <w:i w:val="0"/>
-          <w:color w:val="007A87"/>
-          <w:sz w:val="18"/>
-        </w:rPr>
-        <w:t xml:space="preserve">Kanji:    </w:t>
-      </w:r>
-      <w:r>
-        <w:rPr>
-          <w:rFonts w:ascii="Calibri" w:hAnsi="Calibri"/>
-          <w:b w:val="0"/>
-          <w:i w:val="0"/>
-          <w:color w:val="1A1A2E"/>
-          <w:sz w:val="18"/>
-        </w:rPr>
-        <w:t>___________________________________</w:t>
-      </w:r>
-    </w:p>
-    <w:p>
-      <w:pPr>
-        <w:spacing w:before="0" w:after="0"/>
-        <w:ind w:left="567"/>
-      </w:pPr>
-      <w:r>
-        <w:rPr>
-          <w:rFonts w:ascii="Calibri" w:hAnsi="Calibri"/>
-          <w:b/>
-          <w:i w:val="0"/>
-          <w:color w:val="007A87"/>
-          <w:sz w:val="18"/>
-        </w:rPr>
-        <w:t>Hiragana:</w:t>
-      </w:r>
-      <w:r>
-        <w:rPr>
-          <w:rFonts w:ascii="Calibri" w:hAnsi="Calibri"/>
-          <w:b w:val="0"/>
-          <w:i w:val="0"/>
-          <w:color w:val="1A1A2E"/>
-          <w:sz w:val="18"/>
-        </w:rPr>
-        <w:t>___________________________________</w:t>
-      </w:r>
-    </w:p>
-    <w:p>
-      <w:pPr>
-        <w:spacing w:before="0" w:after="0"/>
-        <w:ind w:left="567"/>
-      </w:pPr>
-      <w:r>
-        <w:rPr>
-          <w:rFonts w:ascii="Calibri" w:hAnsi="Calibri"/>
-          <w:b/>
-          <w:i w:val="0"/>
-          <w:color w:val="007A87"/>
-          <w:sz w:val="18"/>
-        </w:rPr>
-        <w:t xml:space="preserve">Romaji:  </w:t>
-      </w:r>
-      <w:r>
-        <w:rPr>
-          <w:rFonts w:ascii="Calibri" w:hAnsi="Calibri"/>
-          <w:b w:val="0"/>
-          <w:i w:val="0"/>
-          <w:color w:val="1A1A2E"/>
-          <w:sz w:val="18"/>
-        </w:rPr>
-        <w:t>___________________________________</w:t>
-      </w:r>
-      <w:r>
-        <w:rPr>
-          <w:rFonts w:ascii="Calibri" w:hAnsi="Calibri"/>
-          <w:b w:val="0"/>
-          <w:i/>
-          <w:color w:val="6B7B8D"/>
-          <w:sz w:val="16"/>
-        </w:rPr>
-        <w:t xml:space="preserve">  (juu-ni)</w:t>
-      </w:r>
-    </w:p>
-    <w:p>
-      <w:pPr>
-        <w:spacing w:before="60" w:after="0"/>
-      </w:pPr>
-      <w:r>
-        <w:rPr>
-          <w:rFonts w:ascii="Calibri" w:hAnsi="Calibri"/>
-          <w:b/>
-          <w:i w:val="0"/>
-          <w:color w:val="007A87"/>
-          <w:sz w:val="20"/>
-        </w:rPr>
-        <w:t xml:space="preserve">13.  </w:t>
-      </w:r>
-      <w:r>
-        <w:rPr>
-          <w:rFonts w:ascii="Calibri" w:hAnsi="Calibri"/>
-          <w:b w:val="0"/>
-          <w:i w:val="0"/>
-          <w:color w:val="1A1A2E"/>
-          <w:sz w:val="20"/>
-        </w:rPr>
-        <w:t>20 — Twenty</w:t>
-      </w:r>
-      <w:r>
-        <w:rPr>
-          <w:rFonts w:ascii="Calibri" w:hAnsi="Calibri"/>
-          <w:b w:val="0"/>
-          <w:i/>
-          <w:color w:val="6B7B8D"/>
-          <w:sz w:val="16"/>
-        </w:rPr>
-        <w:t xml:space="preserve">  ★ Two × ten.</w:t>
-      </w:r>
-    </w:p>
-    <w:p>
-      <w:pPr>
-        <w:spacing w:before="0" w:after="0"/>
-        <w:ind w:left="567"/>
-      </w:pPr>
-      <w:r>
-        <w:rPr>
-          <w:rFonts w:ascii="Calibri" w:hAnsi="Calibri"/>
-          <w:b/>
-          <w:i w:val="0"/>
-          <w:color w:val="007A87"/>
-          <w:sz w:val="18"/>
-        </w:rPr>
-        <w:t xml:space="preserve">Kanji:    </w:t>
-      </w:r>
-      <w:r>
-        <w:rPr>
-          <w:rFonts w:ascii="Calibri" w:hAnsi="Calibri"/>
-          <w:b w:val="0"/>
-          <w:i w:val="0"/>
-          <w:color w:val="1A1A2E"/>
-          <w:sz w:val="18"/>
-        </w:rPr>
-        <w:t>___________________________________</w:t>
-      </w:r>
-    </w:p>
-    <w:p>
-      <w:pPr>
-        <w:spacing w:before="0" w:after="0"/>
-        <w:ind w:left="567"/>
-      </w:pPr>
-      <w:r>
-        <w:rPr>
-          <w:rFonts w:ascii="Calibri" w:hAnsi="Calibri"/>
-          <w:b/>
-          <w:i w:val="0"/>
-          <w:color w:val="007A87"/>
-          <w:sz w:val="18"/>
-        </w:rPr>
-        <w:t>Hiragana:</w:t>
-      </w:r>
-      <w:r>
-        <w:rPr>
-          <w:rFonts w:ascii="Calibri" w:hAnsi="Calibri"/>
-          <w:b w:val="0"/>
-          <w:i w:val="0"/>
-          <w:color w:val="1A1A2E"/>
-          <w:sz w:val="18"/>
-        </w:rPr>
-        <w:t>___________________________________</w:t>
-      </w:r>
-    </w:p>
-    <w:p>
-      <w:pPr>
-        <w:spacing w:before="0" w:after="0"/>
-        <w:ind w:left="567"/>
-      </w:pPr>
-      <w:r>
-        <w:rPr>
-          <w:rFonts w:ascii="Calibri" w:hAnsi="Calibri"/>
-          <w:b/>
-          <w:i w:val="0"/>
-          <w:color w:val="007A87"/>
-          <w:sz w:val="18"/>
-        </w:rPr>
-        <w:t xml:space="preserve">Romaji:  </w:t>
-      </w:r>
-      <w:r>
-        <w:rPr>
-          <w:rFonts w:ascii="Calibri" w:hAnsi="Calibri"/>
-          <w:b w:val="0"/>
-          <w:i w:val="0"/>
-          <w:color w:val="1A1A2E"/>
-          <w:sz w:val="18"/>
-        </w:rPr>
-        <w:t>___________________________________</w:t>
-      </w:r>
-      <w:r>
-        <w:rPr>
-          <w:rFonts w:ascii="Calibri" w:hAnsi="Calibri"/>
-          <w:b w:val="0"/>
-          <w:i/>
-          <w:color w:val="6B7B8D"/>
-          <w:sz w:val="16"/>
-        </w:rPr>
-        <w:t xml:space="preserve">  (ni-juu)</w:t>
-      </w:r>
-    </w:p>
-    <w:p>
-      <w:pPr>
-        <w:spacing w:before="60" w:after="0"/>
-      </w:pPr>
-      <w:r>
-        <w:rPr>
-          <w:rFonts w:ascii="Calibri" w:hAnsi="Calibri"/>
-          <w:b/>
-          <w:i w:val="0"/>
-          <w:color w:val="007A87"/>
-          <w:sz w:val="20"/>
-        </w:rPr>
-        <w:t xml:space="preserve">14.  </w:t>
-      </w:r>
-      <w:r>
-        <w:rPr>
-          <w:rFonts w:ascii="Calibri" w:hAnsi="Calibri"/>
-          <w:b w:val="0"/>
-          <w:i w:val="0"/>
-          <w:color w:val="1A1A2E"/>
-          <w:sz w:val="20"/>
-        </w:rPr>
-        <w:t>30 — Thirty</w:t>
-      </w:r>
-      <w:r>
-        <w:rPr>
-          <w:rFonts w:ascii="Calibri" w:hAnsi="Calibri"/>
-          <w:b w:val="0"/>
-          <w:i/>
-          <w:color w:val="6B7B8D"/>
-          <w:sz w:val="16"/>
-        </w:rPr>
-        <w:t xml:space="preserve">  ★ Three × ten.</w:t>
-      </w:r>
-    </w:p>
-    <w:p>
-      <w:pPr>
-        <w:spacing w:before="0" w:after="0"/>
-        <w:ind w:left="567"/>
-      </w:pPr>
-      <w:r>
-        <w:rPr>
-          <w:rFonts w:ascii="Calibri" w:hAnsi="Calibri"/>
-          <w:b/>
-          <w:i w:val="0"/>
-          <w:color w:val="007A87"/>
-          <w:sz w:val="18"/>
-        </w:rPr>
-        <w:t xml:space="preserve">Kanji:    </w:t>
-      </w:r>
-      <w:r>
-        <w:rPr>
-          <w:rFonts w:ascii="Calibri" w:hAnsi="Calibri"/>
-          <w:b w:val="0"/>
-          <w:i w:val="0"/>
-          <w:color w:val="1A1A2E"/>
-          <w:sz w:val="18"/>
-        </w:rPr>
-        <w:t>___________________________________</w:t>
-      </w:r>
-    </w:p>
-    <w:p>
-      <w:pPr>
-        <w:spacing w:before="0" w:after="0"/>
-        <w:ind w:left="567"/>
-      </w:pPr>
-      <w:r>
-        <w:rPr>
-          <w:rFonts w:ascii="Calibri" w:hAnsi="Calibri"/>
-          <w:b/>
-          <w:i w:val="0"/>
-          <w:color w:val="007A87"/>
-          <w:sz w:val="18"/>
-        </w:rPr>
-        <w:t>Hiragana:</w:t>
-      </w:r>
-      <w:r>
-        <w:rPr>
-          <w:rFonts w:ascii="Calibri" w:hAnsi="Calibri"/>
-          <w:b w:val="0"/>
-          <w:i w:val="0"/>
-          <w:color w:val="1A1A2E"/>
-          <w:sz w:val="18"/>
-        </w:rPr>
-        <w:t>___________________________________</w:t>
-      </w:r>
-    </w:p>
-    <w:p>
-      <w:pPr>
-        <w:spacing w:before="0" w:after="0"/>
-        <w:ind w:left="567"/>
-      </w:pPr>
-      <w:r>
-        <w:rPr>
-          <w:rFonts w:ascii="Calibri" w:hAnsi="Calibri"/>
-          <w:b/>
-          <w:i w:val="0"/>
-          <w:color w:val="007A87"/>
-          <w:sz w:val="18"/>
-        </w:rPr>
-        <w:t xml:space="preserve">Romaji:  </w:t>
-      </w:r>
-      <w:r>
-        <w:rPr>
-          <w:rFonts w:ascii="Calibri" w:hAnsi="Calibri"/>
-          <w:b w:val="0"/>
-          <w:i w:val="0"/>
-          <w:color w:val="1A1A2E"/>
-          <w:sz w:val="18"/>
-        </w:rPr>
-        <w:t>___________________________________</w:t>
-      </w:r>
-      <w:r>
-        <w:rPr>
-          <w:rFonts w:ascii="Calibri" w:hAnsi="Calibri"/>
-          <w:b w:val="0"/>
-          <w:i/>
-          <w:color w:val="6B7B8D"/>
-          <w:sz w:val="16"/>
-        </w:rPr>
-        <w:t xml:space="preserve">  (san-juu)</w:t>
-      </w:r>
-    </w:p>
-    <w:p>
-      <w:pPr>
-        <w:spacing w:before="60" w:after="0"/>
-      </w:pPr>
-      <w:r>
-        <w:rPr>
-          <w:rFonts w:ascii="Calibri" w:hAnsi="Calibri"/>
-          <w:b/>
-          <w:i w:val="0"/>
-          <w:color w:val="007A87"/>
-          <w:sz w:val="20"/>
-        </w:rPr>
-        <w:t xml:space="preserve">15.  </w:t>
-      </w:r>
-      <w:r>
-        <w:rPr>
-          <w:rFonts w:ascii="Calibri" w:hAnsi="Calibri"/>
-          <w:b w:val="0"/>
-          <w:i w:val="0"/>
-          <w:color w:val="1A1A2E"/>
-          <w:sz w:val="20"/>
-        </w:rPr>
-        <w:t>100 — One hundred</w:t>
-      </w:r>
-      <w:r>
-        <w:rPr>
-          <w:rFonts w:ascii="Calibri" w:hAnsi="Calibri"/>
-          <w:b w:val="0"/>
-          <w:i/>
-          <w:color w:val="6B7B8D"/>
-          <w:sz w:val="16"/>
-        </w:rPr>
-        <w:t xml:space="preserve">  ★ New counter word.</w:t>
-      </w:r>
-    </w:p>
-    <w:p>
-      <w:pPr>
-        <w:spacing w:before="0" w:after="0"/>
-        <w:ind w:left="567"/>
-      </w:pPr>
-      <w:r>
-        <w:rPr>
-          <w:rFonts w:ascii="Calibri" w:hAnsi="Calibri"/>
-          <w:b/>
-          <w:i w:val="0"/>
-          <w:color w:val="007A87"/>
-          <w:sz w:val="18"/>
-        </w:rPr>
-        <w:t xml:space="preserve">Kanji:    </w:t>
-      </w:r>
-      <w:r>
-        <w:rPr>
-          <w:rFonts w:ascii="Calibri" w:hAnsi="Calibri"/>
-          <w:b w:val="0"/>
-          <w:i w:val="0"/>
-          <w:color w:val="1A1A2E"/>
-          <w:sz w:val="18"/>
-        </w:rPr>
-        <w:t>___________________________________</w:t>
-      </w:r>
-    </w:p>
-    <w:p>
-      <w:pPr>
-        <w:spacing w:before="0" w:after="0"/>
-        <w:ind w:left="567"/>
-      </w:pPr>
-      <w:r>
-        <w:rPr>
-          <w:rFonts w:ascii="Calibri" w:hAnsi="Calibri"/>
-          <w:b/>
-          <w:i w:val="0"/>
-          <w:color w:val="007A87"/>
-          <w:sz w:val="18"/>
-        </w:rPr>
-        <w:t>Hiragana:</w:t>
-      </w:r>
-      <w:r>
-        <w:rPr>
-          <w:rFonts w:ascii="Calibri" w:hAnsi="Calibri"/>
-          <w:b w:val="0"/>
-          <w:i w:val="0"/>
-          <w:color w:val="1A1A2E"/>
-          <w:sz w:val="18"/>
-        </w:rPr>
-        <w:t>___________________________________</w:t>
-      </w:r>
-    </w:p>
-    <w:p>
-      <w:pPr>
-        <w:spacing w:before="0" w:after="0"/>
-        <w:ind w:left="567"/>
-      </w:pPr>
-      <w:r>
-        <w:rPr>
-          <w:rFonts w:ascii="Calibri" w:hAnsi="Calibri"/>
-          <w:b/>
-          <w:i w:val="0"/>
-          <w:color w:val="007A87"/>
-          <w:sz w:val="18"/>
-        </w:rPr>
-        <w:t xml:space="preserve">Romaji:  </w:t>
-      </w:r>
-      <w:r>
-        <w:rPr>
-          <w:rFonts w:ascii="Calibri" w:hAnsi="Calibri"/>
-          <w:b w:val="0"/>
-          <w:i w:val="0"/>
-          <w:color w:val="1A1A2E"/>
-          <w:sz w:val="18"/>
-        </w:rPr>
-        <w:t>___________________________________</w:t>
-      </w:r>
-      <w:r>
-        <w:rPr>
-          <w:rFonts w:ascii="Calibri" w:hAnsi="Calibri"/>
-          <w:b w:val="0"/>
-          <w:i/>
-          <w:color w:val="6B7B8D"/>
-          <w:sz w:val="16"/>
-        </w:rPr>
-        <w:t xml:space="preserve">  (hyaku)</w:t>
-      </w:r>
-    </w:p>
-    <w:p>
-      <w:pPr>
-        <w:spacing w:before="60" w:after="0"/>
-      </w:pPr>
-      <w:r>
-        <w:rPr>
-          <w:rFonts w:ascii="Calibri" w:hAnsi="Calibri"/>
-          <w:b/>
-          <w:i w:val="0"/>
-          <w:color w:val="007A87"/>
-          <w:sz w:val="20"/>
-        </w:rPr>
-        <w:t xml:space="preserve">16.  </w:t>
-      </w:r>
-      <w:r>
-        <w:rPr>
-          <w:rFonts w:ascii="Calibri" w:hAnsi="Calibri"/>
-          <w:b w:val="0"/>
-          <w:i w:val="0"/>
-          <w:color w:val="1A1A2E"/>
-          <w:sz w:val="20"/>
-        </w:rPr>
-        <w:t>1000 — One thousand</w:t>
-      </w:r>
-      <w:r>
-        <w:rPr>
-          <w:rFonts w:ascii="Calibri" w:hAnsi="Calibri"/>
-          <w:b w:val="0"/>
-          <w:i/>
-          <w:color w:val="6B7B8D"/>
-          <w:sz w:val="16"/>
-        </w:rPr>
-        <w:t xml:space="preserve">  ★ New counter word.</w:t>
-      </w:r>
-    </w:p>
-    <w:p>
-      <w:pPr>
-        <w:spacing w:before="0" w:after="0"/>
-        <w:ind w:left="567"/>
-      </w:pPr>
-      <w:r>
-        <w:rPr>
-          <w:rFonts w:ascii="Calibri" w:hAnsi="Calibri"/>
-          <w:b/>
-          <w:i w:val="0"/>
-          <w:color w:val="007A87"/>
-          <w:sz w:val="18"/>
-        </w:rPr>
-        <w:t xml:space="preserve">Kanji:    </w:t>
-      </w:r>
-      <w:r>
-        <w:rPr>
-          <w:rFonts w:ascii="Calibri" w:hAnsi="Calibri"/>
-          <w:b w:val="0"/>
-          <w:i w:val="0"/>
-          <w:color w:val="1A1A2E"/>
-          <w:sz w:val="18"/>
-        </w:rPr>
-        <w:t>___________________________________</w:t>
-      </w:r>
-    </w:p>
-    <w:p>
-      <w:pPr>
-        <w:spacing w:before="0" w:after="0"/>
-        <w:ind w:left="567"/>
-      </w:pPr>
-      <w:r>
-        <w:rPr>
-          <w:rFonts w:ascii="Calibri" w:hAnsi="Calibri"/>
-          <w:b/>
-          <w:i w:val="0"/>
-          <w:color w:val="007A87"/>
-          <w:sz w:val="18"/>
-        </w:rPr>
-        <w:t>Hiragana:</w:t>
-      </w:r>
-      <w:r>
-        <w:rPr>
-          <w:rFonts w:ascii="Calibri" w:hAnsi="Calibri"/>
-          <w:b w:val="0"/>
-          <w:i w:val="0"/>
-          <w:color w:val="1A1A2E"/>
-          <w:sz w:val="18"/>
-        </w:rPr>
-        <w:t>___________________________________</w:t>
-      </w:r>
-    </w:p>
-    <w:p>
-      <w:pPr>
-        <w:spacing w:before="0" w:after="0"/>
-        <w:ind w:left="567"/>
-      </w:pPr>
-      <w:r>
-        <w:rPr>
-          <w:rFonts w:ascii="Calibri" w:hAnsi="Calibri"/>
-          <w:b/>
-          <w:i w:val="0"/>
-          <w:color w:val="007A87"/>
-          <w:sz w:val="18"/>
-        </w:rPr>
-        <w:t xml:space="preserve">Romaji:  </w:t>
-      </w:r>
-      <w:r>
-        <w:rPr>
-          <w:rFonts w:ascii="Calibri" w:hAnsi="Calibri"/>
-          <w:b w:val="0"/>
-          <w:i w:val="0"/>
-          <w:color w:val="1A1A2E"/>
-          <w:sz w:val="18"/>
-        </w:rPr>
-        <w:t>___________________________________</w:t>
-      </w:r>
-      <w:r>
-        <w:rPr>
-          <w:rFonts w:ascii="Calibri" w:hAnsi="Calibri"/>
-          <w:b w:val="0"/>
-          <w:i/>
-          <w:color w:val="6B7B8D"/>
-          <w:sz w:val="16"/>
-        </w:rPr>
-        <w:t xml:space="preserve">  (sen)</w:t>
-      </w:r>
-    </w:p>
+    <w:tbl>
+      <w:tblPr>
+        <w:tblStyle w:val="TableGrid"/>
+        <w:tblW w:type="auto" w:w="0"/>
+        <w:tblLook w:firstColumn="1" w:firstRow="1" w:lastColumn="0" w:lastRow="0" w:noHBand="0" w:noVBand="1" w:val="04A0"/>
+      </w:tblPr>
+      <w:tblGrid>
+        <w:gridCol w:w="4986"/>
+        <w:gridCol w:w="4986"/>
+      </w:tblGrid>
+      <w:tr>
+        <w:tc>
+          <w:tcPr>
+            <w:tcW w:type="dxa" w:w="4986"/>
+            <w:tcBorders>
+              <w:top w:val="nil"/>
+              <w:left w:val="nil"/>
+              <w:bottom w:val="nil"/>
+              <w:right w:val="nil"/>
+            </w:tcBorders>
+            <w:shd w:val="clear" w:color="auto" w:fill="F0F6FA"/>
+            <w:vAlign w:val="top"/>
+          </w:tcPr>
+          <w:p>
+            <w:pPr>
+              <w:spacing w:before="40" w:after="0"/>
+            </w:pPr>
+            <w:r>
+              <w:rPr>
+                <w:rFonts w:ascii="Calibri" w:hAnsi="Calibri"/>
+                <w:b/>
+                <w:i w:val="0"/>
+                <w:color w:val="007A87"/>
+                <w:sz w:val="20"/>
+              </w:rPr>
+              <w:t xml:space="preserve">1. </w:t>
+            </w:r>
+            <w:r>
+              <w:rPr>
+                <w:rFonts w:ascii="Calibri" w:hAnsi="Calibri"/>
+                <w:b w:val="0"/>
+                <w:i w:val="0"/>
+                <w:color w:val="1A1A2E"/>
+                <w:sz w:val="20"/>
+              </w:rPr>
+              <w:t>1  — One</w:t>
+            </w:r>
+          </w:p>
+          <w:p>
+            <w:pPr>
+              <w:spacing w:before="0" w:after="0"/>
+              <w:ind w:left="113"/>
+            </w:pPr>
+            <w:r>
+              <w:rPr>
+                <w:rFonts w:ascii="Calibri" w:hAnsi="Calibri"/>
+                <w:b/>
+                <w:i w:val="0"/>
+                <w:color w:val="007A87"/>
+                <w:sz w:val="18"/>
+              </w:rPr>
+              <w:t xml:space="preserve">Kanji:    </w:t>
+            </w:r>
+            <w:r>
+              <w:rPr>
+                <w:rFonts w:ascii="Calibri" w:hAnsi="Calibri"/>
+                <w:b w:val="0"/>
+                <w:i w:val="0"/>
+                <w:color w:val="1A1A2E"/>
+                <w:sz w:val="18"/>
+              </w:rPr>
+              <w:t>_____________________</w:t>
+            </w:r>
+          </w:p>
+          <w:p>
+            <w:pPr>
+              <w:spacing w:before="0" w:after="0"/>
+              <w:ind w:left="113"/>
+            </w:pPr>
+            <w:r>
+              <w:rPr>
+                <w:rFonts w:ascii="Calibri" w:hAnsi="Calibri"/>
+                <w:b/>
+                <w:i w:val="0"/>
+                <w:color w:val="007A87"/>
+                <w:sz w:val="18"/>
+              </w:rPr>
+              <w:t>Hiragana:</w:t>
+            </w:r>
+            <w:r>
+              <w:rPr>
+                <w:rFonts w:ascii="Calibri" w:hAnsi="Calibri"/>
+                <w:b w:val="0"/>
+                <w:i w:val="0"/>
+                <w:color w:val="1A1A2E"/>
+                <w:sz w:val="18"/>
+              </w:rPr>
+              <w:t>_____________________</w:t>
+            </w:r>
+          </w:p>
+          <w:p>
+            <w:pPr>
+              <w:spacing w:before="0" w:after="0"/>
+              <w:ind w:left="113"/>
+            </w:pPr>
+            <w:r>
+              <w:rPr>
+                <w:rFonts w:ascii="Calibri" w:hAnsi="Calibri"/>
+                <w:b/>
+                <w:i w:val="0"/>
+                <w:color w:val="007A87"/>
+                <w:sz w:val="18"/>
+              </w:rPr>
+              <w:t xml:space="preserve">Romaji:  </w:t>
+            </w:r>
+            <w:r>
+              <w:rPr>
+                <w:rFonts w:ascii="Calibri" w:hAnsi="Calibri"/>
+                <w:b w:val="0"/>
+                <w:i w:val="0"/>
+                <w:color w:val="1A1A2E"/>
+                <w:sz w:val="18"/>
+              </w:rPr>
+              <w:t>_____________________</w:t>
+            </w:r>
+            <w:r>
+              <w:rPr>
+                <w:rFonts w:ascii="Calibri" w:hAnsi="Calibri"/>
+                <w:b w:val="0"/>
+                <w:i/>
+                <w:color w:val="6B7B8D"/>
+                <w:sz w:val="14"/>
+              </w:rPr>
+              <w:t xml:space="preserve">  (ichi)</w:t>
+            </w:r>
+          </w:p>
+        </w:tc>
+        <w:tc>
+          <w:tcPr>
+            <w:tcW w:type="dxa" w:w="4986"/>
+            <w:tcBorders>
+              <w:top w:val="nil"/>
+              <w:left w:val="nil"/>
+              <w:bottom w:val="nil"/>
+              <w:right w:val="nil"/>
+            </w:tcBorders>
+            <w:shd w:val="clear" w:color="auto" w:fill="F0F6FA"/>
+            <w:vAlign w:val="top"/>
+          </w:tcPr>
+          <w:p>
+            <w:pPr>
+              <w:spacing w:before="40" w:after="0"/>
+            </w:pPr>
+            <w:r>
+              <w:rPr>
+                <w:rFonts w:ascii="Calibri" w:hAnsi="Calibri"/>
+                <w:b/>
+                <w:i w:val="0"/>
+                <w:color w:val="007A87"/>
+                <w:sz w:val="20"/>
+              </w:rPr>
+              <w:t xml:space="preserve">2. </w:t>
+            </w:r>
+            <w:r>
+              <w:rPr>
+                <w:rFonts w:ascii="Calibri" w:hAnsi="Calibri"/>
+                <w:b w:val="0"/>
+                <w:i w:val="0"/>
+                <w:color w:val="1A1A2E"/>
+                <w:sz w:val="20"/>
+              </w:rPr>
+              <w:t>2  — Two</w:t>
+            </w:r>
+          </w:p>
+          <w:p>
+            <w:pPr>
+              <w:spacing w:before="0" w:after="0"/>
+              <w:ind w:left="113"/>
+            </w:pPr>
+            <w:r>
+              <w:rPr>
+                <w:rFonts w:ascii="Calibri" w:hAnsi="Calibri"/>
+                <w:b/>
+                <w:i w:val="0"/>
+                <w:color w:val="007A87"/>
+                <w:sz w:val="18"/>
+              </w:rPr>
+              <w:t xml:space="preserve">Kanji:    </w:t>
+            </w:r>
+            <w:r>
+              <w:rPr>
+                <w:rFonts w:ascii="Calibri" w:hAnsi="Calibri"/>
+                <w:b w:val="0"/>
+                <w:i w:val="0"/>
+                <w:color w:val="1A1A2E"/>
+                <w:sz w:val="18"/>
+              </w:rPr>
+              <w:t>_____________________</w:t>
+            </w:r>
+          </w:p>
+          <w:p>
+            <w:pPr>
+              <w:spacing w:before="0" w:after="0"/>
+              <w:ind w:left="113"/>
+            </w:pPr>
+            <w:r>
+              <w:rPr>
+                <w:rFonts w:ascii="Calibri" w:hAnsi="Calibri"/>
+                <w:b/>
+                <w:i w:val="0"/>
+                <w:color w:val="007A87"/>
+                <w:sz w:val="18"/>
+              </w:rPr>
+              <w:t>Hiragana:</w:t>
+            </w:r>
+            <w:r>
+              <w:rPr>
+                <w:rFonts w:ascii="Calibri" w:hAnsi="Calibri"/>
+                <w:b w:val="0"/>
+                <w:i w:val="0"/>
+                <w:color w:val="1A1A2E"/>
+                <w:sz w:val="18"/>
+              </w:rPr>
+              <w:t>_____________________</w:t>
+            </w:r>
+          </w:p>
+          <w:p>
+            <w:pPr>
+              <w:spacing w:before="0" w:after="0"/>
+              <w:ind w:left="113"/>
+            </w:pPr>
+            <w:r>
+              <w:rPr>
+                <w:rFonts w:ascii="Calibri" w:hAnsi="Calibri"/>
+                <w:b/>
+                <w:i w:val="0"/>
+                <w:color w:val="007A87"/>
+                <w:sz w:val="18"/>
+              </w:rPr>
+              <w:t xml:space="preserve">Romaji:  </w:t>
+            </w:r>
+            <w:r>
+              <w:rPr>
+                <w:rFonts w:ascii="Calibri" w:hAnsi="Calibri"/>
+                <w:b w:val="0"/>
+                <w:i w:val="0"/>
+                <w:color w:val="1A1A2E"/>
+                <w:sz w:val="18"/>
+              </w:rPr>
+              <w:t>_____________________</w:t>
+            </w:r>
+            <w:r>
+              <w:rPr>
+                <w:rFonts w:ascii="Calibri" w:hAnsi="Calibri"/>
+                <w:b w:val="0"/>
+                <w:i/>
+                <w:color w:val="6B7B8D"/>
+                <w:sz w:val="14"/>
+              </w:rPr>
+              <w:t xml:space="preserve">  (ni)</w:t>
+            </w:r>
+          </w:p>
+        </w:tc>
+      </w:tr>
+      <w:tr>
+        <w:tc>
+          <w:tcPr>
+            <w:tcW w:type="dxa" w:w="4986"/>
+            <w:tcBorders>
+              <w:top w:val="nil"/>
+              <w:left w:val="nil"/>
+              <w:bottom w:val="nil"/>
+              <w:right w:val="nil"/>
+            </w:tcBorders>
+            <w:shd w:val="clear" w:color="auto" w:fill="FFFFFF"/>
+            <w:vAlign w:val="top"/>
+          </w:tcPr>
+          <w:p>
+            <w:pPr>
+              <w:spacing w:before="40" w:after="0"/>
+            </w:pPr>
+            <w:r>
+              <w:rPr>
+                <w:rFonts w:ascii="Calibri" w:hAnsi="Calibri"/>
+                <w:b/>
+                <w:i w:val="0"/>
+                <w:color w:val="007A87"/>
+                <w:sz w:val="20"/>
+              </w:rPr>
+              <w:t xml:space="preserve">3. </w:t>
+            </w:r>
+            <w:r>
+              <w:rPr>
+                <w:rFonts w:ascii="Calibri" w:hAnsi="Calibri"/>
+                <w:b w:val="0"/>
+                <w:i w:val="0"/>
+                <w:color w:val="1A1A2E"/>
+                <w:sz w:val="20"/>
+              </w:rPr>
+              <w:t>3  — Three</w:t>
+            </w:r>
+          </w:p>
+          <w:p>
+            <w:pPr>
+              <w:spacing w:before="0" w:after="0"/>
+              <w:ind w:left="113"/>
+            </w:pPr>
+            <w:r>
+              <w:rPr>
+                <w:rFonts w:ascii="Calibri" w:hAnsi="Calibri"/>
+                <w:b/>
+                <w:i w:val="0"/>
+                <w:color w:val="007A87"/>
+                <w:sz w:val="18"/>
+              </w:rPr>
+              <w:t xml:space="preserve">Kanji:    </w:t>
+            </w:r>
+            <w:r>
+              <w:rPr>
+                <w:rFonts w:ascii="Calibri" w:hAnsi="Calibri"/>
+                <w:b w:val="0"/>
+                <w:i w:val="0"/>
+                <w:color w:val="1A1A2E"/>
+                <w:sz w:val="18"/>
+              </w:rPr>
+              <w:t>_____________________</w:t>
+            </w:r>
+          </w:p>
+          <w:p>
+            <w:pPr>
+              <w:spacing w:before="0" w:after="0"/>
+              <w:ind w:left="113"/>
+            </w:pPr>
+            <w:r>
+              <w:rPr>
+                <w:rFonts w:ascii="Calibri" w:hAnsi="Calibri"/>
+                <w:b/>
+                <w:i w:val="0"/>
+                <w:color w:val="007A87"/>
+                <w:sz w:val="18"/>
+              </w:rPr>
+              <w:t>Hiragana:</w:t>
+            </w:r>
+            <w:r>
+              <w:rPr>
+                <w:rFonts w:ascii="Calibri" w:hAnsi="Calibri"/>
+                <w:b w:val="0"/>
+                <w:i w:val="0"/>
+                <w:color w:val="1A1A2E"/>
+                <w:sz w:val="18"/>
+              </w:rPr>
+              <w:t>_____________________</w:t>
+            </w:r>
+          </w:p>
+          <w:p>
+            <w:pPr>
+              <w:spacing w:before="0" w:after="0"/>
+              <w:ind w:left="113"/>
+            </w:pPr>
+            <w:r>
+              <w:rPr>
+                <w:rFonts w:ascii="Calibri" w:hAnsi="Calibri"/>
+                <w:b/>
+                <w:i w:val="0"/>
+                <w:color w:val="007A87"/>
+                <w:sz w:val="18"/>
+              </w:rPr>
+              <w:t xml:space="preserve">Romaji:  </w:t>
+            </w:r>
+            <w:r>
+              <w:rPr>
+                <w:rFonts w:ascii="Calibri" w:hAnsi="Calibri"/>
+                <w:b w:val="0"/>
+                <w:i w:val="0"/>
+                <w:color w:val="1A1A2E"/>
+                <w:sz w:val="18"/>
+              </w:rPr>
+              <w:t>_____________________</w:t>
+            </w:r>
+            <w:r>
+              <w:rPr>
+                <w:rFonts w:ascii="Calibri" w:hAnsi="Calibri"/>
+                <w:b w:val="0"/>
+                <w:i/>
+                <w:color w:val="6B7B8D"/>
+                <w:sz w:val="14"/>
+              </w:rPr>
+              <w:t xml:space="preserve">  (san)</w:t>
+            </w:r>
+          </w:p>
+        </w:tc>
+        <w:tc>
+          <w:tcPr>
+            <w:tcW w:type="dxa" w:w="4986"/>
+            <w:tcBorders>
+              <w:top w:val="nil"/>
+              <w:left w:val="nil"/>
+              <w:bottom w:val="nil"/>
+              <w:right w:val="nil"/>
+            </w:tcBorders>
+            <w:shd w:val="clear" w:color="auto" w:fill="FFFFFF"/>
+            <w:vAlign w:val="top"/>
+          </w:tcPr>
+          <w:p>
+            <w:pPr>
+              <w:spacing w:before="40" w:after="0"/>
+            </w:pPr>
+            <w:r>
+              <w:rPr>
+                <w:rFonts w:ascii="Calibri" w:hAnsi="Calibri"/>
+                <w:b/>
+                <w:i w:val="0"/>
+                <w:color w:val="007A87"/>
+                <w:sz w:val="20"/>
+              </w:rPr>
+              <w:t xml:space="preserve">4. </w:t>
+            </w:r>
+            <w:r>
+              <w:rPr>
+                <w:rFonts w:ascii="Calibri" w:hAnsi="Calibri"/>
+                <w:b w:val="0"/>
+                <w:i w:val="0"/>
+                <w:color w:val="1A1A2E"/>
+                <w:sz w:val="20"/>
+              </w:rPr>
+              <w:t>4  — Four</w:t>
+            </w:r>
+          </w:p>
+          <w:p>
+            <w:pPr>
+              <w:spacing w:before="0" w:after="20"/>
+            </w:pPr>
+            <w:r>
+              <w:rPr>
+                <w:rFonts w:ascii="Calibri" w:hAnsi="Calibri"/>
+                <w:b w:val="0"/>
+                <w:i/>
+                <w:color w:val="6B7B8D"/>
+                <w:sz w:val="14"/>
+              </w:rPr>
+              <w:t>★ Both are used; よん is safer in daily speech.</w:t>
+            </w:r>
+          </w:p>
+          <w:p>
+            <w:pPr>
+              <w:spacing w:before="0" w:after="0"/>
+              <w:ind w:left="113"/>
+            </w:pPr>
+            <w:r>
+              <w:rPr>
+                <w:rFonts w:ascii="Calibri" w:hAnsi="Calibri"/>
+                <w:b/>
+                <w:i w:val="0"/>
+                <w:color w:val="007A87"/>
+                <w:sz w:val="18"/>
+              </w:rPr>
+              <w:t xml:space="preserve">Kanji:    </w:t>
+            </w:r>
+            <w:r>
+              <w:rPr>
+                <w:rFonts w:ascii="Calibri" w:hAnsi="Calibri"/>
+                <w:b w:val="0"/>
+                <w:i w:val="0"/>
+                <w:color w:val="1A1A2E"/>
+                <w:sz w:val="18"/>
+              </w:rPr>
+              <w:t>_____________________</w:t>
+            </w:r>
+          </w:p>
+          <w:p>
+            <w:pPr>
+              <w:spacing w:before="0" w:after="0"/>
+              <w:ind w:left="113"/>
+            </w:pPr>
+            <w:r>
+              <w:rPr>
+                <w:rFonts w:ascii="Calibri" w:hAnsi="Calibri"/>
+                <w:b/>
+                <w:i w:val="0"/>
+                <w:color w:val="007A87"/>
+                <w:sz w:val="18"/>
+              </w:rPr>
+              <w:t>Hiragana:</w:t>
+            </w:r>
+            <w:r>
+              <w:rPr>
+                <w:rFonts w:ascii="Calibri" w:hAnsi="Calibri"/>
+                <w:b w:val="0"/>
+                <w:i w:val="0"/>
+                <w:color w:val="1A1A2E"/>
+                <w:sz w:val="18"/>
+              </w:rPr>
+              <w:t>_____________________</w:t>
+            </w:r>
+          </w:p>
+          <w:p>
+            <w:pPr>
+              <w:spacing w:before="0" w:after="0"/>
+              <w:ind w:left="113"/>
+            </w:pPr>
+            <w:r>
+              <w:rPr>
+                <w:rFonts w:ascii="Calibri" w:hAnsi="Calibri"/>
+                <w:b/>
+                <w:i w:val="0"/>
+                <w:color w:val="007A87"/>
+                <w:sz w:val="18"/>
+              </w:rPr>
+              <w:t xml:space="preserve">Romaji:  </w:t>
+            </w:r>
+            <w:r>
+              <w:rPr>
+                <w:rFonts w:ascii="Calibri" w:hAnsi="Calibri"/>
+                <w:b w:val="0"/>
+                <w:i w:val="0"/>
+                <w:color w:val="1A1A2E"/>
+                <w:sz w:val="18"/>
+              </w:rPr>
+              <w:t>_____________________</w:t>
+            </w:r>
+            <w:r>
+              <w:rPr>
+                <w:rFonts w:ascii="Calibri" w:hAnsi="Calibri"/>
+                <w:b w:val="0"/>
+                <w:i/>
+                <w:color w:val="6B7B8D"/>
+                <w:sz w:val="14"/>
+              </w:rPr>
+              <w:t xml:space="preserve">  (shi / yon)</w:t>
+            </w:r>
+          </w:p>
+        </w:tc>
+      </w:tr>
+      <w:tr>
+        <w:tc>
+          <w:tcPr>
+            <w:tcW w:type="dxa" w:w="4986"/>
+            <w:tcBorders>
+              <w:top w:val="nil"/>
+              <w:left w:val="nil"/>
+              <w:bottom w:val="nil"/>
+              <w:right w:val="nil"/>
+            </w:tcBorders>
+            <w:shd w:val="clear" w:color="auto" w:fill="F0F6FA"/>
+            <w:vAlign w:val="top"/>
+          </w:tcPr>
+          <w:p>
+            <w:pPr>
+              <w:spacing w:before="40" w:after="0"/>
+            </w:pPr>
+            <w:r>
+              <w:rPr>
+                <w:rFonts w:ascii="Calibri" w:hAnsi="Calibri"/>
+                <w:b/>
+                <w:i w:val="0"/>
+                <w:color w:val="007A87"/>
+                <w:sz w:val="20"/>
+              </w:rPr>
+              <w:t xml:space="preserve">5. </w:t>
+            </w:r>
+            <w:r>
+              <w:rPr>
+                <w:rFonts w:ascii="Calibri" w:hAnsi="Calibri"/>
+                <w:b w:val="0"/>
+                <w:i w:val="0"/>
+                <w:color w:val="1A1A2E"/>
+                <w:sz w:val="20"/>
+              </w:rPr>
+              <w:t>5  — Five</w:t>
+            </w:r>
+          </w:p>
+          <w:p>
+            <w:pPr>
+              <w:spacing w:before="0" w:after="0"/>
+              <w:ind w:left="113"/>
+            </w:pPr>
+            <w:r>
+              <w:rPr>
+                <w:rFonts w:ascii="Calibri" w:hAnsi="Calibri"/>
+                <w:b/>
+                <w:i w:val="0"/>
+                <w:color w:val="007A87"/>
+                <w:sz w:val="18"/>
+              </w:rPr>
+              <w:t xml:space="preserve">Kanji:    </w:t>
+            </w:r>
+            <w:r>
+              <w:rPr>
+                <w:rFonts w:ascii="Calibri" w:hAnsi="Calibri"/>
+                <w:b w:val="0"/>
+                <w:i w:val="0"/>
+                <w:color w:val="1A1A2E"/>
+                <w:sz w:val="18"/>
+              </w:rPr>
+              <w:t>_____________________</w:t>
+            </w:r>
+          </w:p>
+          <w:p>
+            <w:pPr>
+              <w:spacing w:before="0" w:after="0"/>
+              <w:ind w:left="113"/>
+            </w:pPr>
+            <w:r>
+              <w:rPr>
+                <w:rFonts w:ascii="Calibri" w:hAnsi="Calibri"/>
+                <w:b/>
+                <w:i w:val="0"/>
+                <w:color w:val="007A87"/>
+                <w:sz w:val="18"/>
+              </w:rPr>
+              <w:t>Hiragana:</w:t>
+            </w:r>
+            <w:r>
+              <w:rPr>
+                <w:rFonts w:ascii="Calibri" w:hAnsi="Calibri"/>
+                <w:b w:val="0"/>
+                <w:i w:val="0"/>
+                <w:color w:val="1A1A2E"/>
+                <w:sz w:val="18"/>
+              </w:rPr>
+              <w:t>_____________________</w:t>
+            </w:r>
+          </w:p>
+          <w:p>
+            <w:pPr>
+              <w:spacing w:before="0" w:after="0"/>
+              <w:ind w:left="113"/>
+            </w:pPr>
+            <w:r>
+              <w:rPr>
+                <w:rFonts w:ascii="Calibri" w:hAnsi="Calibri"/>
+                <w:b/>
+                <w:i w:val="0"/>
+                <w:color w:val="007A87"/>
+                <w:sz w:val="18"/>
+              </w:rPr>
+              <w:t xml:space="preserve">Romaji:  </w:t>
+            </w:r>
+            <w:r>
+              <w:rPr>
+                <w:rFonts w:ascii="Calibri" w:hAnsi="Calibri"/>
+                <w:b w:val="0"/>
+                <w:i w:val="0"/>
+                <w:color w:val="1A1A2E"/>
+                <w:sz w:val="18"/>
+              </w:rPr>
+              <w:t>_____________________</w:t>
+            </w:r>
+            <w:r>
+              <w:rPr>
+                <w:rFonts w:ascii="Calibri" w:hAnsi="Calibri"/>
+                <w:b w:val="0"/>
+                <w:i/>
+                <w:color w:val="6B7B8D"/>
+                <w:sz w:val="14"/>
+              </w:rPr>
+              <w:t xml:space="preserve">  (go)</w:t>
+            </w:r>
+          </w:p>
+        </w:tc>
+        <w:tc>
+          <w:tcPr>
+            <w:tcW w:type="dxa" w:w="4986"/>
+            <w:tcBorders>
+              <w:top w:val="nil"/>
+              <w:left w:val="nil"/>
+              <w:bottom w:val="nil"/>
+              <w:right w:val="nil"/>
+            </w:tcBorders>
+            <w:shd w:val="clear" w:color="auto" w:fill="F0F6FA"/>
+            <w:vAlign w:val="top"/>
+          </w:tcPr>
+          <w:p>
+            <w:pPr>
+              <w:spacing w:before="40" w:after="0"/>
+            </w:pPr>
+            <w:r>
+              <w:rPr>
+                <w:rFonts w:ascii="Calibri" w:hAnsi="Calibri"/>
+                <w:b/>
+                <w:i w:val="0"/>
+                <w:color w:val="007A87"/>
+                <w:sz w:val="20"/>
+              </w:rPr>
+              <w:t xml:space="preserve">6. </w:t>
+            </w:r>
+            <w:r>
+              <w:rPr>
+                <w:rFonts w:ascii="Calibri" w:hAnsi="Calibri"/>
+                <w:b w:val="0"/>
+                <w:i w:val="0"/>
+                <w:color w:val="1A1A2E"/>
+                <w:sz w:val="20"/>
+              </w:rPr>
+              <w:t>6  — Six</w:t>
+            </w:r>
+          </w:p>
+          <w:p>
+            <w:pPr>
+              <w:spacing w:before="0" w:after="0"/>
+              <w:ind w:left="113"/>
+            </w:pPr>
+            <w:r>
+              <w:rPr>
+                <w:rFonts w:ascii="Calibri" w:hAnsi="Calibri"/>
+                <w:b/>
+                <w:i w:val="0"/>
+                <w:color w:val="007A87"/>
+                <w:sz w:val="18"/>
+              </w:rPr>
+              <w:t xml:space="preserve">Kanji:    </w:t>
+            </w:r>
+            <w:r>
+              <w:rPr>
+                <w:rFonts w:ascii="Calibri" w:hAnsi="Calibri"/>
+                <w:b w:val="0"/>
+                <w:i w:val="0"/>
+                <w:color w:val="1A1A2E"/>
+                <w:sz w:val="18"/>
+              </w:rPr>
+              <w:t>_____________________</w:t>
+            </w:r>
+          </w:p>
+          <w:p>
+            <w:pPr>
+              <w:spacing w:before="0" w:after="0"/>
+              <w:ind w:left="113"/>
+            </w:pPr>
+            <w:r>
+              <w:rPr>
+                <w:rFonts w:ascii="Calibri" w:hAnsi="Calibri"/>
+                <w:b/>
+                <w:i w:val="0"/>
+                <w:color w:val="007A87"/>
+                <w:sz w:val="18"/>
+              </w:rPr>
+              <w:t>Hiragana:</w:t>
+            </w:r>
+            <w:r>
+              <w:rPr>
+                <w:rFonts w:ascii="Calibri" w:hAnsi="Calibri"/>
+                <w:b w:val="0"/>
+                <w:i w:val="0"/>
+                <w:color w:val="1A1A2E"/>
+                <w:sz w:val="18"/>
+              </w:rPr>
+              <w:t>_____________________</w:t>
+            </w:r>
+          </w:p>
+          <w:p>
+            <w:pPr>
+              <w:spacing w:before="0" w:after="0"/>
+              <w:ind w:left="113"/>
+            </w:pPr>
+            <w:r>
+              <w:rPr>
+                <w:rFonts w:ascii="Calibri" w:hAnsi="Calibri"/>
+                <w:b/>
+                <w:i w:val="0"/>
+                <w:color w:val="007A87"/>
+                <w:sz w:val="18"/>
+              </w:rPr>
+              <w:t xml:space="preserve">Romaji:  </w:t>
+            </w:r>
+            <w:r>
+              <w:rPr>
+                <w:rFonts w:ascii="Calibri" w:hAnsi="Calibri"/>
+                <w:b w:val="0"/>
+                <w:i w:val="0"/>
+                <w:color w:val="1A1A2E"/>
+                <w:sz w:val="18"/>
+              </w:rPr>
+              <w:t>_____________________</w:t>
+            </w:r>
+            <w:r>
+              <w:rPr>
+                <w:rFonts w:ascii="Calibri" w:hAnsi="Calibri"/>
+                <w:b w:val="0"/>
+                <w:i/>
+                <w:color w:val="6B7B8D"/>
+                <w:sz w:val="14"/>
+              </w:rPr>
+              <w:t xml:space="preserve">  (roku)</w:t>
+            </w:r>
+          </w:p>
+        </w:tc>
+      </w:tr>
+      <w:tr>
+        <w:tc>
+          <w:tcPr>
+            <w:tcW w:type="dxa" w:w="4986"/>
+            <w:tcBorders>
+              <w:top w:val="nil"/>
+              <w:left w:val="nil"/>
+              <w:bottom w:val="nil"/>
+              <w:right w:val="nil"/>
+            </w:tcBorders>
+            <w:shd w:val="clear" w:color="auto" w:fill="FFFFFF"/>
+            <w:vAlign w:val="top"/>
+          </w:tcPr>
+          <w:p>
+            <w:pPr>
+              <w:spacing w:before="40" w:after="0"/>
+            </w:pPr>
+            <w:r>
+              <w:rPr>
+                <w:rFonts w:ascii="Calibri" w:hAnsi="Calibri"/>
+                <w:b/>
+                <w:i w:val="0"/>
+                <w:color w:val="007A87"/>
+                <w:sz w:val="20"/>
+              </w:rPr>
+              <w:t xml:space="preserve">7. </w:t>
+            </w:r>
+            <w:r>
+              <w:rPr>
+                <w:rFonts w:ascii="Calibri" w:hAnsi="Calibri"/>
+                <w:b w:val="0"/>
+                <w:i w:val="0"/>
+                <w:color w:val="1A1A2E"/>
+                <w:sz w:val="20"/>
+              </w:rPr>
+              <w:t>7  — Seven</w:t>
+            </w:r>
+          </w:p>
+          <w:p>
+            <w:pPr>
+              <w:spacing w:before="0" w:after="20"/>
+            </w:pPr>
+            <w:r>
+              <w:rPr>
+                <w:rFonts w:ascii="Calibri" w:hAnsi="Calibri"/>
+                <w:b w:val="0"/>
+                <w:i/>
+                <w:color w:val="6B7B8D"/>
+                <w:sz w:val="14"/>
+              </w:rPr>
+              <w:t>★ なな is more common in daily speech.</w:t>
+            </w:r>
+          </w:p>
+          <w:p>
+            <w:pPr>
+              <w:spacing w:before="0" w:after="0"/>
+              <w:ind w:left="113"/>
+            </w:pPr>
+            <w:r>
+              <w:rPr>
+                <w:rFonts w:ascii="Calibri" w:hAnsi="Calibri"/>
+                <w:b/>
+                <w:i w:val="0"/>
+                <w:color w:val="007A87"/>
+                <w:sz w:val="18"/>
+              </w:rPr>
+              <w:t xml:space="preserve">Kanji:    </w:t>
+            </w:r>
+            <w:r>
+              <w:rPr>
+                <w:rFonts w:ascii="Calibri" w:hAnsi="Calibri"/>
+                <w:b w:val="0"/>
+                <w:i w:val="0"/>
+                <w:color w:val="1A1A2E"/>
+                <w:sz w:val="18"/>
+              </w:rPr>
+              <w:t>_____________________</w:t>
+            </w:r>
+          </w:p>
+          <w:p>
+            <w:pPr>
+              <w:spacing w:before="0" w:after="0"/>
+              <w:ind w:left="113"/>
+            </w:pPr>
+            <w:r>
+              <w:rPr>
+                <w:rFonts w:ascii="Calibri" w:hAnsi="Calibri"/>
+                <w:b/>
+                <w:i w:val="0"/>
+                <w:color w:val="007A87"/>
+                <w:sz w:val="18"/>
+              </w:rPr>
+              <w:t>Hiragana:</w:t>
+            </w:r>
+            <w:r>
+              <w:rPr>
+                <w:rFonts w:ascii="Calibri" w:hAnsi="Calibri"/>
+                <w:b w:val="0"/>
+                <w:i w:val="0"/>
+                <w:color w:val="1A1A2E"/>
+                <w:sz w:val="18"/>
+              </w:rPr>
+              <w:t>_____________________</w:t>
+            </w:r>
+          </w:p>
+          <w:p>
+            <w:pPr>
+              <w:spacing w:before="0" w:after="0"/>
+              <w:ind w:left="113"/>
+            </w:pPr>
+            <w:r>
+              <w:rPr>
+                <w:rFonts w:ascii="Calibri" w:hAnsi="Calibri"/>
+                <w:b/>
+                <w:i w:val="0"/>
+                <w:color w:val="007A87"/>
+                <w:sz w:val="18"/>
+              </w:rPr>
+              <w:t xml:space="preserve">Romaji:  </w:t>
+            </w:r>
+            <w:r>
+              <w:rPr>
+                <w:rFonts w:ascii="Calibri" w:hAnsi="Calibri"/>
+                <w:b w:val="0"/>
+                <w:i w:val="0"/>
+                <w:color w:val="1A1A2E"/>
+                <w:sz w:val="18"/>
+              </w:rPr>
+              <w:t>_____________________</w:t>
+            </w:r>
+            <w:r>
+              <w:rPr>
+                <w:rFonts w:ascii="Calibri" w:hAnsi="Calibri"/>
+                <w:b w:val="0"/>
+                <w:i/>
+                <w:color w:val="6B7B8D"/>
+                <w:sz w:val="14"/>
+              </w:rPr>
+              <w:t xml:space="preserve">  (shichi / nana)</w:t>
+            </w:r>
+          </w:p>
+        </w:tc>
+        <w:tc>
+          <w:tcPr>
+            <w:tcW w:type="dxa" w:w="4986"/>
+            <w:tcBorders>
+              <w:top w:val="nil"/>
+              <w:left w:val="nil"/>
+              <w:bottom w:val="nil"/>
+              <w:right w:val="nil"/>
+            </w:tcBorders>
+            <w:shd w:val="clear" w:color="auto" w:fill="FFFFFF"/>
+            <w:vAlign w:val="top"/>
+          </w:tcPr>
+          <w:p>
+            <w:pPr>
+              <w:spacing w:before="40" w:after="0"/>
+            </w:pPr>
+            <w:r>
+              <w:rPr>
+                <w:rFonts w:ascii="Calibri" w:hAnsi="Calibri"/>
+                <w:b/>
+                <w:i w:val="0"/>
+                <w:color w:val="007A87"/>
+                <w:sz w:val="20"/>
+              </w:rPr>
+              <w:t xml:space="preserve">8. </w:t>
+            </w:r>
+            <w:r>
+              <w:rPr>
+                <w:rFonts w:ascii="Calibri" w:hAnsi="Calibri"/>
+                <w:b w:val="0"/>
+                <w:i w:val="0"/>
+                <w:color w:val="1A1A2E"/>
+                <w:sz w:val="20"/>
+              </w:rPr>
+              <w:t>8  — Eight</w:t>
+            </w:r>
+          </w:p>
+          <w:p>
+            <w:pPr>
+              <w:spacing w:before="0" w:after="0"/>
+              <w:ind w:left="113"/>
+            </w:pPr>
+            <w:r>
+              <w:rPr>
+                <w:rFonts w:ascii="Calibri" w:hAnsi="Calibri"/>
+                <w:b/>
+                <w:i w:val="0"/>
+                <w:color w:val="007A87"/>
+                <w:sz w:val="18"/>
+              </w:rPr>
+              <w:t xml:space="preserve">Kanji:    </w:t>
+            </w:r>
+            <w:r>
+              <w:rPr>
+                <w:rFonts w:ascii="Calibri" w:hAnsi="Calibri"/>
+                <w:b w:val="0"/>
+                <w:i w:val="0"/>
+                <w:color w:val="1A1A2E"/>
+                <w:sz w:val="18"/>
+              </w:rPr>
+              <w:t>_____________________</w:t>
+            </w:r>
+          </w:p>
+          <w:p>
+            <w:pPr>
+              <w:spacing w:before="0" w:after="0"/>
+              <w:ind w:left="113"/>
+            </w:pPr>
+            <w:r>
+              <w:rPr>
+                <w:rFonts w:ascii="Calibri" w:hAnsi="Calibri"/>
+                <w:b/>
+                <w:i w:val="0"/>
+                <w:color w:val="007A87"/>
+                <w:sz w:val="18"/>
+              </w:rPr>
+              <w:t>Hiragana:</w:t>
+            </w:r>
+            <w:r>
+              <w:rPr>
+                <w:rFonts w:ascii="Calibri" w:hAnsi="Calibri"/>
+                <w:b w:val="0"/>
+                <w:i w:val="0"/>
+                <w:color w:val="1A1A2E"/>
+                <w:sz w:val="18"/>
+              </w:rPr>
+              <w:t>_____________________</w:t>
+            </w:r>
+          </w:p>
+          <w:p>
+            <w:pPr>
+              <w:spacing w:before="0" w:after="0"/>
+              <w:ind w:left="113"/>
+            </w:pPr>
+            <w:r>
+              <w:rPr>
+                <w:rFonts w:ascii="Calibri" w:hAnsi="Calibri"/>
+                <w:b/>
+                <w:i w:val="0"/>
+                <w:color w:val="007A87"/>
+                <w:sz w:val="18"/>
+              </w:rPr>
+              <w:t xml:space="preserve">Romaji:  </w:t>
+            </w:r>
+            <w:r>
+              <w:rPr>
+                <w:rFonts w:ascii="Calibri" w:hAnsi="Calibri"/>
+                <w:b w:val="0"/>
+                <w:i w:val="0"/>
+                <w:color w:val="1A1A2E"/>
+                <w:sz w:val="18"/>
+              </w:rPr>
+              <w:t>_____________________</w:t>
+            </w:r>
+            <w:r>
+              <w:rPr>
+                <w:rFonts w:ascii="Calibri" w:hAnsi="Calibri"/>
+                <w:b w:val="0"/>
+                <w:i/>
+                <w:color w:val="6B7B8D"/>
+                <w:sz w:val="14"/>
+              </w:rPr>
+              <w:t xml:space="preserve">  (hachi)</w:t>
+            </w:r>
+          </w:p>
+        </w:tc>
+      </w:tr>
+      <w:tr>
+        <w:tc>
+          <w:tcPr>
+            <w:tcW w:type="dxa" w:w="4986"/>
+            <w:tcBorders>
+              <w:top w:val="nil"/>
+              <w:left w:val="nil"/>
+              <w:bottom w:val="nil"/>
+              <w:right w:val="nil"/>
+            </w:tcBorders>
+            <w:shd w:val="clear" w:color="auto" w:fill="F0F6FA"/>
+            <w:vAlign w:val="top"/>
+          </w:tcPr>
+          <w:p>
+            <w:pPr>
+              <w:spacing w:before="40" w:after="0"/>
+            </w:pPr>
+            <w:r>
+              <w:rPr>
+                <w:rFonts w:ascii="Calibri" w:hAnsi="Calibri"/>
+                <w:b/>
+                <w:i w:val="0"/>
+                <w:color w:val="007A87"/>
+                <w:sz w:val="20"/>
+              </w:rPr>
+              <w:t xml:space="preserve">9. </w:t>
+            </w:r>
+            <w:r>
+              <w:rPr>
+                <w:rFonts w:ascii="Calibri" w:hAnsi="Calibri"/>
+                <w:b w:val="0"/>
+                <w:i w:val="0"/>
+                <w:color w:val="1A1A2E"/>
+                <w:sz w:val="20"/>
+              </w:rPr>
+              <w:t>9  — Nine</w:t>
+            </w:r>
+          </w:p>
+          <w:p>
+            <w:pPr>
+              <w:spacing w:before="0" w:after="20"/>
+            </w:pPr>
+            <w:r>
+              <w:rPr>
+                <w:rFonts w:ascii="Calibri" w:hAnsi="Calibri"/>
+                <w:b w:val="0"/>
+                <w:i/>
+                <w:color w:val="6B7B8D"/>
+                <w:sz w:val="14"/>
+              </w:rPr>
+              <w:t>★ きゅう is preferred in most contexts.</w:t>
+            </w:r>
+          </w:p>
+          <w:p>
+            <w:pPr>
+              <w:spacing w:before="0" w:after="0"/>
+              <w:ind w:left="113"/>
+            </w:pPr>
+            <w:r>
+              <w:rPr>
+                <w:rFonts w:ascii="Calibri" w:hAnsi="Calibri"/>
+                <w:b/>
+                <w:i w:val="0"/>
+                <w:color w:val="007A87"/>
+                <w:sz w:val="18"/>
+              </w:rPr>
+              <w:t xml:space="preserve">Kanji:    </w:t>
+            </w:r>
+            <w:r>
+              <w:rPr>
+                <w:rFonts w:ascii="Calibri" w:hAnsi="Calibri"/>
+                <w:b w:val="0"/>
+                <w:i w:val="0"/>
+                <w:color w:val="1A1A2E"/>
+                <w:sz w:val="18"/>
+              </w:rPr>
+              <w:t>_____________________</w:t>
+            </w:r>
+          </w:p>
+          <w:p>
+            <w:pPr>
+              <w:spacing w:before="0" w:after="0"/>
+              <w:ind w:left="113"/>
+            </w:pPr>
+            <w:r>
+              <w:rPr>
+                <w:rFonts w:ascii="Calibri" w:hAnsi="Calibri"/>
+                <w:b/>
+                <w:i w:val="0"/>
+                <w:color w:val="007A87"/>
+                <w:sz w:val="18"/>
+              </w:rPr>
+              <w:t>Hiragana:</w:t>
+            </w:r>
+            <w:r>
+              <w:rPr>
+                <w:rFonts w:ascii="Calibri" w:hAnsi="Calibri"/>
+                <w:b w:val="0"/>
+                <w:i w:val="0"/>
+                <w:color w:val="1A1A2E"/>
+                <w:sz w:val="18"/>
+              </w:rPr>
+              <w:t>_____________________</w:t>
+            </w:r>
+          </w:p>
+          <w:p>
+            <w:pPr>
+              <w:spacing w:before="0" w:after="0"/>
+              <w:ind w:left="113"/>
+            </w:pPr>
+            <w:r>
+              <w:rPr>
+                <w:rFonts w:ascii="Calibri" w:hAnsi="Calibri"/>
+                <w:b/>
+                <w:i w:val="0"/>
+                <w:color w:val="007A87"/>
+                <w:sz w:val="18"/>
+              </w:rPr>
+              <w:t xml:space="preserve">Romaji:  </w:t>
+            </w:r>
+            <w:r>
+              <w:rPr>
+                <w:rFonts w:ascii="Calibri" w:hAnsi="Calibri"/>
+                <w:b w:val="0"/>
+                <w:i w:val="0"/>
+                <w:color w:val="1A1A2E"/>
+                <w:sz w:val="18"/>
+              </w:rPr>
+              <w:t>_____________________</w:t>
+            </w:r>
+            <w:r>
+              <w:rPr>
+                <w:rFonts w:ascii="Calibri" w:hAnsi="Calibri"/>
+                <w:b w:val="0"/>
+                <w:i/>
+                <w:color w:val="6B7B8D"/>
+                <w:sz w:val="14"/>
+              </w:rPr>
+              <w:t xml:space="preserve">  (ku / kyuu)</w:t>
+            </w:r>
+          </w:p>
+        </w:tc>
+        <w:tc>
+          <w:tcPr>
+            <w:tcW w:type="dxa" w:w="4986"/>
+            <w:tcBorders>
+              <w:top w:val="nil"/>
+              <w:left w:val="nil"/>
+              <w:bottom w:val="nil"/>
+              <w:right w:val="nil"/>
+            </w:tcBorders>
+            <w:shd w:val="clear" w:color="auto" w:fill="F0F6FA"/>
+            <w:vAlign w:val="top"/>
+          </w:tcPr>
+          <w:p>
+            <w:pPr>
+              <w:spacing w:before="40" w:after="0"/>
+            </w:pPr>
+            <w:r>
+              <w:rPr>
+                <w:rFonts w:ascii="Calibri" w:hAnsi="Calibri"/>
+                <w:b/>
+                <w:i w:val="0"/>
+                <w:color w:val="007A87"/>
+                <w:sz w:val="20"/>
+              </w:rPr>
+              <w:t xml:space="preserve">10. </w:t>
+            </w:r>
+            <w:r>
+              <w:rPr>
+                <w:rFonts w:ascii="Calibri" w:hAnsi="Calibri"/>
+                <w:b w:val="0"/>
+                <w:i w:val="0"/>
+                <w:color w:val="1A1A2E"/>
+                <w:sz w:val="20"/>
+              </w:rPr>
+              <w:t>10 — Ten</w:t>
+            </w:r>
+          </w:p>
+          <w:p>
+            <w:pPr>
+              <w:spacing w:before="0" w:after="0"/>
+              <w:ind w:left="113"/>
+            </w:pPr>
+            <w:r>
+              <w:rPr>
+                <w:rFonts w:ascii="Calibri" w:hAnsi="Calibri"/>
+                <w:b/>
+                <w:i w:val="0"/>
+                <w:color w:val="007A87"/>
+                <w:sz w:val="18"/>
+              </w:rPr>
+              <w:t xml:space="preserve">Kanji:    </w:t>
+            </w:r>
+            <w:r>
+              <w:rPr>
+                <w:rFonts w:ascii="Calibri" w:hAnsi="Calibri"/>
+                <w:b w:val="0"/>
+                <w:i w:val="0"/>
+                <w:color w:val="1A1A2E"/>
+                <w:sz w:val="18"/>
+              </w:rPr>
+              <w:t>_____________________</w:t>
+            </w:r>
+          </w:p>
+          <w:p>
+            <w:pPr>
+              <w:spacing w:before="0" w:after="0"/>
+              <w:ind w:left="113"/>
+            </w:pPr>
+            <w:r>
+              <w:rPr>
+                <w:rFonts w:ascii="Calibri" w:hAnsi="Calibri"/>
+                <w:b/>
+                <w:i w:val="0"/>
+                <w:color w:val="007A87"/>
+                <w:sz w:val="18"/>
+              </w:rPr>
+              <w:t>Hiragana:</w:t>
+            </w:r>
+            <w:r>
+              <w:rPr>
+                <w:rFonts w:ascii="Calibri" w:hAnsi="Calibri"/>
+                <w:b w:val="0"/>
+                <w:i w:val="0"/>
+                <w:color w:val="1A1A2E"/>
+                <w:sz w:val="18"/>
+              </w:rPr>
+              <w:t>_____________________</w:t>
+            </w:r>
+          </w:p>
+          <w:p>
+            <w:pPr>
+              <w:spacing w:before="0" w:after="0"/>
+              <w:ind w:left="113"/>
+            </w:pPr>
+            <w:r>
+              <w:rPr>
+                <w:rFonts w:ascii="Calibri" w:hAnsi="Calibri"/>
+                <w:b/>
+                <w:i w:val="0"/>
+                <w:color w:val="007A87"/>
+                <w:sz w:val="18"/>
+              </w:rPr>
+              <w:t xml:space="preserve">Romaji:  </w:t>
+            </w:r>
+            <w:r>
+              <w:rPr>
+                <w:rFonts w:ascii="Calibri" w:hAnsi="Calibri"/>
+                <w:b w:val="0"/>
+                <w:i w:val="0"/>
+                <w:color w:val="1A1A2E"/>
+                <w:sz w:val="18"/>
+              </w:rPr>
+              <w:t>_____________________</w:t>
+            </w:r>
+            <w:r>
+              <w:rPr>
+                <w:rFonts w:ascii="Calibri" w:hAnsi="Calibri"/>
+                <w:b w:val="0"/>
+                <w:i/>
+                <w:color w:val="6B7B8D"/>
+                <w:sz w:val="14"/>
+              </w:rPr>
+              <w:t xml:space="preserve">  (juu)</w:t>
+            </w:r>
+          </w:p>
+        </w:tc>
+      </w:tr>
+      <w:tr>
+        <w:tc>
+          <w:tcPr>
+            <w:tcW w:type="dxa" w:w="4986"/>
+            <w:tcBorders>
+              <w:top w:val="nil"/>
+              <w:left w:val="nil"/>
+              <w:bottom w:val="nil"/>
+              <w:right w:val="nil"/>
+            </w:tcBorders>
+            <w:shd w:val="clear" w:color="auto" w:fill="FFFFFF"/>
+            <w:vAlign w:val="top"/>
+          </w:tcPr>
+          <w:p>
+            <w:pPr>
+              <w:spacing w:before="40" w:after="0"/>
+            </w:pPr>
+            <w:r>
+              <w:rPr>
+                <w:rFonts w:ascii="Calibri" w:hAnsi="Calibri"/>
+                <w:b/>
+                <w:i w:val="0"/>
+                <w:color w:val="007A87"/>
+                <w:sz w:val="20"/>
+              </w:rPr>
+              <w:t xml:space="preserve">11. </w:t>
+            </w:r>
+            <w:r>
+              <w:rPr>
+                <w:rFonts w:ascii="Calibri" w:hAnsi="Calibri"/>
+                <w:b w:val="0"/>
+                <w:i w:val="0"/>
+                <w:color w:val="1A1A2E"/>
+                <w:sz w:val="20"/>
+              </w:rPr>
+              <w:t>11 — Eleven</w:t>
+            </w:r>
+          </w:p>
+          <w:p>
+            <w:pPr>
+              <w:spacing w:before="0" w:after="20"/>
+            </w:pPr>
+            <w:r>
+              <w:rPr>
+                <w:rFonts w:ascii="Calibri" w:hAnsi="Calibri"/>
+                <w:b w:val="0"/>
+                <w:i/>
+                <w:color w:val="6B7B8D"/>
+                <w:sz w:val="14"/>
+              </w:rPr>
+              <w:t>★ Ten + one.</w:t>
+            </w:r>
+          </w:p>
+          <w:p>
+            <w:pPr>
+              <w:spacing w:before="0" w:after="0"/>
+              <w:ind w:left="113"/>
+            </w:pPr>
+            <w:r>
+              <w:rPr>
+                <w:rFonts w:ascii="Calibri" w:hAnsi="Calibri"/>
+                <w:b/>
+                <w:i w:val="0"/>
+                <w:color w:val="007A87"/>
+                <w:sz w:val="18"/>
+              </w:rPr>
+              <w:t xml:space="preserve">Kanji:    </w:t>
+            </w:r>
+            <w:r>
+              <w:rPr>
+                <w:rFonts w:ascii="Calibri" w:hAnsi="Calibri"/>
+                <w:b w:val="0"/>
+                <w:i w:val="0"/>
+                <w:color w:val="1A1A2E"/>
+                <w:sz w:val="18"/>
+              </w:rPr>
+              <w:t>_____________________</w:t>
+            </w:r>
+          </w:p>
+          <w:p>
+            <w:pPr>
+              <w:spacing w:before="0" w:after="0"/>
+              <w:ind w:left="113"/>
+            </w:pPr>
+            <w:r>
+              <w:rPr>
+                <w:rFonts w:ascii="Calibri" w:hAnsi="Calibri"/>
+                <w:b/>
+                <w:i w:val="0"/>
+                <w:color w:val="007A87"/>
+                <w:sz w:val="18"/>
+              </w:rPr>
+              <w:t>Hiragana:</w:t>
+            </w:r>
+            <w:r>
+              <w:rPr>
+                <w:rFonts w:ascii="Calibri" w:hAnsi="Calibri"/>
+                <w:b w:val="0"/>
+                <w:i w:val="0"/>
+                <w:color w:val="1A1A2E"/>
+                <w:sz w:val="18"/>
+              </w:rPr>
+              <w:t>_____________________</w:t>
+            </w:r>
+          </w:p>
+          <w:p>
+            <w:pPr>
+              <w:spacing w:before="0" w:after="0"/>
+              <w:ind w:left="113"/>
+            </w:pPr>
+            <w:r>
+              <w:rPr>
+                <w:rFonts w:ascii="Calibri" w:hAnsi="Calibri"/>
+                <w:b/>
+                <w:i w:val="0"/>
+                <w:color w:val="007A87"/>
+                <w:sz w:val="18"/>
+              </w:rPr>
+              <w:t xml:space="preserve">Romaji:  </w:t>
+            </w:r>
+            <w:r>
+              <w:rPr>
+                <w:rFonts w:ascii="Calibri" w:hAnsi="Calibri"/>
+                <w:b w:val="0"/>
+                <w:i w:val="0"/>
+                <w:color w:val="1A1A2E"/>
+                <w:sz w:val="18"/>
+              </w:rPr>
+              <w:t>_____________________</w:t>
+            </w:r>
+            <w:r>
+              <w:rPr>
+                <w:rFonts w:ascii="Calibri" w:hAnsi="Calibri"/>
+                <w:b w:val="0"/>
+                <w:i/>
+                <w:color w:val="6B7B8D"/>
+                <w:sz w:val="14"/>
+              </w:rPr>
+              <w:t xml:space="preserve">  (juu-ichi)</w:t>
+            </w:r>
+          </w:p>
+        </w:tc>
+        <w:tc>
+          <w:tcPr>
+            <w:tcW w:type="dxa" w:w="4986"/>
+            <w:tcBorders>
+              <w:top w:val="nil"/>
+              <w:left w:val="nil"/>
+              <w:bottom w:val="nil"/>
+              <w:right w:val="nil"/>
+            </w:tcBorders>
+            <w:shd w:val="clear" w:color="auto" w:fill="FFFFFF"/>
+            <w:vAlign w:val="top"/>
+          </w:tcPr>
+          <w:p>
+            <w:pPr>
+              <w:spacing w:before="40" w:after="0"/>
+            </w:pPr>
+            <w:r>
+              <w:rPr>
+                <w:rFonts w:ascii="Calibri" w:hAnsi="Calibri"/>
+                <w:b/>
+                <w:i w:val="0"/>
+                <w:color w:val="007A87"/>
+                <w:sz w:val="20"/>
+              </w:rPr>
+              <w:t xml:space="preserve">12. </w:t>
+            </w:r>
+            <w:r>
+              <w:rPr>
+                <w:rFonts w:ascii="Calibri" w:hAnsi="Calibri"/>
+                <w:b w:val="0"/>
+                <w:i w:val="0"/>
+                <w:color w:val="1A1A2E"/>
+                <w:sz w:val="20"/>
+              </w:rPr>
+              <w:t>12 — Twelve</w:t>
+            </w:r>
+          </w:p>
+          <w:p>
+            <w:pPr>
+              <w:spacing w:before="0" w:after="20"/>
+            </w:pPr>
+            <w:r>
+              <w:rPr>
+                <w:rFonts w:ascii="Calibri" w:hAnsi="Calibri"/>
+                <w:b w:val="0"/>
+                <w:i/>
+                <w:color w:val="6B7B8D"/>
+                <w:sz w:val="14"/>
+              </w:rPr>
+              <w:t>★ Ten + two.</w:t>
+            </w:r>
+          </w:p>
+          <w:p>
+            <w:pPr>
+              <w:spacing w:before="0" w:after="0"/>
+              <w:ind w:left="113"/>
+            </w:pPr>
+            <w:r>
+              <w:rPr>
+                <w:rFonts w:ascii="Calibri" w:hAnsi="Calibri"/>
+                <w:b/>
+                <w:i w:val="0"/>
+                <w:color w:val="007A87"/>
+                <w:sz w:val="18"/>
+              </w:rPr>
+              <w:t xml:space="preserve">Kanji:    </w:t>
+            </w:r>
+            <w:r>
+              <w:rPr>
+                <w:rFonts w:ascii="Calibri" w:hAnsi="Calibri"/>
+                <w:b w:val="0"/>
+                <w:i w:val="0"/>
+                <w:color w:val="1A1A2E"/>
+                <w:sz w:val="18"/>
+              </w:rPr>
+              <w:t>_____________________</w:t>
+            </w:r>
+          </w:p>
+          <w:p>
+            <w:pPr>
+              <w:spacing w:before="0" w:after="0"/>
+              <w:ind w:left="113"/>
+            </w:pPr>
+            <w:r>
+              <w:rPr>
+                <w:rFonts w:ascii="Calibri" w:hAnsi="Calibri"/>
+                <w:b/>
+                <w:i w:val="0"/>
+                <w:color w:val="007A87"/>
+                <w:sz w:val="18"/>
+              </w:rPr>
+              <w:t>Hiragana:</w:t>
+            </w:r>
+            <w:r>
+              <w:rPr>
+                <w:rFonts w:ascii="Calibri" w:hAnsi="Calibri"/>
+                <w:b w:val="0"/>
+                <w:i w:val="0"/>
+                <w:color w:val="1A1A2E"/>
+                <w:sz w:val="18"/>
+              </w:rPr>
+              <w:t>_____________________</w:t>
+            </w:r>
+          </w:p>
+          <w:p>
+            <w:pPr>
+              <w:spacing w:before="0" w:after="0"/>
+              <w:ind w:left="113"/>
+            </w:pPr>
+            <w:r>
+              <w:rPr>
+                <w:rFonts w:ascii="Calibri" w:hAnsi="Calibri"/>
+                <w:b/>
+                <w:i w:val="0"/>
+                <w:color w:val="007A87"/>
+                <w:sz w:val="18"/>
+              </w:rPr>
+              <w:t xml:space="preserve">Romaji:  </w:t>
+            </w:r>
+            <w:r>
+              <w:rPr>
+                <w:rFonts w:ascii="Calibri" w:hAnsi="Calibri"/>
+                <w:b w:val="0"/>
+                <w:i w:val="0"/>
+                <w:color w:val="1A1A2E"/>
+                <w:sz w:val="18"/>
+              </w:rPr>
+              <w:t>_____________________</w:t>
+            </w:r>
+            <w:r>
+              <w:rPr>
+                <w:rFonts w:ascii="Calibri" w:hAnsi="Calibri"/>
+                <w:b w:val="0"/>
+                <w:i/>
+                <w:color w:val="6B7B8D"/>
+                <w:sz w:val="14"/>
+              </w:rPr>
+              <w:t xml:space="preserve">  (juu-ni)</w:t>
+            </w:r>
+          </w:p>
+        </w:tc>
+      </w:tr>
+      <w:tr>
+        <w:tc>
+          <w:tcPr>
+            <w:tcW w:type="dxa" w:w="4986"/>
+            <w:tcBorders>
+              <w:top w:val="nil"/>
+              <w:left w:val="nil"/>
+              <w:bottom w:val="nil"/>
+              <w:right w:val="nil"/>
+            </w:tcBorders>
+            <w:shd w:val="clear" w:color="auto" w:fill="F0F6FA"/>
+            <w:vAlign w:val="top"/>
+          </w:tcPr>
+          <w:p>
+            <w:pPr>
+              <w:spacing w:before="40" w:after="0"/>
+            </w:pPr>
+            <w:r>
+              <w:rPr>
+                <w:rFonts w:ascii="Calibri" w:hAnsi="Calibri"/>
+                <w:b/>
+                <w:i w:val="0"/>
+                <w:color w:val="007A87"/>
+                <w:sz w:val="20"/>
+              </w:rPr>
+              <w:t xml:space="preserve">13. </w:t>
+            </w:r>
+            <w:r>
+              <w:rPr>
+                <w:rFonts w:ascii="Calibri" w:hAnsi="Calibri"/>
+                <w:b w:val="0"/>
+                <w:i w:val="0"/>
+                <w:color w:val="1A1A2E"/>
+                <w:sz w:val="20"/>
+              </w:rPr>
+              <w:t>20 — Twenty</w:t>
+            </w:r>
+          </w:p>
+          <w:p>
+            <w:pPr>
+              <w:spacing w:before="0" w:after="20"/>
+            </w:pPr>
+            <w:r>
+              <w:rPr>
+                <w:rFonts w:ascii="Calibri" w:hAnsi="Calibri"/>
+                <w:b w:val="0"/>
+                <w:i/>
+                <w:color w:val="6B7B8D"/>
+                <w:sz w:val="14"/>
+              </w:rPr>
+              <w:t>★ Two × ten.</w:t>
+            </w:r>
+          </w:p>
+          <w:p>
+            <w:pPr>
+              <w:spacing w:before="0" w:after="0"/>
+              <w:ind w:left="113"/>
+            </w:pPr>
+            <w:r>
+              <w:rPr>
+                <w:rFonts w:ascii="Calibri" w:hAnsi="Calibri"/>
+                <w:b/>
+                <w:i w:val="0"/>
+                <w:color w:val="007A87"/>
+                <w:sz w:val="18"/>
+              </w:rPr>
+              <w:t xml:space="preserve">Kanji:    </w:t>
+            </w:r>
+            <w:r>
+              <w:rPr>
+                <w:rFonts w:ascii="Calibri" w:hAnsi="Calibri"/>
+                <w:b w:val="0"/>
+                <w:i w:val="0"/>
+                <w:color w:val="1A1A2E"/>
+                <w:sz w:val="18"/>
+              </w:rPr>
+              <w:t>_____________________</w:t>
+            </w:r>
+          </w:p>
+          <w:p>
+            <w:pPr>
+              <w:spacing w:before="0" w:after="0"/>
+              <w:ind w:left="113"/>
+            </w:pPr>
+            <w:r>
+              <w:rPr>
+                <w:rFonts w:ascii="Calibri" w:hAnsi="Calibri"/>
+                <w:b/>
+                <w:i w:val="0"/>
+                <w:color w:val="007A87"/>
+                <w:sz w:val="18"/>
+              </w:rPr>
+              <w:t>Hiragana:</w:t>
+            </w:r>
+            <w:r>
+              <w:rPr>
+                <w:rFonts w:ascii="Calibri" w:hAnsi="Calibri"/>
+                <w:b w:val="0"/>
+                <w:i w:val="0"/>
+                <w:color w:val="1A1A2E"/>
+                <w:sz w:val="18"/>
+              </w:rPr>
+              <w:t>_____________________</w:t>
+            </w:r>
+          </w:p>
+          <w:p>
+            <w:pPr>
+              <w:spacing w:before="0" w:after="0"/>
+              <w:ind w:left="113"/>
+            </w:pPr>
+            <w:r>
+              <w:rPr>
+                <w:rFonts w:ascii="Calibri" w:hAnsi="Calibri"/>
+                <w:b/>
+                <w:i w:val="0"/>
+                <w:color w:val="007A87"/>
+                <w:sz w:val="18"/>
+              </w:rPr>
+              <w:t xml:space="preserve">Romaji:  </w:t>
+            </w:r>
+            <w:r>
+              <w:rPr>
+                <w:rFonts w:ascii="Calibri" w:hAnsi="Calibri"/>
+                <w:b w:val="0"/>
+                <w:i w:val="0"/>
+                <w:color w:val="1A1A2E"/>
+                <w:sz w:val="18"/>
+              </w:rPr>
+              <w:t>_____________________</w:t>
+            </w:r>
+            <w:r>
+              <w:rPr>
+                <w:rFonts w:ascii="Calibri" w:hAnsi="Calibri"/>
+                <w:b w:val="0"/>
+                <w:i/>
+                <w:color w:val="6B7B8D"/>
+                <w:sz w:val="14"/>
+              </w:rPr>
+              <w:t xml:space="preserve">  (ni-juu)</w:t>
+            </w:r>
+          </w:p>
+        </w:tc>
+        <w:tc>
+          <w:tcPr>
+            <w:tcW w:type="dxa" w:w="4986"/>
+            <w:tcBorders>
+              <w:top w:val="nil"/>
+              <w:left w:val="nil"/>
+              <w:bottom w:val="nil"/>
+              <w:right w:val="nil"/>
+            </w:tcBorders>
+            <w:shd w:val="clear" w:color="auto" w:fill="F0F6FA"/>
+            <w:vAlign w:val="top"/>
+          </w:tcPr>
+          <w:p>
+            <w:pPr>
+              <w:spacing w:before="40" w:after="0"/>
+            </w:pPr>
+            <w:r>
+              <w:rPr>
+                <w:rFonts w:ascii="Calibri" w:hAnsi="Calibri"/>
+                <w:b/>
+                <w:i w:val="0"/>
+                <w:color w:val="007A87"/>
+                <w:sz w:val="20"/>
+              </w:rPr>
+              <w:t xml:space="preserve">14. </w:t>
+            </w:r>
+            <w:r>
+              <w:rPr>
+                <w:rFonts w:ascii="Calibri" w:hAnsi="Calibri"/>
+                <w:b w:val="0"/>
+                <w:i w:val="0"/>
+                <w:color w:val="1A1A2E"/>
+                <w:sz w:val="20"/>
+              </w:rPr>
+              <w:t>30 — Thirty</w:t>
+            </w:r>
+          </w:p>
+          <w:p>
+            <w:pPr>
+              <w:spacing w:before="0" w:after="20"/>
+            </w:pPr>
+            <w:r>
+              <w:rPr>
+                <w:rFonts w:ascii="Calibri" w:hAnsi="Calibri"/>
+                <w:b w:val="0"/>
+                <w:i/>
+                <w:color w:val="6B7B8D"/>
+                <w:sz w:val="14"/>
+              </w:rPr>
+              <w:t>★ Three × ten.</w:t>
+            </w:r>
+          </w:p>
+          <w:p>
+            <w:pPr>
+              <w:spacing w:before="0" w:after="0"/>
+              <w:ind w:left="113"/>
+            </w:pPr>
+            <w:r>
+              <w:rPr>
+                <w:rFonts w:ascii="Calibri" w:hAnsi="Calibri"/>
+                <w:b/>
+                <w:i w:val="0"/>
+                <w:color w:val="007A87"/>
+                <w:sz w:val="18"/>
+              </w:rPr>
+              <w:t xml:space="preserve">Kanji:    </w:t>
+            </w:r>
+            <w:r>
+              <w:rPr>
+                <w:rFonts w:ascii="Calibri" w:hAnsi="Calibri"/>
+                <w:b w:val="0"/>
+                <w:i w:val="0"/>
+                <w:color w:val="1A1A2E"/>
+                <w:sz w:val="18"/>
+              </w:rPr>
+              <w:t>_____________________</w:t>
+            </w:r>
+          </w:p>
+          <w:p>
+            <w:pPr>
+              <w:spacing w:before="0" w:after="0"/>
+              <w:ind w:left="113"/>
+            </w:pPr>
+            <w:r>
+              <w:rPr>
+                <w:rFonts w:ascii="Calibri" w:hAnsi="Calibri"/>
+                <w:b/>
+                <w:i w:val="0"/>
+                <w:color w:val="007A87"/>
+                <w:sz w:val="18"/>
+              </w:rPr>
+              <w:t>Hiragana:</w:t>
+            </w:r>
+            <w:r>
+              <w:rPr>
+                <w:rFonts w:ascii="Calibri" w:hAnsi="Calibri"/>
+                <w:b w:val="0"/>
+                <w:i w:val="0"/>
+                <w:color w:val="1A1A2E"/>
+                <w:sz w:val="18"/>
+              </w:rPr>
+              <w:t>_____________________</w:t>
+            </w:r>
+          </w:p>
+          <w:p>
+            <w:pPr>
+              <w:spacing w:before="0" w:after="0"/>
+              <w:ind w:left="113"/>
+            </w:pPr>
+            <w:r>
+              <w:rPr>
+                <w:rFonts w:ascii="Calibri" w:hAnsi="Calibri"/>
+                <w:b/>
+                <w:i w:val="0"/>
+                <w:color w:val="007A87"/>
+                <w:sz w:val="18"/>
+              </w:rPr>
+              <w:t xml:space="preserve">Romaji:  </w:t>
+            </w:r>
+            <w:r>
+              <w:rPr>
+                <w:rFonts w:ascii="Calibri" w:hAnsi="Calibri"/>
+                <w:b w:val="0"/>
+                <w:i w:val="0"/>
+                <w:color w:val="1A1A2E"/>
+                <w:sz w:val="18"/>
+              </w:rPr>
+              <w:t>_____________________</w:t>
+            </w:r>
+            <w:r>
+              <w:rPr>
+                <w:rFonts w:ascii="Calibri" w:hAnsi="Calibri"/>
+                <w:b w:val="0"/>
+                <w:i/>
+                <w:color w:val="6B7B8D"/>
+                <w:sz w:val="14"/>
+              </w:rPr>
+              <w:t xml:space="preserve">  (san-juu)</w:t>
+            </w:r>
+          </w:p>
+        </w:tc>
+      </w:tr>
+      <w:tr>
+        <w:tc>
+          <w:tcPr>
+            <w:tcW w:type="dxa" w:w="4986"/>
+            <w:tcBorders>
+              <w:top w:val="nil"/>
+              <w:left w:val="nil"/>
+              <w:bottom w:val="nil"/>
+              <w:right w:val="nil"/>
+            </w:tcBorders>
+            <w:shd w:val="clear" w:color="auto" w:fill="FFFFFF"/>
+            <w:vAlign w:val="top"/>
+          </w:tcPr>
+          <w:p>
+            <w:pPr>
+              <w:spacing w:before="40" w:after="0"/>
+            </w:pPr>
+            <w:r>
+              <w:rPr>
+                <w:rFonts w:ascii="Calibri" w:hAnsi="Calibri"/>
+                <w:b/>
+                <w:i w:val="0"/>
+                <w:color w:val="007A87"/>
+                <w:sz w:val="20"/>
+              </w:rPr>
+              <w:t xml:space="preserve">15. </w:t>
+            </w:r>
+            <w:r>
+              <w:rPr>
+                <w:rFonts w:ascii="Calibri" w:hAnsi="Calibri"/>
+                <w:b w:val="0"/>
+                <w:i w:val="0"/>
+                <w:color w:val="1A1A2E"/>
+                <w:sz w:val="20"/>
+              </w:rPr>
+              <w:t>100 — One hundred</w:t>
+            </w:r>
+          </w:p>
+          <w:p>
+            <w:pPr>
+              <w:spacing w:before="0" w:after="20"/>
+            </w:pPr>
+            <w:r>
+              <w:rPr>
+                <w:rFonts w:ascii="Calibri" w:hAnsi="Calibri"/>
+                <w:b w:val="0"/>
+                <w:i/>
+                <w:color w:val="6B7B8D"/>
+                <w:sz w:val="14"/>
+              </w:rPr>
+              <w:t>★ New counter word.</w:t>
+            </w:r>
+          </w:p>
+          <w:p>
+            <w:pPr>
+              <w:spacing w:before="0" w:after="0"/>
+              <w:ind w:left="113"/>
+            </w:pPr>
+            <w:r>
+              <w:rPr>
+                <w:rFonts w:ascii="Calibri" w:hAnsi="Calibri"/>
+                <w:b/>
+                <w:i w:val="0"/>
+                <w:color w:val="007A87"/>
+                <w:sz w:val="18"/>
+              </w:rPr>
+              <w:t xml:space="preserve">Kanji:    </w:t>
+            </w:r>
+            <w:r>
+              <w:rPr>
+                <w:rFonts w:ascii="Calibri" w:hAnsi="Calibri"/>
+                <w:b w:val="0"/>
+                <w:i w:val="0"/>
+                <w:color w:val="1A1A2E"/>
+                <w:sz w:val="18"/>
+              </w:rPr>
+              <w:t>_____________________</w:t>
+            </w:r>
+          </w:p>
+          <w:p>
+            <w:pPr>
+              <w:spacing w:before="0" w:after="0"/>
+              <w:ind w:left="113"/>
+            </w:pPr>
+            <w:r>
+              <w:rPr>
+                <w:rFonts w:ascii="Calibri" w:hAnsi="Calibri"/>
+                <w:b/>
+                <w:i w:val="0"/>
+                <w:color w:val="007A87"/>
+                <w:sz w:val="18"/>
+              </w:rPr>
+              <w:t>Hiragana:</w:t>
+            </w:r>
+            <w:r>
+              <w:rPr>
+                <w:rFonts w:ascii="Calibri" w:hAnsi="Calibri"/>
+                <w:b w:val="0"/>
+                <w:i w:val="0"/>
+                <w:color w:val="1A1A2E"/>
+                <w:sz w:val="18"/>
+              </w:rPr>
+              <w:t>_____________________</w:t>
+            </w:r>
+          </w:p>
+          <w:p>
+            <w:pPr>
+              <w:spacing w:before="0" w:after="0"/>
+              <w:ind w:left="113"/>
+            </w:pPr>
+            <w:r>
+              <w:rPr>
+                <w:rFonts w:ascii="Calibri" w:hAnsi="Calibri"/>
+                <w:b/>
+                <w:i w:val="0"/>
+                <w:color w:val="007A87"/>
+                <w:sz w:val="18"/>
+              </w:rPr>
+              <w:t xml:space="preserve">Romaji:  </w:t>
+            </w:r>
+            <w:r>
+              <w:rPr>
+                <w:rFonts w:ascii="Calibri" w:hAnsi="Calibri"/>
+                <w:b w:val="0"/>
+                <w:i w:val="0"/>
+                <w:color w:val="1A1A2E"/>
+                <w:sz w:val="18"/>
+              </w:rPr>
+              <w:t>_____________________</w:t>
+            </w:r>
+            <w:r>
+              <w:rPr>
+                <w:rFonts w:ascii="Calibri" w:hAnsi="Calibri"/>
+                <w:b w:val="0"/>
+                <w:i/>
+                <w:color w:val="6B7B8D"/>
+                <w:sz w:val="14"/>
+              </w:rPr>
+              <w:t xml:space="preserve">  (hyaku)</w:t>
+            </w:r>
+          </w:p>
+        </w:tc>
+        <w:tc>
+          <w:tcPr>
+            <w:tcW w:type="dxa" w:w="4986"/>
+            <w:tcBorders>
+              <w:top w:val="nil"/>
+              <w:left w:val="nil"/>
+              <w:bottom w:val="nil"/>
+              <w:right w:val="nil"/>
+            </w:tcBorders>
+            <w:shd w:val="clear" w:color="auto" w:fill="FFFFFF"/>
+            <w:vAlign w:val="top"/>
+          </w:tcPr>
+          <w:p>
+            <w:pPr>
+              <w:spacing w:before="40" w:after="0"/>
+            </w:pPr>
+            <w:r>
+              <w:rPr>
+                <w:rFonts w:ascii="Calibri" w:hAnsi="Calibri"/>
+                <w:b/>
+                <w:i w:val="0"/>
+                <w:color w:val="007A87"/>
+                <w:sz w:val="20"/>
+              </w:rPr>
+              <w:t xml:space="preserve">16. </w:t>
+            </w:r>
+            <w:r>
+              <w:rPr>
+                <w:rFonts w:ascii="Calibri" w:hAnsi="Calibri"/>
+                <w:b w:val="0"/>
+                <w:i w:val="0"/>
+                <w:color w:val="1A1A2E"/>
+                <w:sz w:val="20"/>
+              </w:rPr>
+              <w:t>1000 — One thousand</w:t>
+            </w:r>
+          </w:p>
+          <w:p>
+            <w:pPr>
+              <w:spacing w:before="0" w:after="20"/>
+            </w:pPr>
+            <w:r>
+              <w:rPr>
+                <w:rFonts w:ascii="Calibri" w:hAnsi="Calibri"/>
+                <w:b w:val="0"/>
+                <w:i/>
+                <w:color w:val="6B7B8D"/>
+                <w:sz w:val="14"/>
+              </w:rPr>
+              <w:t>★ New counter word.</w:t>
+            </w:r>
+          </w:p>
+          <w:p>
+            <w:pPr>
+              <w:spacing w:before="0" w:after="0"/>
+              <w:ind w:left="113"/>
+            </w:pPr>
+            <w:r>
+              <w:rPr>
+                <w:rFonts w:ascii="Calibri" w:hAnsi="Calibri"/>
+                <w:b/>
+                <w:i w:val="0"/>
+                <w:color w:val="007A87"/>
+                <w:sz w:val="18"/>
+              </w:rPr>
+              <w:t xml:space="preserve">Kanji:    </w:t>
+            </w:r>
+            <w:r>
+              <w:rPr>
+                <w:rFonts w:ascii="Calibri" w:hAnsi="Calibri"/>
+                <w:b w:val="0"/>
+                <w:i w:val="0"/>
+                <w:color w:val="1A1A2E"/>
+                <w:sz w:val="18"/>
+              </w:rPr>
+              <w:t>_____________________</w:t>
+            </w:r>
+          </w:p>
+          <w:p>
+            <w:pPr>
+              <w:spacing w:before="0" w:after="0"/>
+              <w:ind w:left="113"/>
+            </w:pPr>
+            <w:r>
+              <w:rPr>
+                <w:rFonts w:ascii="Calibri" w:hAnsi="Calibri"/>
+                <w:b/>
+                <w:i w:val="0"/>
+                <w:color w:val="007A87"/>
+                <w:sz w:val="18"/>
+              </w:rPr>
+              <w:t>Hiragana:</w:t>
+            </w:r>
+            <w:r>
+              <w:rPr>
+                <w:rFonts w:ascii="Calibri" w:hAnsi="Calibri"/>
+                <w:b w:val="0"/>
+                <w:i w:val="0"/>
+                <w:color w:val="1A1A2E"/>
+                <w:sz w:val="18"/>
+              </w:rPr>
+              <w:t>_____________________</w:t>
+            </w:r>
+          </w:p>
+          <w:p>
+            <w:pPr>
+              <w:spacing w:before="0" w:after="0"/>
+              <w:ind w:left="113"/>
+            </w:pPr>
+            <w:r>
+              <w:rPr>
+                <w:rFonts w:ascii="Calibri" w:hAnsi="Calibri"/>
+                <w:b/>
+                <w:i w:val="0"/>
+                <w:color w:val="007A87"/>
+                <w:sz w:val="18"/>
+              </w:rPr>
+              <w:t xml:space="preserve">Romaji:  </w:t>
+            </w:r>
+            <w:r>
+              <w:rPr>
+                <w:rFonts w:ascii="Calibri" w:hAnsi="Calibri"/>
+                <w:b w:val="0"/>
+                <w:i w:val="0"/>
+                <w:color w:val="1A1A2E"/>
+                <w:sz w:val="18"/>
+              </w:rPr>
+              <w:t>_____________________</w:t>
+            </w:r>
+            <w:r>
+              <w:rPr>
+                <w:rFonts w:ascii="Calibri" w:hAnsi="Calibri"/>
+                <w:b w:val="0"/>
+                <w:i/>
+                <w:color w:val="6B7B8D"/>
+                <w:sz w:val="14"/>
+              </w:rPr>
+              <w:t xml:space="preserve">  (sen)</w:t>
+            </w:r>
+          </w:p>
+        </w:tc>
+      </w:tr>
+    </w:tbl>
     <w:p>
       <w:pPr>
         <w:spacing w:before="0" w:after="0"/>

</xml_diff>

<commit_message>
Continue redesigning Japanese numbers worksheet layout (#4)
* Redesign numbers matching worksheet layout

Co-authored-by: sin-boo <sin-boo@users.noreply.github.com>

* Lay out Part 1 numbers in two columns

Co-authored-by: sin-boo <sin-boo@users.noreply.github.com>

---------

Co-authored-by: Cursor Agent <cursoragent@cursor.com>
Co-authored-by: sin-boo <sin-boo@users.noreply.github.com>
</commit_message>
<xml_diff>
--- a/japanese_docs/japanese_numbers_worksheet.docx
+++ b/japanese_docs/japanese_numbers_worksheet.docx
@@ -409,1904 +409,2184 @@
         <w:t>Part 1 — Write the Numbers</w:t>
       </w:r>
     </w:p>
-    <w:p>
-      <w:pPr>
-        <w:spacing w:before="60" w:after="0"/>
-      </w:pPr>
-      <w:r>
-        <w:rPr>
-          <w:rFonts w:ascii="Calibri" w:hAnsi="Calibri"/>
-          <w:b/>
-          <w:i w:val="0"/>
-          <w:color w:val="007A87"/>
-          <w:sz w:val="20"/>
-        </w:rPr>
-        <w:t xml:space="preserve"> 1.  </w:t>
-      </w:r>
-      <w:r>
-        <w:rPr>
-          <w:rFonts w:ascii="Calibri" w:hAnsi="Calibri"/>
-          <w:b w:val="0"/>
-          <w:i w:val="0"/>
-          <w:color w:val="1A1A2E"/>
-          <w:sz w:val="20"/>
-        </w:rPr>
-        <w:t>1  — One</w:t>
-      </w:r>
-    </w:p>
-    <w:p>
-      <w:pPr>
-        <w:spacing w:before="0" w:after="0"/>
-        <w:ind w:left="567"/>
-      </w:pPr>
-      <w:r>
-        <w:rPr>
-          <w:rFonts w:ascii="Calibri" w:hAnsi="Calibri"/>
-          <w:b/>
-          <w:i w:val="0"/>
-          <w:color w:val="007A87"/>
-          <w:sz w:val="18"/>
-        </w:rPr>
-        <w:t xml:space="preserve">Kanji:    </w:t>
-      </w:r>
-      <w:r>
-        <w:rPr>
-          <w:rFonts w:ascii="Calibri" w:hAnsi="Calibri"/>
-          <w:b w:val="0"/>
-          <w:i w:val="0"/>
-          <w:color w:val="1A1A2E"/>
-          <w:sz w:val="18"/>
-        </w:rPr>
-        <w:t>___________________________________</w:t>
-      </w:r>
-    </w:p>
-    <w:p>
-      <w:pPr>
-        <w:spacing w:before="0" w:after="0"/>
-        <w:ind w:left="567"/>
-      </w:pPr>
-      <w:r>
-        <w:rPr>
-          <w:rFonts w:ascii="Calibri" w:hAnsi="Calibri"/>
-          <w:b/>
-          <w:i w:val="0"/>
-          <w:color w:val="007A87"/>
-          <w:sz w:val="18"/>
-        </w:rPr>
-        <w:t>Hiragana:</w:t>
-      </w:r>
-      <w:r>
-        <w:rPr>
-          <w:rFonts w:ascii="Calibri" w:hAnsi="Calibri"/>
-          <w:b w:val="0"/>
-          <w:i w:val="0"/>
-          <w:color w:val="1A1A2E"/>
-          <w:sz w:val="18"/>
-        </w:rPr>
-        <w:t>___________________________________</w:t>
-      </w:r>
-    </w:p>
-    <w:p>
-      <w:pPr>
-        <w:spacing w:before="0" w:after="0"/>
-        <w:ind w:left="567"/>
-      </w:pPr>
-      <w:r>
-        <w:rPr>
-          <w:rFonts w:ascii="Calibri" w:hAnsi="Calibri"/>
-          <w:b/>
-          <w:i w:val="0"/>
-          <w:color w:val="007A87"/>
-          <w:sz w:val="18"/>
-        </w:rPr>
-        <w:t xml:space="preserve">Romaji:  </w:t>
-      </w:r>
-      <w:r>
-        <w:rPr>
-          <w:rFonts w:ascii="Calibri" w:hAnsi="Calibri"/>
-          <w:b w:val="0"/>
-          <w:i w:val="0"/>
-          <w:color w:val="1A1A2E"/>
-          <w:sz w:val="18"/>
-        </w:rPr>
-        <w:t>___________________________________</w:t>
-      </w:r>
-      <w:r>
-        <w:rPr>
-          <w:rFonts w:ascii="Calibri" w:hAnsi="Calibri"/>
-          <w:b w:val="0"/>
-          <w:i/>
-          <w:color w:val="6B7B8D"/>
-          <w:sz w:val="16"/>
-        </w:rPr>
-        <w:t xml:space="preserve">  (ichi)</w:t>
-      </w:r>
-    </w:p>
-    <w:p>
-      <w:pPr>
-        <w:spacing w:before="60" w:after="0"/>
-      </w:pPr>
-      <w:r>
-        <w:rPr>
-          <w:rFonts w:ascii="Calibri" w:hAnsi="Calibri"/>
-          <w:b/>
-          <w:i w:val="0"/>
-          <w:color w:val="007A87"/>
-          <w:sz w:val="20"/>
-        </w:rPr>
-        <w:t xml:space="preserve"> 2.  </w:t>
-      </w:r>
-      <w:r>
-        <w:rPr>
-          <w:rFonts w:ascii="Calibri" w:hAnsi="Calibri"/>
-          <w:b w:val="0"/>
-          <w:i w:val="0"/>
-          <w:color w:val="1A1A2E"/>
-          <w:sz w:val="20"/>
-        </w:rPr>
-        <w:t>2  — Two</w:t>
-      </w:r>
-    </w:p>
-    <w:p>
-      <w:pPr>
-        <w:spacing w:before="0" w:after="0"/>
-        <w:ind w:left="567"/>
-      </w:pPr>
-      <w:r>
-        <w:rPr>
-          <w:rFonts w:ascii="Calibri" w:hAnsi="Calibri"/>
-          <w:b/>
-          <w:i w:val="0"/>
-          <w:color w:val="007A87"/>
-          <w:sz w:val="18"/>
-        </w:rPr>
-        <w:t xml:space="preserve">Kanji:    </w:t>
-      </w:r>
-      <w:r>
-        <w:rPr>
-          <w:rFonts w:ascii="Calibri" w:hAnsi="Calibri"/>
-          <w:b w:val="0"/>
-          <w:i w:val="0"/>
-          <w:color w:val="1A1A2E"/>
-          <w:sz w:val="18"/>
-        </w:rPr>
-        <w:t>___________________________________</w:t>
-      </w:r>
-    </w:p>
-    <w:p>
-      <w:pPr>
-        <w:spacing w:before="0" w:after="0"/>
-        <w:ind w:left="567"/>
-      </w:pPr>
-      <w:r>
-        <w:rPr>
-          <w:rFonts w:ascii="Calibri" w:hAnsi="Calibri"/>
-          <w:b/>
-          <w:i w:val="0"/>
-          <w:color w:val="007A87"/>
-          <w:sz w:val="18"/>
-        </w:rPr>
-        <w:t>Hiragana:</w:t>
-      </w:r>
-      <w:r>
-        <w:rPr>
-          <w:rFonts w:ascii="Calibri" w:hAnsi="Calibri"/>
-          <w:b w:val="0"/>
-          <w:i w:val="0"/>
-          <w:color w:val="1A1A2E"/>
-          <w:sz w:val="18"/>
-        </w:rPr>
-        <w:t>___________________________________</w:t>
-      </w:r>
-    </w:p>
-    <w:p>
-      <w:pPr>
-        <w:spacing w:before="0" w:after="0"/>
-        <w:ind w:left="567"/>
-      </w:pPr>
-      <w:r>
-        <w:rPr>
-          <w:rFonts w:ascii="Calibri" w:hAnsi="Calibri"/>
-          <w:b/>
-          <w:i w:val="0"/>
-          <w:color w:val="007A87"/>
-          <w:sz w:val="18"/>
-        </w:rPr>
-        <w:t xml:space="preserve">Romaji:  </w:t>
-      </w:r>
-      <w:r>
-        <w:rPr>
-          <w:rFonts w:ascii="Calibri" w:hAnsi="Calibri"/>
-          <w:b w:val="0"/>
-          <w:i w:val="0"/>
-          <w:color w:val="1A1A2E"/>
-          <w:sz w:val="18"/>
-        </w:rPr>
-        <w:t>___________________________________</w:t>
-      </w:r>
-      <w:r>
-        <w:rPr>
-          <w:rFonts w:ascii="Calibri" w:hAnsi="Calibri"/>
-          <w:b w:val="0"/>
-          <w:i/>
-          <w:color w:val="6B7B8D"/>
-          <w:sz w:val="16"/>
-        </w:rPr>
-        <w:t xml:space="preserve">  (ni)</w:t>
-      </w:r>
-    </w:p>
-    <w:p>
-      <w:pPr>
-        <w:spacing w:before="60" w:after="0"/>
-      </w:pPr>
-      <w:r>
-        <w:rPr>
-          <w:rFonts w:ascii="Calibri" w:hAnsi="Calibri"/>
-          <w:b/>
-          <w:i w:val="0"/>
-          <w:color w:val="007A87"/>
-          <w:sz w:val="20"/>
-        </w:rPr>
-        <w:t xml:space="preserve"> 3.  </w:t>
-      </w:r>
-      <w:r>
-        <w:rPr>
-          <w:rFonts w:ascii="Calibri" w:hAnsi="Calibri"/>
-          <w:b w:val="0"/>
-          <w:i w:val="0"/>
-          <w:color w:val="1A1A2E"/>
-          <w:sz w:val="20"/>
-        </w:rPr>
-        <w:t>3  — Three</w:t>
-      </w:r>
-    </w:p>
-    <w:p>
-      <w:pPr>
-        <w:spacing w:before="0" w:after="0"/>
-        <w:ind w:left="567"/>
-      </w:pPr>
-      <w:r>
-        <w:rPr>
-          <w:rFonts w:ascii="Calibri" w:hAnsi="Calibri"/>
-          <w:b/>
-          <w:i w:val="0"/>
-          <w:color w:val="007A87"/>
-          <w:sz w:val="18"/>
-        </w:rPr>
-        <w:t xml:space="preserve">Kanji:    </w:t>
-      </w:r>
-      <w:r>
-        <w:rPr>
-          <w:rFonts w:ascii="Calibri" w:hAnsi="Calibri"/>
-          <w:b w:val="0"/>
-          <w:i w:val="0"/>
-          <w:color w:val="1A1A2E"/>
-          <w:sz w:val="18"/>
-        </w:rPr>
-        <w:t>___________________________________</w:t>
-      </w:r>
-    </w:p>
-    <w:p>
-      <w:pPr>
-        <w:spacing w:before="0" w:after="0"/>
-        <w:ind w:left="567"/>
-      </w:pPr>
-      <w:r>
-        <w:rPr>
-          <w:rFonts w:ascii="Calibri" w:hAnsi="Calibri"/>
-          <w:b/>
-          <w:i w:val="0"/>
-          <w:color w:val="007A87"/>
-          <w:sz w:val="18"/>
-        </w:rPr>
-        <w:t>Hiragana:</w:t>
-      </w:r>
-      <w:r>
-        <w:rPr>
-          <w:rFonts w:ascii="Calibri" w:hAnsi="Calibri"/>
-          <w:b w:val="0"/>
-          <w:i w:val="0"/>
-          <w:color w:val="1A1A2E"/>
-          <w:sz w:val="18"/>
-        </w:rPr>
-        <w:t>___________________________________</w:t>
-      </w:r>
-    </w:p>
-    <w:p>
-      <w:pPr>
-        <w:spacing w:before="0" w:after="0"/>
-        <w:ind w:left="567"/>
-      </w:pPr>
-      <w:r>
-        <w:rPr>
-          <w:rFonts w:ascii="Calibri" w:hAnsi="Calibri"/>
-          <w:b/>
-          <w:i w:val="0"/>
-          <w:color w:val="007A87"/>
-          <w:sz w:val="18"/>
-        </w:rPr>
-        <w:t xml:space="preserve">Romaji:  </w:t>
-      </w:r>
-      <w:r>
-        <w:rPr>
-          <w:rFonts w:ascii="Calibri" w:hAnsi="Calibri"/>
-          <w:b w:val="0"/>
-          <w:i w:val="0"/>
-          <w:color w:val="1A1A2E"/>
-          <w:sz w:val="18"/>
-        </w:rPr>
-        <w:t>___________________________________</w:t>
-      </w:r>
-      <w:r>
-        <w:rPr>
-          <w:rFonts w:ascii="Calibri" w:hAnsi="Calibri"/>
-          <w:b w:val="0"/>
-          <w:i/>
-          <w:color w:val="6B7B8D"/>
-          <w:sz w:val="16"/>
-        </w:rPr>
-        <w:t xml:space="preserve">  (san)</w:t>
-      </w:r>
-    </w:p>
-    <w:p>
-      <w:pPr>
-        <w:spacing w:before="60" w:after="0"/>
-      </w:pPr>
-      <w:r>
-        <w:rPr>
-          <w:rFonts w:ascii="Calibri" w:hAnsi="Calibri"/>
-          <w:b/>
-          <w:i w:val="0"/>
-          <w:color w:val="007A87"/>
-          <w:sz w:val="20"/>
-        </w:rPr>
-        <w:t xml:space="preserve"> 4.  </w:t>
-      </w:r>
-      <w:r>
-        <w:rPr>
-          <w:rFonts w:ascii="Calibri" w:hAnsi="Calibri"/>
-          <w:b w:val="0"/>
-          <w:i w:val="0"/>
-          <w:color w:val="1A1A2E"/>
-          <w:sz w:val="20"/>
-        </w:rPr>
-        <w:t>4  — Four</w:t>
-      </w:r>
-      <w:r>
-        <w:rPr>
-          <w:rFonts w:ascii="Calibri" w:hAnsi="Calibri"/>
-          <w:b w:val="0"/>
-          <w:i/>
-          <w:color w:val="6B7B8D"/>
-          <w:sz w:val="16"/>
-        </w:rPr>
-        <w:t xml:space="preserve">  ★ Both are used; よん is safer in daily speech.</w:t>
-      </w:r>
-    </w:p>
-    <w:p>
-      <w:pPr>
-        <w:spacing w:before="0" w:after="0"/>
-        <w:ind w:left="567"/>
-      </w:pPr>
-      <w:r>
-        <w:rPr>
-          <w:rFonts w:ascii="Calibri" w:hAnsi="Calibri"/>
-          <w:b/>
-          <w:i w:val="0"/>
-          <w:color w:val="007A87"/>
-          <w:sz w:val="18"/>
-        </w:rPr>
-        <w:t xml:space="preserve">Kanji:    </w:t>
-      </w:r>
-      <w:r>
-        <w:rPr>
-          <w:rFonts w:ascii="Calibri" w:hAnsi="Calibri"/>
-          <w:b w:val="0"/>
-          <w:i w:val="0"/>
-          <w:color w:val="1A1A2E"/>
-          <w:sz w:val="18"/>
-        </w:rPr>
-        <w:t>___________________________________</w:t>
-      </w:r>
-    </w:p>
-    <w:p>
-      <w:pPr>
-        <w:spacing w:before="0" w:after="0"/>
-        <w:ind w:left="567"/>
-      </w:pPr>
-      <w:r>
-        <w:rPr>
-          <w:rFonts w:ascii="Calibri" w:hAnsi="Calibri"/>
-          <w:b/>
-          <w:i w:val="0"/>
-          <w:color w:val="007A87"/>
-          <w:sz w:val="18"/>
-        </w:rPr>
-        <w:t>Hiragana:</w:t>
-      </w:r>
-      <w:r>
-        <w:rPr>
-          <w:rFonts w:ascii="Calibri" w:hAnsi="Calibri"/>
-          <w:b w:val="0"/>
-          <w:i w:val="0"/>
-          <w:color w:val="1A1A2E"/>
-          <w:sz w:val="18"/>
-        </w:rPr>
-        <w:t>___________________________________</w:t>
-      </w:r>
-    </w:p>
-    <w:p>
-      <w:pPr>
-        <w:spacing w:before="0" w:after="0"/>
-        <w:ind w:left="567"/>
-      </w:pPr>
-      <w:r>
-        <w:rPr>
-          <w:rFonts w:ascii="Calibri" w:hAnsi="Calibri"/>
-          <w:b/>
-          <w:i w:val="0"/>
-          <w:color w:val="007A87"/>
-          <w:sz w:val="18"/>
-        </w:rPr>
-        <w:t xml:space="preserve">Romaji:  </w:t>
-      </w:r>
-      <w:r>
-        <w:rPr>
-          <w:rFonts w:ascii="Calibri" w:hAnsi="Calibri"/>
-          <w:b w:val="0"/>
-          <w:i w:val="0"/>
-          <w:color w:val="1A1A2E"/>
-          <w:sz w:val="18"/>
-        </w:rPr>
-        <w:t>___________________________________</w:t>
-      </w:r>
-      <w:r>
-        <w:rPr>
-          <w:rFonts w:ascii="Calibri" w:hAnsi="Calibri"/>
-          <w:b w:val="0"/>
-          <w:i/>
-          <w:color w:val="6B7B8D"/>
-          <w:sz w:val="16"/>
-        </w:rPr>
-        <w:t xml:space="preserve">  (shi / yon)</w:t>
-      </w:r>
-    </w:p>
-    <w:p>
-      <w:pPr>
-        <w:spacing w:before="60" w:after="0"/>
-      </w:pPr>
-      <w:r>
-        <w:rPr>
-          <w:rFonts w:ascii="Calibri" w:hAnsi="Calibri"/>
-          <w:b/>
-          <w:i w:val="0"/>
-          <w:color w:val="007A87"/>
-          <w:sz w:val="20"/>
-        </w:rPr>
-        <w:t xml:space="preserve"> 5.  </w:t>
-      </w:r>
-      <w:r>
-        <w:rPr>
-          <w:rFonts w:ascii="Calibri" w:hAnsi="Calibri"/>
-          <w:b w:val="0"/>
-          <w:i w:val="0"/>
-          <w:color w:val="1A1A2E"/>
-          <w:sz w:val="20"/>
-        </w:rPr>
-        <w:t>5  — Five</w:t>
-      </w:r>
-    </w:p>
-    <w:p>
-      <w:pPr>
-        <w:spacing w:before="0" w:after="0"/>
-        <w:ind w:left="567"/>
-      </w:pPr>
-      <w:r>
-        <w:rPr>
-          <w:rFonts w:ascii="Calibri" w:hAnsi="Calibri"/>
-          <w:b/>
-          <w:i w:val="0"/>
-          <w:color w:val="007A87"/>
-          <w:sz w:val="18"/>
-        </w:rPr>
-        <w:t xml:space="preserve">Kanji:    </w:t>
-      </w:r>
-      <w:r>
-        <w:rPr>
-          <w:rFonts w:ascii="Calibri" w:hAnsi="Calibri"/>
-          <w:b w:val="0"/>
-          <w:i w:val="0"/>
-          <w:color w:val="1A1A2E"/>
-          <w:sz w:val="18"/>
-        </w:rPr>
-        <w:t>___________________________________</w:t>
-      </w:r>
-    </w:p>
-    <w:p>
-      <w:pPr>
-        <w:spacing w:before="0" w:after="0"/>
-        <w:ind w:left="567"/>
-      </w:pPr>
-      <w:r>
-        <w:rPr>
-          <w:rFonts w:ascii="Calibri" w:hAnsi="Calibri"/>
-          <w:b/>
-          <w:i w:val="0"/>
-          <w:color w:val="007A87"/>
-          <w:sz w:val="18"/>
-        </w:rPr>
-        <w:t>Hiragana:</w:t>
-      </w:r>
-      <w:r>
-        <w:rPr>
-          <w:rFonts w:ascii="Calibri" w:hAnsi="Calibri"/>
-          <w:b w:val="0"/>
-          <w:i w:val="0"/>
-          <w:color w:val="1A1A2E"/>
-          <w:sz w:val="18"/>
-        </w:rPr>
-        <w:t>___________________________________</w:t>
-      </w:r>
-    </w:p>
-    <w:p>
-      <w:pPr>
-        <w:spacing w:before="0" w:after="0"/>
-        <w:ind w:left="567"/>
-      </w:pPr>
-      <w:r>
-        <w:rPr>
-          <w:rFonts w:ascii="Calibri" w:hAnsi="Calibri"/>
-          <w:b/>
-          <w:i w:val="0"/>
-          <w:color w:val="007A87"/>
-          <w:sz w:val="18"/>
-        </w:rPr>
-        <w:t xml:space="preserve">Romaji:  </w:t>
-      </w:r>
-      <w:r>
-        <w:rPr>
-          <w:rFonts w:ascii="Calibri" w:hAnsi="Calibri"/>
-          <w:b w:val="0"/>
-          <w:i w:val="0"/>
-          <w:color w:val="1A1A2E"/>
-          <w:sz w:val="18"/>
-        </w:rPr>
-        <w:t>___________________________________</w:t>
-      </w:r>
-      <w:r>
-        <w:rPr>
-          <w:rFonts w:ascii="Calibri" w:hAnsi="Calibri"/>
-          <w:b w:val="0"/>
-          <w:i/>
-          <w:color w:val="6B7B8D"/>
-          <w:sz w:val="16"/>
-        </w:rPr>
-        <w:t xml:space="preserve">  (go)</w:t>
-      </w:r>
-    </w:p>
-    <w:p>
-      <w:pPr>
-        <w:spacing w:before="60" w:after="0"/>
-      </w:pPr>
-      <w:r>
-        <w:rPr>
-          <w:rFonts w:ascii="Calibri" w:hAnsi="Calibri"/>
-          <w:b/>
-          <w:i w:val="0"/>
-          <w:color w:val="007A87"/>
-          <w:sz w:val="20"/>
-        </w:rPr>
-        <w:t xml:space="preserve"> 6.  </w:t>
-      </w:r>
-      <w:r>
-        <w:rPr>
-          <w:rFonts w:ascii="Calibri" w:hAnsi="Calibri"/>
-          <w:b w:val="0"/>
-          <w:i w:val="0"/>
-          <w:color w:val="1A1A2E"/>
-          <w:sz w:val="20"/>
-        </w:rPr>
-        <w:t>6  — Six</w:t>
-      </w:r>
-    </w:p>
-    <w:p>
-      <w:pPr>
-        <w:spacing w:before="0" w:after="0"/>
-        <w:ind w:left="567"/>
-      </w:pPr>
-      <w:r>
-        <w:rPr>
-          <w:rFonts w:ascii="Calibri" w:hAnsi="Calibri"/>
-          <w:b/>
-          <w:i w:val="0"/>
-          <w:color w:val="007A87"/>
-          <w:sz w:val="18"/>
-        </w:rPr>
-        <w:t xml:space="preserve">Kanji:    </w:t>
-      </w:r>
-      <w:r>
-        <w:rPr>
-          <w:rFonts w:ascii="Calibri" w:hAnsi="Calibri"/>
-          <w:b w:val="0"/>
-          <w:i w:val="0"/>
-          <w:color w:val="1A1A2E"/>
-          <w:sz w:val="18"/>
-        </w:rPr>
-        <w:t>___________________________________</w:t>
-      </w:r>
-    </w:p>
-    <w:p>
-      <w:pPr>
-        <w:spacing w:before="0" w:after="0"/>
-        <w:ind w:left="567"/>
-      </w:pPr>
-      <w:r>
-        <w:rPr>
-          <w:rFonts w:ascii="Calibri" w:hAnsi="Calibri"/>
-          <w:b/>
-          <w:i w:val="0"/>
-          <w:color w:val="007A87"/>
-          <w:sz w:val="18"/>
-        </w:rPr>
-        <w:t>Hiragana:</w:t>
-      </w:r>
-      <w:r>
-        <w:rPr>
-          <w:rFonts w:ascii="Calibri" w:hAnsi="Calibri"/>
-          <w:b w:val="0"/>
-          <w:i w:val="0"/>
-          <w:color w:val="1A1A2E"/>
-          <w:sz w:val="18"/>
-        </w:rPr>
-        <w:t>___________________________________</w:t>
-      </w:r>
-    </w:p>
-    <w:p>
-      <w:pPr>
-        <w:spacing w:before="0" w:after="0"/>
-        <w:ind w:left="567"/>
-      </w:pPr>
-      <w:r>
-        <w:rPr>
-          <w:rFonts w:ascii="Calibri" w:hAnsi="Calibri"/>
-          <w:b/>
-          <w:i w:val="0"/>
-          <w:color w:val="007A87"/>
-          <w:sz w:val="18"/>
-        </w:rPr>
-        <w:t xml:space="preserve">Romaji:  </w:t>
-      </w:r>
-      <w:r>
-        <w:rPr>
-          <w:rFonts w:ascii="Calibri" w:hAnsi="Calibri"/>
-          <w:b w:val="0"/>
-          <w:i w:val="0"/>
-          <w:color w:val="1A1A2E"/>
-          <w:sz w:val="18"/>
-        </w:rPr>
-        <w:t>___________________________________</w:t>
-      </w:r>
-      <w:r>
-        <w:rPr>
-          <w:rFonts w:ascii="Calibri" w:hAnsi="Calibri"/>
-          <w:b w:val="0"/>
-          <w:i/>
-          <w:color w:val="6B7B8D"/>
-          <w:sz w:val="16"/>
-        </w:rPr>
-        <w:t xml:space="preserve">  (roku)</w:t>
-      </w:r>
-    </w:p>
-    <w:p>
-      <w:pPr>
-        <w:spacing w:before="60" w:after="0"/>
-      </w:pPr>
-      <w:r>
-        <w:rPr>
-          <w:rFonts w:ascii="Calibri" w:hAnsi="Calibri"/>
-          <w:b/>
-          <w:i w:val="0"/>
-          <w:color w:val="007A87"/>
-          <w:sz w:val="20"/>
-        </w:rPr>
-        <w:t xml:space="preserve"> 7.  </w:t>
-      </w:r>
-      <w:r>
-        <w:rPr>
-          <w:rFonts w:ascii="Calibri" w:hAnsi="Calibri"/>
-          <w:b w:val="0"/>
-          <w:i w:val="0"/>
-          <w:color w:val="1A1A2E"/>
-          <w:sz w:val="20"/>
-        </w:rPr>
-        <w:t>7  — Seven</w:t>
-      </w:r>
-      <w:r>
-        <w:rPr>
-          <w:rFonts w:ascii="Calibri" w:hAnsi="Calibri"/>
-          <w:b w:val="0"/>
-          <w:i/>
-          <w:color w:val="6B7B8D"/>
-          <w:sz w:val="16"/>
-        </w:rPr>
-        <w:t xml:space="preserve">  ★ なな is more common in daily speech.</w:t>
-      </w:r>
-    </w:p>
-    <w:p>
-      <w:pPr>
-        <w:spacing w:before="0" w:after="0"/>
-        <w:ind w:left="567"/>
-      </w:pPr>
-      <w:r>
-        <w:rPr>
-          <w:rFonts w:ascii="Calibri" w:hAnsi="Calibri"/>
-          <w:b/>
-          <w:i w:val="0"/>
-          <w:color w:val="007A87"/>
-          <w:sz w:val="18"/>
-        </w:rPr>
-        <w:t xml:space="preserve">Kanji:    </w:t>
-      </w:r>
-      <w:r>
-        <w:rPr>
-          <w:rFonts w:ascii="Calibri" w:hAnsi="Calibri"/>
-          <w:b w:val="0"/>
-          <w:i w:val="0"/>
-          <w:color w:val="1A1A2E"/>
-          <w:sz w:val="18"/>
-        </w:rPr>
-        <w:t>___________________________________</w:t>
-      </w:r>
-    </w:p>
-    <w:p>
-      <w:pPr>
-        <w:spacing w:before="0" w:after="0"/>
-        <w:ind w:left="567"/>
-      </w:pPr>
-      <w:r>
-        <w:rPr>
-          <w:rFonts w:ascii="Calibri" w:hAnsi="Calibri"/>
-          <w:b/>
-          <w:i w:val="0"/>
-          <w:color w:val="007A87"/>
-          <w:sz w:val="18"/>
-        </w:rPr>
-        <w:t>Hiragana:</w:t>
-      </w:r>
-      <w:r>
-        <w:rPr>
-          <w:rFonts w:ascii="Calibri" w:hAnsi="Calibri"/>
-          <w:b w:val="0"/>
-          <w:i w:val="0"/>
-          <w:color w:val="1A1A2E"/>
-          <w:sz w:val="18"/>
-        </w:rPr>
-        <w:t>___________________________________</w:t>
-      </w:r>
-    </w:p>
-    <w:p>
-      <w:pPr>
-        <w:spacing w:before="0" w:after="0"/>
-        <w:ind w:left="567"/>
-      </w:pPr>
-      <w:r>
-        <w:rPr>
-          <w:rFonts w:ascii="Calibri" w:hAnsi="Calibri"/>
-          <w:b/>
-          <w:i w:val="0"/>
-          <w:color w:val="007A87"/>
-          <w:sz w:val="18"/>
-        </w:rPr>
-        <w:t xml:space="preserve">Romaji:  </w:t>
-      </w:r>
-      <w:r>
-        <w:rPr>
-          <w:rFonts w:ascii="Calibri" w:hAnsi="Calibri"/>
-          <w:b w:val="0"/>
-          <w:i w:val="0"/>
-          <w:color w:val="1A1A2E"/>
-          <w:sz w:val="18"/>
-        </w:rPr>
-        <w:t>___________________________________</w:t>
-      </w:r>
-      <w:r>
-        <w:rPr>
-          <w:rFonts w:ascii="Calibri" w:hAnsi="Calibri"/>
-          <w:b w:val="0"/>
-          <w:i/>
-          <w:color w:val="6B7B8D"/>
-          <w:sz w:val="16"/>
-        </w:rPr>
-        <w:t xml:space="preserve">  (shichi / nana)</w:t>
-      </w:r>
-    </w:p>
-    <w:p>
-      <w:pPr>
-        <w:spacing w:before="60" w:after="0"/>
-      </w:pPr>
-      <w:r>
-        <w:rPr>
-          <w:rFonts w:ascii="Calibri" w:hAnsi="Calibri"/>
-          <w:b/>
-          <w:i w:val="0"/>
-          <w:color w:val="007A87"/>
-          <w:sz w:val="20"/>
-        </w:rPr>
-        <w:t xml:space="preserve"> 8.  </w:t>
-      </w:r>
-      <w:r>
-        <w:rPr>
-          <w:rFonts w:ascii="Calibri" w:hAnsi="Calibri"/>
-          <w:b w:val="0"/>
-          <w:i w:val="0"/>
-          <w:color w:val="1A1A2E"/>
-          <w:sz w:val="20"/>
-        </w:rPr>
-        <w:t>8  — Eight</w:t>
-      </w:r>
-    </w:p>
-    <w:p>
-      <w:pPr>
-        <w:spacing w:before="0" w:after="0"/>
-        <w:ind w:left="567"/>
-      </w:pPr>
-      <w:r>
-        <w:rPr>
-          <w:rFonts w:ascii="Calibri" w:hAnsi="Calibri"/>
-          <w:b/>
-          <w:i w:val="0"/>
-          <w:color w:val="007A87"/>
-          <w:sz w:val="18"/>
-        </w:rPr>
-        <w:t xml:space="preserve">Kanji:    </w:t>
-      </w:r>
-      <w:r>
-        <w:rPr>
-          <w:rFonts w:ascii="Calibri" w:hAnsi="Calibri"/>
-          <w:b w:val="0"/>
-          <w:i w:val="0"/>
-          <w:color w:val="1A1A2E"/>
-          <w:sz w:val="18"/>
-        </w:rPr>
-        <w:t>___________________________________</w:t>
-      </w:r>
-    </w:p>
-    <w:p>
-      <w:pPr>
-        <w:spacing w:before="0" w:after="0"/>
-        <w:ind w:left="567"/>
-      </w:pPr>
-      <w:r>
-        <w:rPr>
-          <w:rFonts w:ascii="Calibri" w:hAnsi="Calibri"/>
-          <w:b/>
-          <w:i w:val="0"/>
-          <w:color w:val="007A87"/>
-          <w:sz w:val="18"/>
-        </w:rPr>
-        <w:t>Hiragana:</w:t>
-      </w:r>
-      <w:r>
-        <w:rPr>
-          <w:rFonts w:ascii="Calibri" w:hAnsi="Calibri"/>
-          <w:b w:val="0"/>
-          <w:i w:val="0"/>
-          <w:color w:val="1A1A2E"/>
-          <w:sz w:val="18"/>
-        </w:rPr>
-        <w:t>___________________________________</w:t>
-      </w:r>
-    </w:p>
-    <w:p>
-      <w:pPr>
-        <w:spacing w:before="0" w:after="0"/>
-        <w:ind w:left="567"/>
-      </w:pPr>
-      <w:r>
-        <w:rPr>
-          <w:rFonts w:ascii="Calibri" w:hAnsi="Calibri"/>
-          <w:b/>
-          <w:i w:val="0"/>
-          <w:color w:val="007A87"/>
-          <w:sz w:val="18"/>
-        </w:rPr>
-        <w:t xml:space="preserve">Romaji:  </w:t>
-      </w:r>
-      <w:r>
-        <w:rPr>
-          <w:rFonts w:ascii="Calibri" w:hAnsi="Calibri"/>
-          <w:b w:val="0"/>
-          <w:i w:val="0"/>
-          <w:color w:val="1A1A2E"/>
-          <w:sz w:val="18"/>
-        </w:rPr>
-        <w:t>___________________________________</w:t>
-      </w:r>
-      <w:r>
-        <w:rPr>
-          <w:rFonts w:ascii="Calibri" w:hAnsi="Calibri"/>
-          <w:b w:val="0"/>
-          <w:i/>
-          <w:color w:val="6B7B8D"/>
-          <w:sz w:val="16"/>
-        </w:rPr>
-        <w:t xml:space="preserve">  (hachi)</w:t>
-      </w:r>
-    </w:p>
-    <w:p>
-      <w:pPr>
-        <w:spacing w:before="60" w:after="0"/>
-      </w:pPr>
-      <w:r>
-        <w:rPr>
-          <w:rFonts w:ascii="Calibri" w:hAnsi="Calibri"/>
-          <w:b/>
-          <w:i w:val="0"/>
-          <w:color w:val="007A87"/>
-          <w:sz w:val="20"/>
-        </w:rPr>
-        <w:t xml:space="preserve"> 9.  </w:t>
-      </w:r>
-      <w:r>
-        <w:rPr>
-          <w:rFonts w:ascii="Calibri" w:hAnsi="Calibri"/>
-          <w:b w:val="0"/>
-          <w:i w:val="0"/>
-          <w:color w:val="1A1A2E"/>
-          <w:sz w:val="20"/>
-        </w:rPr>
-        <w:t>9  — Nine</w:t>
-      </w:r>
-      <w:r>
-        <w:rPr>
-          <w:rFonts w:ascii="Calibri" w:hAnsi="Calibri"/>
-          <w:b w:val="0"/>
-          <w:i/>
-          <w:color w:val="6B7B8D"/>
-          <w:sz w:val="16"/>
-        </w:rPr>
-        <w:t xml:space="preserve">  ★ きゅう is preferred in most contexts.</w:t>
-      </w:r>
-    </w:p>
-    <w:p>
-      <w:pPr>
-        <w:spacing w:before="0" w:after="0"/>
-        <w:ind w:left="567"/>
-      </w:pPr>
-      <w:r>
-        <w:rPr>
-          <w:rFonts w:ascii="Calibri" w:hAnsi="Calibri"/>
-          <w:b/>
-          <w:i w:val="0"/>
-          <w:color w:val="007A87"/>
-          <w:sz w:val="18"/>
-        </w:rPr>
-        <w:t xml:space="preserve">Kanji:    </w:t>
-      </w:r>
-      <w:r>
-        <w:rPr>
-          <w:rFonts w:ascii="Calibri" w:hAnsi="Calibri"/>
-          <w:b w:val="0"/>
-          <w:i w:val="0"/>
-          <w:color w:val="1A1A2E"/>
-          <w:sz w:val="18"/>
-        </w:rPr>
-        <w:t>___________________________________</w:t>
-      </w:r>
-    </w:p>
-    <w:p>
-      <w:pPr>
-        <w:spacing w:before="0" w:after="0"/>
-        <w:ind w:left="567"/>
-      </w:pPr>
-      <w:r>
-        <w:rPr>
-          <w:rFonts w:ascii="Calibri" w:hAnsi="Calibri"/>
-          <w:b/>
-          <w:i w:val="0"/>
-          <w:color w:val="007A87"/>
-          <w:sz w:val="18"/>
-        </w:rPr>
-        <w:t>Hiragana:</w:t>
-      </w:r>
-      <w:r>
-        <w:rPr>
-          <w:rFonts w:ascii="Calibri" w:hAnsi="Calibri"/>
-          <w:b w:val="0"/>
-          <w:i w:val="0"/>
-          <w:color w:val="1A1A2E"/>
-          <w:sz w:val="18"/>
-        </w:rPr>
-        <w:t>___________________________________</w:t>
-      </w:r>
-    </w:p>
-    <w:p>
-      <w:pPr>
-        <w:spacing w:before="0" w:after="0"/>
-        <w:ind w:left="567"/>
-      </w:pPr>
-      <w:r>
-        <w:rPr>
-          <w:rFonts w:ascii="Calibri" w:hAnsi="Calibri"/>
-          <w:b/>
-          <w:i w:val="0"/>
-          <w:color w:val="007A87"/>
-          <w:sz w:val="18"/>
-        </w:rPr>
-        <w:t xml:space="preserve">Romaji:  </w:t>
-      </w:r>
-      <w:r>
-        <w:rPr>
-          <w:rFonts w:ascii="Calibri" w:hAnsi="Calibri"/>
-          <w:b w:val="0"/>
-          <w:i w:val="0"/>
-          <w:color w:val="1A1A2E"/>
-          <w:sz w:val="18"/>
-        </w:rPr>
-        <w:t>___________________________________</w:t>
-      </w:r>
-      <w:r>
-        <w:rPr>
-          <w:rFonts w:ascii="Calibri" w:hAnsi="Calibri"/>
-          <w:b w:val="0"/>
-          <w:i/>
-          <w:color w:val="6B7B8D"/>
-          <w:sz w:val="16"/>
-        </w:rPr>
-        <w:t xml:space="preserve">  (ku / kyuu)</w:t>
-      </w:r>
-    </w:p>
-    <w:p>
-      <w:pPr>
-        <w:spacing w:before="60" w:after="0"/>
-      </w:pPr>
-      <w:r>
-        <w:rPr>
-          <w:rFonts w:ascii="Calibri" w:hAnsi="Calibri"/>
-          <w:b/>
-          <w:i w:val="0"/>
-          <w:color w:val="007A87"/>
-          <w:sz w:val="20"/>
-        </w:rPr>
-        <w:t xml:space="preserve">10.  </w:t>
-      </w:r>
-      <w:r>
-        <w:rPr>
-          <w:rFonts w:ascii="Calibri" w:hAnsi="Calibri"/>
-          <w:b w:val="0"/>
-          <w:i w:val="0"/>
-          <w:color w:val="1A1A2E"/>
-          <w:sz w:val="20"/>
-        </w:rPr>
-        <w:t>10 — Ten</w:t>
-      </w:r>
-    </w:p>
-    <w:p>
-      <w:pPr>
-        <w:spacing w:before="0" w:after="0"/>
-        <w:ind w:left="567"/>
-      </w:pPr>
-      <w:r>
-        <w:rPr>
-          <w:rFonts w:ascii="Calibri" w:hAnsi="Calibri"/>
-          <w:b/>
-          <w:i w:val="0"/>
-          <w:color w:val="007A87"/>
-          <w:sz w:val="18"/>
-        </w:rPr>
-        <w:t xml:space="preserve">Kanji:    </w:t>
-      </w:r>
-      <w:r>
-        <w:rPr>
-          <w:rFonts w:ascii="Calibri" w:hAnsi="Calibri"/>
-          <w:b w:val="0"/>
-          <w:i w:val="0"/>
-          <w:color w:val="1A1A2E"/>
-          <w:sz w:val="18"/>
-        </w:rPr>
-        <w:t>___________________________________</w:t>
-      </w:r>
-    </w:p>
-    <w:p>
-      <w:pPr>
-        <w:spacing w:before="0" w:after="0"/>
-        <w:ind w:left="567"/>
-      </w:pPr>
-      <w:r>
-        <w:rPr>
-          <w:rFonts w:ascii="Calibri" w:hAnsi="Calibri"/>
-          <w:b/>
-          <w:i w:val="0"/>
-          <w:color w:val="007A87"/>
-          <w:sz w:val="18"/>
-        </w:rPr>
-        <w:t>Hiragana:</w:t>
-      </w:r>
-      <w:r>
-        <w:rPr>
-          <w:rFonts w:ascii="Calibri" w:hAnsi="Calibri"/>
-          <w:b w:val="0"/>
-          <w:i w:val="0"/>
-          <w:color w:val="1A1A2E"/>
-          <w:sz w:val="18"/>
-        </w:rPr>
-        <w:t>___________________________________</w:t>
-      </w:r>
-    </w:p>
-    <w:p>
-      <w:pPr>
-        <w:spacing w:before="0" w:after="0"/>
-        <w:ind w:left="567"/>
-      </w:pPr>
-      <w:r>
-        <w:rPr>
-          <w:rFonts w:ascii="Calibri" w:hAnsi="Calibri"/>
-          <w:b/>
-          <w:i w:val="0"/>
-          <w:color w:val="007A87"/>
-          <w:sz w:val="18"/>
-        </w:rPr>
-        <w:t xml:space="preserve">Romaji:  </w:t>
-      </w:r>
-      <w:r>
-        <w:rPr>
-          <w:rFonts w:ascii="Calibri" w:hAnsi="Calibri"/>
-          <w:b w:val="0"/>
-          <w:i w:val="0"/>
-          <w:color w:val="1A1A2E"/>
-          <w:sz w:val="18"/>
-        </w:rPr>
-        <w:t>___________________________________</w:t>
-      </w:r>
-      <w:r>
-        <w:rPr>
-          <w:rFonts w:ascii="Calibri" w:hAnsi="Calibri"/>
-          <w:b w:val="0"/>
-          <w:i/>
-          <w:color w:val="6B7B8D"/>
-          <w:sz w:val="16"/>
-        </w:rPr>
-        <w:t xml:space="preserve">  (juu)</w:t>
-      </w:r>
-    </w:p>
-    <w:p>
-      <w:pPr>
-        <w:spacing w:before="60" w:after="0"/>
-      </w:pPr>
-      <w:r>
-        <w:rPr>
-          <w:rFonts w:ascii="Calibri" w:hAnsi="Calibri"/>
-          <w:b/>
-          <w:i w:val="0"/>
-          <w:color w:val="007A87"/>
-          <w:sz w:val="20"/>
-        </w:rPr>
-        <w:t xml:space="preserve">11.  </w:t>
-      </w:r>
-      <w:r>
-        <w:rPr>
-          <w:rFonts w:ascii="Calibri" w:hAnsi="Calibri"/>
-          <w:b w:val="0"/>
-          <w:i w:val="0"/>
-          <w:color w:val="1A1A2E"/>
-          <w:sz w:val="20"/>
-        </w:rPr>
-        <w:t>11 — Eleven</w:t>
-      </w:r>
-      <w:r>
-        <w:rPr>
-          <w:rFonts w:ascii="Calibri" w:hAnsi="Calibri"/>
-          <w:b w:val="0"/>
-          <w:i/>
-          <w:color w:val="6B7B8D"/>
-          <w:sz w:val="16"/>
-        </w:rPr>
-        <w:t xml:space="preserve">  ★ Ten + one.</w:t>
-      </w:r>
-    </w:p>
-    <w:p>
-      <w:pPr>
-        <w:spacing w:before="0" w:after="0"/>
-        <w:ind w:left="567"/>
-      </w:pPr>
-      <w:r>
-        <w:rPr>
-          <w:rFonts w:ascii="Calibri" w:hAnsi="Calibri"/>
-          <w:b/>
-          <w:i w:val="0"/>
-          <w:color w:val="007A87"/>
-          <w:sz w:val="18"/>
-        </w:rPr>
-        <w:t xml:space="preserve">Kanji:    </w:t>
-      </w:r>
-      <w:r>
-        <w:rPr>
-          <w:rFonts w:ascii="Calibri" w:hAnsi="Calibri"/>
-          <w:b w:val="0"/>
-          <w:i w:val="0"/>
-          <w:color w:val="1A1A2E"/>
-          <w:sz w:val="18"/>
-        </w:rPr>
-        <w:t>___________________________________</w:t>
-      </w:r>
-    </w:p>
-    <w:p>
-      <w:pPr>
-        <w:spacing w:before="0" w:after="0"/>
-        <w:ind w:left="567"/>
-      </w:pPr>
-      <w:r>
-        <w:rPr>
-          <w:rFonts w:ascii="Calibri" w:hAnsi="Calibri"/>
-          <w:b/>
-          <w:i w:val="0"/>
-          <w:color w:val="007A87"/>
-          <w:sz w:val="18"/>
-        </w:rPr>
-        <w:t>Hiragana:</w:t>
-      </w:r>
-      <w:r>
-        <w:rPr>
-          <w:rFonts w:ascii="Calibri" w:hAnsi="Calibri"/>
-          <w:b w:val="0"/>
-          <w:i w:val="0"/>
-          <w:color w:val="1A1A2E"/>
-          <w:sz w:val="18"/>
-        </w:rPr>
-        <w:t>___________________________________</w:t>
-      </w:r>
-    </w:p>
-    <w:p>
-      <w:pPr>
-        <w:spacing w:before="0" w:after="0"/>
-        <w:ind w:left="567"/>
-      </w:pPr>
-      <w:r>
-        <w:rPr>
-          <w:rFonts w:ascii="Calibri" w:hAnsi="Calibri"/>
-          <w:b/>
-          <w:i w:val="0"/>
-          <w:color w:val="007A87"/>
-          <w:sz w:val="18"/>
-        </w:rPr>
-        <w:t xml:space="preserve">Romaji:  </w:t>
-      </w:r>
-      <w:r>
-        <w:rPr>
-          <w:rFonts w:ascii="Calibri" w:hAnsi="Calibri"/>
-          <w:b w:val="0"/>
-          <w:i w:val="0"/>
-          <w:color w:val="1A1A2E"/>
-          <w:sz w:val="18"/>
-        </w:rPr>
-        <w:t>___________________________________</w:t>
-      </w:r>
-      <w:r>
-        <w:rPr>
-          <w:rFonts w:ascii="Calibri" w:hAnsi="Calibri"/>
-          <w:b w:val="0"/>
-          <w:i/>
-          <w:color w:val="6B7B8D"/>
-          <w:sz w:val="16"/>
-        </w:rPr>
-        <w:t xml:space="preserve">  (juu-ichi)</w:t>
-      </w:r>
-    </w:p>
-    <w:p>
-      <w:pPr>
-        <w:spacing w:before="60" w:after="0"/>
-      </w:pPr>
-      <w:r>
-        <w:rPr>
-          <w:rFonts w:ascii="Calibri" w:hAnsi="Calibri"/>
-          <w:b/>
-          <w:i w:val="0"/>
-          <w:color w:val="007A87"/>
-          <w:sz w:val="20"/>
-        </w:rPr>
-        <w:t xml:space="preserve">12.  </w:t>
-      </w:r>
-      <w:r>
-        <w:rPr>
-          <w:rFonts w:ascii="Calibri" w:hAnsi="Calibri"/>
-          <w:b w:val="0"/>
-          <w:i w:val="0"/>
-          <w:color w:val="1A1A2E"/>
-          <w:sz w:val="20"/>
-        </w:rPr>
-        <w:t>12 — Twelve</w:t>
-      </w:r>
-      <w:r>
-        <w:rPr>
-          <w:rFonts w:ascii="Calibri" w:hAnsi="Calibri"/>
-          <w:b w:val="0"/>
-          <w:i/>
-          <w:color w:val="6B7B8D"/>
-          <w:sz w:val="16"/>
-        </w:rPr>
-        <w:t xml:space="preserve">  ★ Ten + two.</w:t>
-      </w:r>
-    </w:p>
-    <w:p>
-      <w:pPr>
-        <w:spacing w:before="0" w:after="0"/>
-        <w:ind w:left="567"/>
-      </w:pPr>
-      <w:r>
-        <w:rPr>
-          <w:rFonts w:ascii="Calibri" w:hAnsi="Calibri"/>
-          <w:b/>
-          <w:i w:val="0"/>
-          <w:color w:val="007A87"/>
-          <w:sz w:val="18"/>
-        </w:rPr>
-        <w:t xml:space="preserve">Kanji:    </w:t>
-      </w:r>
-      <w:r>
-        <w:rPr>
-          <w:rFonts w:ascii="Calibri" w:hAnsi="Calibri"/>
-          <w:b w:val="0"/>
-          <w:i w:val="0"/>
-          <w:color w:val="1A1A2E"/>
-          <w:sz w:val="18"/>
-        </w:rPr>
-        <w:t>___________________________________</w:t>
-      </w:r>
-    </w:p>
-    <w:p>
-      <w:pPr>
-        <w:spacing w:before="0" w:after="0"/>
-        <w:ind w:left="567"/>
-      </w:pPr>
-      <w:r>
-        <w:rPr>
-          <w:rFonts w:ascii="Calibri" w:hAnsi="Calibri"/>
-          <w:b/>
-          <w:i w:val="0"/>
-          <w:color w:val="007A87"/>
-          <w:sz w:val="18"/>
-        </w:rPr>
-        <w:t>Hiragana:</w:t>
-      </w:r>
-      <w:r>
-        <w:rPr>
-          <w:rFonts w:ascii="Calibri" w:hAnsi="Calibri"/>
-          <w:b w:val="0"/>
-          <w:i w:val="0"/>
-          <w:color w:val="1A1A2E"/>
-          <w:sz w:val="18"/>
-        </w:rPr>
-        <w:t>___________________________________</w:t>
-      </w:r>
-    </w:p>
-    <w:p>
-      <w:pPr>
-        <w:spacing w:before="0" w:after="0"/>
-        <w:ind w:left="567"/>
-      </w:pPr>
-      <w:r>
-        <w:rPr>
-          <w:rFonts w:ascii="Calibri" w:hAnsi="Calibri"/>
-          <w:b/>
-          <w:i w:val="0"/>
-          <w:color w:val="007A87"/>
-          <w:sz w:val="18"/>
-        </w:rPr>
-        <w:t xml:space="preserve">Romaji:  </w:t>
-      </w:r>
-      <w:r>
-        <w:rPr>
-          <w:rFonts w:ascii="Calibri" w:hAnsi="Calibri"/>
-          <w:b w:val="0"/>
-          <w:i w:val="0"/>
-          <w:color w:val="1A1A2E"/>
-          <w:sz w:val="18"/>
-        </w:rPr>
-        <w:t>___________________________________</w:t>
-      </w:r>
-      <w:r>
-        <w:rPr>
-          <w:rFonts w:ascii="Calibri" w:hAnsi="Calibri"/>
-          <w:b w:val="0"/>
-          <w:i/>
-          <w:color w:val="6B7B8D"/>
-          <w:sz w:val="16"/>
-        </w:rPr>
-        <w:t xml:space="preserve">  (juu-ni)</w:t>
-      </w:r>
-    </w:p>
-    <w:p>
-      <w:pPr>
-        <w:spacing w:before="60" w:after="0"/>
-      </w:pPr>
-      <w:r>
-        <w:rPr>
-          <w:rFonts w:ascii="Calibri" w:hAnsi="Calibri"/>
-          <w:b/>
-          <w:i w:val="0"/>
-          <w:color w:val="007A87"/>
-          <w:sz w:val="20"/>
-        </w:rPr>
-        <w:t xml:space="preserve">13.  </w:t>
-      </w:r>
-      <w:r>
-        <w:rPr>
-          <w:rFonts w:ascii="Calibri" w:hAnsi="Calibri"/>
-          <w:b w:val="0"/>
-          <w:i w:val="0"/>
-          <w:color w:val="1A1A2E"/>
-          <w:sz w:val="20"/>
-        </w:rPr>
-        <w:t>20 — Twenty</w:t>
-      </w:r>
-      <w:r>
-        <w:rPr>
-          <w:rFonts w:ascii="Calibri" w:hAnsi="Calibri"/>
-          <w:b w:val="0"/>
-          <w:i/>
-          <w:color w:val="6B7B8D"/>
-          <w:sz w:val="16"/>
-        </w:rPr>
-        <w:t xml:space="preserve">  ★ Two × ten.</w:t>
-      </w:r>
-    </w:p>
-    <w:p>
-      <w:pPr>
-        <w:spacing w:before="0" w:after="0"/>
-        <w:ind w:left="567"/>
-      </w:pPr>
-      <w:r>
-        <w:rPr>
-          <w:rFonts w:ascii="Calibri" w:hAnsi="Calibri"/>
-          <w:b/>
-          <w:i w:val="0"/>
-          <w:color w:val="007A87"/>
-          <w:sz w:val="18"/>
-        </w:rPr>
-        <w:t xml:space="preserve">Kanji:    </w:t>
-      </w:r>
-      <w:r>
-        <w:rPr>
-          <w:rFonts w:ascii="Calibri" w:hAnsi="Calibri"/>
-          <w:b w:val="0"/>
-          <w:i w:val="0"/>
-          <w:color w:val="1A1A2E"/>
-          <w:sz w:val="18"/>
-        </w:rPr>
-        <w:t>___________________________________</w:t>
-      </w:r>
-    </w:p>
-    <w:p>
-      <w:pPr>
-        <w:spacing w:before="0" w:after="0"/>
-        <w:ind w:left="567"/>
-      </w:pPr>
-      <w:r>
-        <w:rPr>
-          <w:rFonts w:ascii="Calibri" w:hAnsi="Calibri"/>
-          <w:b/>
-          <w:i w:val="0"/>
-          <w:color w:val="007A87"/>
-          <w:sz w:val="18"/>
-        </w:rPr>
-        <w:t>Hiragana:</w:t>
-      </w:r>
-      <w:r>
-        <w:rPr>
-          <w:rFonts w:ascii="Calibri" w:hAnsi="Calibri"/>
-          <w:b w:val="0"/>
-          <w:i w:val="0"/>
-          <w:color w:val="1A1A2E"/>
-          <w:sz w:val="18"/>
-        </w:rPr>
-        <w:t>___________________________________</w:t>
-      </w:r>
-    </w:p>
-    <w:p>
-      <w:pPr>
-        <w:spacing w:before="0" w:after="0"/>
-        <w:ind w:left="567"/>
-      </w:pPr>
-      <w:r>
-        <w:rPr>
-          <w:rFonts w:ascii="Calibri" w:hAnsi="Calibri"/>
-          <w:b/>
-          <w:i w:val="0"/>
-          <w:color w:val="007A87"/>
-          <w:sz w:val="18"/>
-        </w:rPr>
-        <w:t xml:space="preserve">Romaji:  </w:t>
-      </w:r>
-      <w:r>
-        <w:rPr>
-          <w:rFonts w:ascii="Calibri" w:hAnsi="Calibri"/>
-          <w:b w:val="0"/>
-          <w:i w:val="0"/>
-          <w:color w:val="1A1A2E"/>
-          <w:sz w:val="18"/>
-        </w:rPr>
-        <w:t>___________________________________</w:t>
-      </w:r>
-      <w:r>
-        <w:rPr>
-          <w:rFonts w:ascii="Calibri" w:hAnsi="Calibri"/>
-          <w:b w:val="0"/>
-          <w:i/>
-          <w:color w:val="6B7B8D"/>
-          <w:sz w:val="16"/>
-        </w:rPr>
-        <w:t xml:space="preserve">  (ni-juu)</w:t>
-      </w:r>
-    </w:p>
-    <w:p>
-      <w:pPr>
-        <w:spacing w:before="60" w:after="0"/>
-      </w:pPr>
-      <w:r>
-        <w:rPr>
-          <w:rFonts w:ascii="Calibri" w:hAnsi="Calibri"/>
-          <w:b/>
-          <w:i w:val="0"/>
-          <w:color w:val="007A87"/>
-          <w:sz w:val="20"/>
-        </w:rPr>
-        <w:t xml:space="preserve">14.  </w:t>
-      </w:r>
-      <w:r>
-        <w:rPr>
-          <w:rFonts w:ascii="Calibri" w:hAnsi="Calibri"/>
-          <w:b w:val="0"/>
-          <w:i w:val="0"/>
-          <w:color w:val="1A1A2E"/>
-          <w:sz w:val="20"/>
-        </w:rPr>
-        <w:t>30 — Thirty</w:t>
-      </w:r>
-      <w:r>
-        <w:rPr>
-          <w:rFonts w:ascii="Calibri" w:hAnsi="Calibri"/>
-          <w:b w:val="0"/>
-          <w:i/>
-          <w:color w:val="6B7B8D"/>
-          <w:sz w:val="16"/>
-        </w:rPr>
-        <w:t xml:space="preserve">  ★ Three × ten.</w:t>
-      </w:r>
-    </w:p>
-    <w:p>
-      <w:pPr>
-        <w:spacing w:before="0" w:after="0"/>
-        <w:ind w:left="567"/>
-      </w:pPr>
-      <w:r>
-        <w:rPr>
-          <w:rFonts w:ascii="Calibri" w:hAnsi="Calibri"/>
-          <w:b/>
-          <w:i w:val="0"/>
-          <w:color w:val="007A87"/>
-          <w:sz w:val="18"/>
-        </w:rPr>
-        <w:t xml:space="preserve">Kanji:    </w:t>
-      </w:r>
-      <w:r>
-        <w:rPr>
-          <w:rFonts w:ascii="Calibri" w:hAnsi="Calibri"/>
-          <w:b w:val="0"/>
-          <w:i w:val="0"/>
-          <w:color w:val="1A1A2E"/>
-          <w:sz w:val="18"/>
-        </w:rPr>
-        <w:t>___________________________________</w:t>
-      </w:r>
-    </w:p>
-    <w:p>
-      <w:pPr>
-        <w:spacing w:before="0" w:after="0"/>
-        <w:ind w:left="567"/>
-      </w:pPr>
-      <w:r>
-        <w:rPr>
-          <w:rFonts w:ascii="Calibri" w:hAnsi="Calibri"/>
-          <w:b/>
-          <w:i w:val="0"/>
-          <w:color w:val="007A87"/>
-          <w:sz w:val="18"/>
-        </w:rPr>
-        <w:t>Hiragana:</w:t>
-      </w:r>
-      <w:r>
-        <w:rPr>
-          <w:rFonts w:ascii="Calibri" w:hAnsi="Calibri"/>
-          <w:b w:val="0"/>
-          <w:i w:val="0"/>
-          <w:color w:val="1A1A2E"/>
-          <w:sz w:val="18"/>
-        </w:rPr>
-        <w:t>___________________________________</w:t>
-      </w:r>
-    </w:p>
-    <w:p>
-      <w:pPr>
-        <w:spacing w:before="0" w:after="0"/>
-        <w:ind w:left="567"/>
-      </w:pPr>
-      <w:r>
-        <w:rPr>
-          <w:rFonts w:ascii="Calibri" w:hAnsi="Calibri"/>
-          <w:b/>
-          <w:i w:val="0"/>
-          <w:color w:val="007A87"/>
-          <w:sz w:val="18"/>
-        </w:rPr>
-        <w:t xml:space="preserve">Romaji:  </w:t>
-      </w:r>
-      <w:r>
-        <w:rPr>
-          <w:rFonts w:ascii="Calibri" w:hAnsi="Calibri"/>
-          <w:b w:val="0"/>
-          <w:i w:val="0"/>
-          <w:color w:val="1A1A2E"/>
-          <w:sz w:val="18"/>
-        </w:rPr>
-        <w:t>___________________________________</w:t>
-      </w:r>
-      <w:r>
-        <w:rPr>
-          <w:rFonts w:ascii="Calibri" w:hAnsi="Calibri"/>
-          <w:b w:val="0"/>
-          <w:i/>
-          <w:color w:val="6B7B8D"/>
-          <w:sz w:val="16"/>
-        </w:rPr>
-        <w:t xml:space="preserve">  (san-juu)</w:t>
-      </w:r>
-    </w:p>
-    <w:p>
-      <w:pPr>
-        <w:spacing w:before="60" w:after="0"/>
-      </w:pPr>
-      <w:r>
-        <w:rPr>
-          <w:rFonts w:ascii="Calibri" w:hAnsi="Calibri"/>
-          <w:b/>
-          <w:i w:val="0"/>
-          <w:color w:val="007A87"/>
-          <w:sz w:val="20"/>
-        </w:rPr>
-        <w:t xml:space="preserve">15.  </w:t>
-      </w:r>
-      <w:r>
-        <w:rPr>
-          <w:rFonts w:ascii="Calibri" w:hAnsi="Calibri"/>
-          <w:b w:val="0"/>
-          <w:i w:val="0"/>
-          <w:color w:val="1A1A2E"/>
-          <w:sz w:val="20"/>
-        </w:rPr>
-        <w:t>100 — One hundred</w:t>
-      </w:r>
-      <w:r>
-        <w:rPr>
-          <w:rFonts w:ascii="Calibri" w:hAnsi="Calibri"/>
-          <w:b w:val="0"/>
-          <w:i/>
-          <w:color w:val="6B7B8D"/>
-          <w:sz w:val="16"/>
-        </w:rPr>
-        <w:t xml:space="preserve">  ★ New counter word.</w:t>
-      </w:r>
-    </w:p>
-    <w:p>
-      <w:pPr>
-        <w:spacing w:before="0" w:after="0"/>
-        <w:ind w:left="567"/>
-      </w:pPr>
-      <w:r>
-        <w:rPr>
-          <w:rFonts w:ascii="Calibri" w:hAnsi="Calibri"/>
-          <w:b/>
-          <w:i w:val="0"/>
-          <w:color w:val="007A87"/>
-          <w:sz w:val="18"/>
-        </w:rPr>
-        <w:t xml:space="preserve">Kanji:    </w:t>
-      </w:r>
-      <w:r>
-        <w:rPr>
-          <w:rFonts w:ascii="Calibri" w:hAnsi="Calibri"/>
-          <w:b w:val="0"/>
-          <w:i w:val="0"/>
-          <w:color w:val="1A1A2E"/>
-          <w:sz w:val="18"/>
-        </w:rPr>
-        <w:t>___________________________________</w:t>
-      </w:r>
-    </w:p>
-    <w:p>
-      <w:pPr>
-        <w:spacing w:before="0" w:after="0"/>
-        <w:ind w:left="567"/>
-      </w:pPr>
-      <w:r>
-        <w:rPr>
-          <w:rFonts w:ascii="Calibri" w:hAnsi="Calibri"/>
-          <w:b/>
-          <w:i w:val="0"/>
-          <w:color w:val="007A87"/>
-          <w:sz w:val="18"/>
-        </w:rPr>
-        <w:t>Hiragana:</w:t>
-      </w:r>
-      <w:r>
-        <w:rPr>
-          <w:rFonts w:ascii="Calibri" w:hAnsi="Calibri"/>
-          <w:b w:val="0"/>
-          <w:i w:val="0"/>
-          <w:color w:val="1A1A2E"/>
-          <w:sz w:val="18"/>
-        </w:rPr>
-        <w:t>___________________________________</w:t>
-      </w:r>
-    </w:p>
-    <w:p>
-      <w:pPr>
-        <w:spacing w:before="0" w:after="0"/>
-        <w:ind w:left="567"/>
-      </w:pPr>
-      <w:r>
-        <w:rPr>
-          <w:rFonts w:ascii="Calibri" w:hAnsi="Calibri"/>
-          <w:b/>
-          <w:i w:val="0"/>
-          <w:color w:val="007A87"/>
-          <w:sz w:val="18"/>
-        </w:rPr>
-        <w:t xml:space="preserve">Romaji:  </w:t>
-      </w:r>
-      <w:r>
-        <w:rPr>
-          <w:rFonts w:ascii="Calibri" w:hAnsi="Calibri"/>
-          <w:b w:val="0"/>
-          <w:i w:val="0"/>
-          <w:color w:val="1A1A2E"/>
-          <w:sz w:val="18"/>
-        </w:rPr>
-        <w:t>___________________________________</w:t>
-      </w:r>
-      <w:r>
-        <w:rPr>
-          <w:rFonts w:ascii="Calibri" w:hAnsi="Calibri"/>
-          <w:b w:val="0"/>
-          <w:i/>
-          <w:color w:val="6B7B8D"/>
-          <w:sz w:val="16"/>
-        </w:rPr>
-        <w:t xml:space="preserve">  (hyaku)</w:t>
-      </w:r>
-    </w:p>
-    <w:p>
-      <w:pPr>
-        <w:spacing w:before="60" w:after="0"/>
-      </w:pPr>
-      <w:r>
-        <w:rPr>
-          <w:rFonts w:ascii="Calibri" w:hAnsi="Calibri"/>
-          <w:b/>
-          <w:i w:val="0"/>
-          <w:color w:val="007A87"/>
-          <w:sz w:val="20"/>
-        </w:rPr>
-        <w:t xml:space="preserve">16.  </w:t>
-      </w:r>
-      <w:r>
-        <w:rPr>
-          <w:rFonts w:ascii="Calibri" w:hAnsi="Calibri"/>
-          <w:b w:val="0"/>
-          <w:i w:val="0"/>
-          <w:color w:val="1A1A2E"/>
-          <w:sz w:val="20"/>
-        </w:rPr>
-        <w:t>1000 — One thousand</w:t>
-      </w:r>
-      <w:r>
-        <w:rPr>
-          <w:rFonts w:ascii="Calibri" w:hAnsi="Calibri"/>
-          <w:b w:val="0"/>
-          <w:i/>
-          <w:color w:val="6B7B8D"/>
-          <w:sz w:val="16"/>
-        </w:rPr>
-        <w:t xml:space="preserve">  ★ New counter word.</w:t>
-      </w:r>
-    </w:p>
-    <w:p>
-      <w:pPr>
-        <w:spacing w:before="0" w:after="0"/>
-        <w:ind w:left="567"/>
-      </w:pPr>
-      <w:r>
-        <w:rPr>
-          <w:rFonts w:ascii="Calibri" w:hAnsi="Calibri"/>
-          <w:b/>
-          <w:i w:val="0"/>
-          <w:color w:val="007A87"/>
-          <w:sz w:val="18"/>
-        </w:rPr>
-        <w:t xml:space="preserve">Kanji:    </w:t>
-      </w:r>
-      <w:r>
-        <w:rPr>
-          <w:rFonts w:ascii="Calibri" w:hAnsi="Calibri"/>
-          <w:b w:val="0"/>
-          <w:i w:val="0"/>
-          <w:color w:val="1A1A2E"/>
-          <w:sz w:val="18"/>
-        </w:rPr>
-        <w:t>___________________________________</w:t>
-      </w:r>
-    </w:p>
-    <w:p>
-      <w:pPr>
-        <w:spacing w:before="0" w:after="0"/>
-        <w:ind w:left="567"/>
-      </w:pPr>
-      <w:r>
-        <w:rPr>
-          <w:rFonts w:ascii="Calibri" w:hAnsi="Calibri"/>
-          <w:b/>
-          <w:i w:val="0"/>
-          <w:color w:val="007A87"/>
-          <w:sz w:val="18"/>
-        </w:rPr>
-        <w:t>Hiragana:</w:t>
-      </w:r>
-      <w:r>
-        <w:rPr>
-          <w:rFonts w:ascii="Calibri" w:hAnsi="Calibri"/>
-          <w:b w:val="0"/>
-          <w:i w:val="0"/>
-          <w:color w:val="1A1A2E"/>
-          <w:sz w:val="18"/>
-        </w:rPr>
-        <w:t>___________________________________</w:t>
-      </w:r>
-    </w:p>
-    <w:p>
-      <w:pPr>
-        <w:spacing w:before="0" w:after="0"/>
-        <w:ind w:left="567"/>
-      </w:pPr>
-      <w:r>
-        <w:rPr>
-          <w:rFonts w:ascii="Calibri" w:hAnsi="Calibri"/>
-          <w:b/>
-          <w:i w:val="0"/>
-          <w:color w:val="007A87"/>
-          <w:sz w:val="18"/>
-        </w:rPr>
-        <w:t xml:space="preserve">Romaji:  </w:t>
-      </w:r>
-      <w:r>
-        <w:rPr>
-          <w:rFonts w:ascii="Calibri" w:hAnsi="Calibri"/>
-          <w:b w:val="0"/>
-          <w:i w:val="0"/>
-          <w:color w:val="1A1A2E"/>
-          <w:sz w:val="18"/>
-        </w:rPr>
-        <w:t>___________________________________</w:t>
-      </w:r>
-      <w:r>
-        <w:rPr>
-          <w:rFonts w:ascii="Calibri" w:hAnsi="Calibri"/>
-          <w:b w:val="0"/>
-          <w:i/>
-          <w:color w:val="6B7B8D"/>
-          <w:sz w:val="16"/>
-        </w:rPr>
-        <w:t xml:space="preserve">  (sen)</w:t>
-      </w:r>
-    </w:p>
+    <w:tbl>
+      <w:tblPr>
+        <w:tblStyle w:val="TableGrid"/>
+        <w:tblW w:type="auto" w:w="0"/>
+        <w:tblLook w:firstColumn="1" w:firstRow="1" w:lastColumn="0" w:lastRow="0" w:noHBand="0" w:noVBand="1" w:val="04A0"/>
+      </w:tblPr>
+      <w:tblGrid>
+        <w:gridCol w:w="4986"/>
+        <w:gridCol w:w="4986"/>
+      </w:tblGrid>
+      <w:tr>
+        <w:tc>
+          <w:tcPr>
+            <w:tcW w:type="dxa" w:w="4986"/>
+            <w:tcBorders>
+              <w:top w:val="nil"/>
+              <w:left w:val="nil"/>
+              <w:bottom w:val="nil"/>
+              <w:right w:val="nil"/>
+            </w:tcBorders>
+            <w:shd w:val="clear" w:color="auto" w:fill="F0F6FA"/>
+            <w:vAlign w:val="top"/>
+          </w:tcPr>
+          <w:p>
+            <w:pPr>
+              <w:spacing w:before="40" w:after="0"/>
+            </w:pPr>
+            <w:r>
+              <w:rPr>
+                <w:rFonts w:ascii="Calibri" w:hAnsi="Calibri"/>
+                <w:b/>
+                <w:i w:val="0"/>
+                <w:color w:val="007A87"/>
+                <w:sz w:val="20"/>
+              </w:rPr>
+              <w:t xml:space="preserve">1. </w:t>
+            </w:r>
+            <w:r>
+              <w:rPr>
+                <w:rFonts w:ascii="Calibri" w:hAnsi="Calibri"/>
+                <w:b w:val="0"/>
+                <w:i w:val="0"/>
+                <w:color w:val="1A1A2E"/>
+                <w:sz w:val="20"/>
+              </w:rPr>
+              <w:t>1  — One</w:t>
+            </w:r>
+          </w:p>
+          <w:p>
+            <w:pPr>
+              <w:spacing w:before="0" w:after="0"/>
+              <w:ind w:left="113"/>
+            </w:pPr>
+            <w:r>
+              <w:rPr>
+                <w:rFonts w:ascii="Calibri" w:hAnsi="Calibri"/>
+                <w:b/>
+                <w:i w:val="0"/>
+                <w:color w:val="007A87"/>
+                <w:sz w:val="18"/>
+              </w:rPr>
+              <w:t xml:space="preserve">Kanji:    </w:t>
+            </w:r>
+            <w:r>
+              <w:rPr>
+                <w:rFonts w:ascii="Calibri" w:hAnsi="Calibri"/>
+                <w:b w:val="0"/>
+                <w:i w:val="0"/>
+                <w:color w:val="1A1A2E"/>
+                <w:sz w:val="18"/>
+              </w:rPr>
+              <w:t>_____________________</w:t>
+            </w:r>
+          </w:p>
+          <w:p>
+            <w:pPr>
+              <w:spacing w:before="0" w:after="0"/>
+              <w:ind w:left="113"/>
+            </w:pPr>
+            <w:r>
+              <w:rPr>
+                <w:rFonts w:ascii="Calibri" w:hAnsi="Calibri"/>
+                <w:b/>
+                <w:i w:val="0"/>
+                <w:color w:val="007A87"/>
+                <w:sz w:val="18"/>
+              </w:rPr>
+              <w:t>Hiragana:</w:t>
+            </w:r>
+            <w:r>
+              <w:rPr>
+                <w:rFonts w:ascii="Calibri" w:hAnsi="Calibri"/>
+                <w:b w:val="0"/>
+                <w:i w:val="0"/>
+                <w:color w:val="1A1A2E"/>
+                <w:sz w:val="18"/>
+              </w:rPr>
+              <w:t>_____________________</w:t>
+            </w:r>
+          </w:p>
+          <w:p>
+            <w:pPr>
+              <w:spacing w:before="0" w:after="0"/>
+              <w:ind w:left="113"/>
+            </w:pPr>
+            <w:r>
+              <w:rPr>
+                <w:rFonts w:ascii="Calibri" w:hAnsi="Calibri"/>
+                <w:b/>
+                <w:i w:val="0"/>
+                <w:color w:val="007A87"/>
+                <w:sz w:val="18"/>
+              </w:rPr>
+              <w:t xml:space="preserve">Romaji:  </w:t>
+            </w:r>
+            <w:r>
+              <w:rPr>
+                <w:rFonts w:ascii="Calibri" w:hAnsi="Calibri"/>
+                <w:b w:val="0"/>
+                <w:i w:val="0"/>
+                <w:color w:val="1A1A2E"/>
+                <w:sz w:val="18"/>
+              </w:rPr>
+              <w:t>_____________________</w:t>
+            </w:r>
+            <w:r>
+              <w:rPr>
+                <w:rFonts w:ascii="Calibri" w:hAnsi="Calibri"/>
+                <w:b w:val="0"/>
+                <w:i/>
+                <w:color w:val="6B7B8D"/>
+                <w:sz w:val="14"/>
+              </w:rPr>
+              <w:t xml:space="preserve">  (ichi)</w:t>
+            </w:r>
+          </w:p>
+        </w:tc>
+        <w:tc>
+          <w:tcPr>
+            <w:tcW w:type="dxa" w:w="4986"/>
+            <w:tcBorders>
+              <w:top w:val="nil"/>
+              <w:left w:val="nil"/>
+              <w:bottom w:val="nil"/>
+              <w:right w:val="nil"/>
+            </w:tcBorders>
+            <w:shd w:val="clear" w:color="auto" w:fill="F0F6FA"/>
+            <w:vAlign w:val="top"/>
+          </w:tcPr>
+          <w:p>
+            <w:pPr>
+              <w:spacing w:before="40" w:after="0"/>
+            </w:pPr>
+            <w:r>
+              <w:rPr>
+                <w:rFonts w:ascii="Calibri" w:hAnsi="Calibri"/>
+                <w:b/>
+                <w:i w:val="0"/>
+                <w:color w:val="007A87"/>
+                <w:sz w:val="20"/>
+              </w:rPr>
+              <w:t xml:space="preserve">2. </w:t>
+            </w:r>
+            <w:r>
+              <w:rPr>
+                <w:rFonts w:ascii="Calibri" w:hAnsi="Calibri"/>
+                <w:b w:val="0"/>
+                <w:i w:val="0"/>
+                <w:color w:val="1A1A2E"/>
+                <w:sz w:val="20"/>
+              </w:rPr>
+              <w:t>2  — Two</w:t>
+            </w:r>
+          </w:p>
+          <w:p>
+            <w:pPr>
+              <w:spacing w:before="0" w:after="0"/>
+              <w:ind w:left="113"/>
+            </w:pPr>
+            <w:r>
+              <w:rPr>
+                <w:rFonts w:ascii="Calibri" w:hAnsi="Calibri"/>
+                <w:b/>
+                <w:i w:val="0"/>
+                <w:color w:val="007A87"/>
+                <w:sz w:val="18"/>
+              </w:rPr>
+              <w:t xml:space="preserve">Kanji:    </w:t>
+            </w:r>
+            <w:r>
+              <w:rPr>
+                <w:rFonts w:ascii="Calibri" w:hAnsi="Calibri"/>
+                <w:b w:val="0"/>
+                <w:i w:val="0"/>
+                <w:color w:val="1A1A2E"/>
+                <w:sz w:val="18"/>
+              </w:rPr>
+              <w:t>_____________________</w:t>
+            </w:r>
+          </w:p>
+          <w:p>
+            <w:pPr>
+              <w:spacing w:before="0" w:after="0"/>
+              <w:ind w:left="113"/>
+            </w:pPr>
+            <w:r>
+              <w:rPr>
+                <w:rFonts w:ascii="Calibri" w:hAnsi="Calibri"/>
+                <w:b/>
+                <w:i w:val="0"/>
+                <w:color w:val="007A87"/>
+                <w:sz w:val="18"/>
+              </w:rPr>
+              <w:t>Hiragana:</w:t>
+            </w:r>
+            <w:r>
+              <w:rPr>
+                <w:rFonts w:ascii="Calibri" w:hAnsi="Calibri"/>
+                <w:b w:val="0"/>
+                <w:i w:val="0"/>
+                <w:color w:val="1A1A2E"/>
+                <w:sz w:val="18"/>
+              </w:rPr>
+              <w:t>_____________________</w:t>
+            </w:r>
+          </w:p>
+          <w:p>
+            <w:pPr>
+              <w:spacing w:before="0" w:after="0"/>
+              <w:ind w:left="113"/>
+            </w:pPr>
+            <w:r>
+              <w:rPr>
+                <w:rFonts w:ascii="Calibri" w:hAnsi="Calibri"/>
+                <w:b/>
+                <w:i w:val="0"/>
+                <w:color w:val="007A87"/>
+                <w:sz w:val="18"/>
+              </w:rPr>
+              <w:t xml:space="preserve">Romaji:  </w:t>
+            </w:r>
+            <w:r>
+              <w:rPr>
+                <w:rFonts w:ascii="Calibri" w:hAnsi="Calibri"/>
+                <w:b w:val="0"/>
+                <w:i w:val="0"/>
+                <w:color w:val="1A1A2E"/>
+                <w:sz w:val="18"/>
+              </w:rPr>
+              <w:t>_____________________</w:t>
+            </w:r>
+            <w:r>
+              <w:rPr>
+                <w:rFonts w:ascii="Calibri" w:hAnsi="Calibri"/>
+                <w:b w:val="0"/>
+                <w:i/>
+                <w:color w:val="6B7B8D"/>
+                <w:sz w:val="14"/>
+              </w:rPr>
+              <w:t xml:space="preserve">  (ni)</w:t>
+            </w:r>
+          </w:p>
+        </w:tc>
+      </w:tr>
+      <w:tr>
+        <w:tc>
+          <w:tcPr>
+            <w:tcW w:type="dxa" w:w="4986"/>
+            <w:tcBorders>
+              <w:top w:val="nil"/>
+              <w:left w:val="nil"/>
+              <w:bottom w:val="nil"/>
+              <w:right w:val="nil"/>
+            </w:tcBorders>
+            <w:shd w:val="clear" w:color="auto" w:fill="FFFFFF"/>
+            <w:vAlign w:val="top"/>
+          </w:tcPr>
+          <w:p>
+            <w:pPr>
+              <w:spacing w:before="40" w:after="0"/>
+            </w:pPr>
+            <w:r>
+              <w:rPr>
+                <w:rFonts w:ascii="Calibri" w:hAnsi="Calibri"/>
+                <w:b/>
+                <w:i w:val="0"/>
+                <w:color w:val="007A87"/>
+                <w:sz w:val="20"/>
+              </w:rPr>
+              <w:t xml:space="preserve">3. </w:t>
+            </w:r>
+            <w:r>
+              <w:rPr>
+                <w:rFonts w:ascii="Calibri" w:hAnsi="Calibri"/>
+                <w:b w:val="0"/>
+                <w:i w:val="0"/>
+                <w:color w:val="1A1A2E"/>
+                <w:sz w:val="20"/>
+              </w:rPr>
+              <w:t>3  — Three</w:t>
+            </w:r>
+          </w:p>
+          <w:p>
+            <w:pPr>
+              <w:spacing w:before="0" w:after="0"/>
+              <w:ind w:left="113"/>
+            </w:pPr>
+            <w:r>
+              <w:rPr>
+                <w:rFonts w:ascii="Calibri" w:hAnsi="Calibri"/>
+                <w:b/>
+                <w:i w:val="0"/>
+                <w:color w:val="007A87"/>
+                <w:sz w:val="18"/>
+              </w:rPr>
+              <w:t xml:space="preserve">Kanji:    </w:t>
+            </w:r>
+            <w:r>
+              <w:rPr>
+                <w:rFonts w:ascii="Calibri" w:hAnsi="Calibri"/>
+                <w:b w:val="0"/>
+                <w:i w:val="0"/>
+                <w:color w:val="1A1A2E"/>
+                <w:sz w:val="18"/>
+              </w:rPr>
+              <w:t>_____________________</w:t>
+            </w:r>
+          </w:p>
+          <w:p>
+            <w:pPr>
+              <w:spacing w:before="0" w:after="0"/>
+              <w:ind w:left="113"/>
+            </w:pPr>
+            <w:r>
+              <w:rPr>
+                <w:rFonts w:ascii="Calibri" w:hAnsi="Calibri"/>
+                <w:b/>
+                <w:i w:val="0"/>
+                <w:color w:val="007A87"/>
+                <w:sz w:val="18"/>
+              </w:rPr>
+              <w:t>Hiragana:</w:t>
+            </w:r>
+            <w:r>
+              <w:rPr>
+                <w:rFonts w:ascii="Calibri" w:hAnsi="Calibri"/>
+                <w:b w:val="0"/>
+                <w:i w:val="0"/>
+                <w:color w:val="1A1A2E"/>
+                <w:sz w:val="18"/>
+              </w:rPr>
+              <w:t>_____________________</w:t>
+            </w:r>
+          </w:p>
+          <w:p>
+            <w:pPr>
+              <w:spacing w:before="0" w:after="0"/>
+              <w:ind w:left="113"/>
+            </w:pPr>
+            <w:r>
+              <w:rPr>
+                <w:rFonts w:ascii="Calibri" w:hAnsi="Calibri"/>
+                <w:b/>
+                <w:i w:val="0"/>
+                <w:color w:val="007A87"/>
+                <w:sz w:val="18"/>
+              </w:rPr>
+              <w:t xml:space="preserve">Romaji:  </w:t>
+            </w:r>
+            <w:r>
+              <w:rPr>
+                <w:rFonts w:ascii="Calibri" w:hAnsi="Calibri"/>
+                <w:b w:val="0"/>
+                <w:i w:val="0"/>
+                <w:color w:val="1A1A2E"/>
+                <w:sz w:val="18"/>
+              </w:rPr>
+              <w:t>_____________________</w:t>
+            </w:r>
+            <w:r>
+              <w:rPr>
+                <w:rFonts w:ascii="Calibri" w:hAnsi="Calibri"/>
+                <w:b w:val="0"/>
+                <w:i/>
+                <w:color w:val="6B7B8D"/>
+                <w:sz w:val="14"/>
+              </w:rPr>
+              <w:t xml:space="preserve">  (san)</w:t>
+            </w:r>
+          </w:p>
+        </w:tc>
+        <w:tc>
+          <w:tcPr>
+            <w:tcW w:type="dxa" w:w="4986"/>
+            <w:tcBorders>
+              <w:top w:val="nil"/>
+              <w:left w:val="nil"/>
+              <w:bottom w:val="nil"/>
+              <w:right w:val="nil"/>
+            </w:tcBorders>
+            <w:shd w:val="clear" w:color="auto" w:fill="FFFFFF"/>
+            <w:vAlign w:val="top"/>
+          </w:tcPr>
+          <w:p>
+            <w:pPr>
+              <w:spacing w:before="40" w:after="0"/>
+            </w:pPr>
+            <w:r>
+              <w:rPr>
+                <w:rFonts w:ascii="Calibri" w:hAnsi="Calibri"/>
+                <w:b/>
+                <w:i w:val="0"/>
+                <w:color w:val="007A87"/>
+                <w:sz w:val="20"/>
+              </w:rPr>
+              <w:t xml:space="preserve">4. </w:t>
+            </w:r>
+            <w:r>
+              <w:rPr>
+                <w:rFonts w:ascii="Calibri" w:hAnsi="Calibri"/>
+                <w:b w:val="0"/>
+                <w:i w:val="0"/>
+                <w:color w:val="1A1A2E"/>
+                <w:sz w:val="20"/>
+              </w:rPr>
+              <w:t>4  — Four</w:t>
+            </w:r>
+          </w:p>
+          <w:p>
+            <w:pPr>
+              <w:spacing w:before="0" w:after="20"/>
+            </w:pPr>
+            <w:r>
+              <w:rPr>
+                <w:rFonts w:ascii="Calibri" w:hAnsi="Calibri"/>
+                <w:b w:val="0"/>
+                <w:i/>
+                <w:color w:val="6B7B8D"/>
+                <w:sz w:val="14"/>
+              </w:rPr>
+              <w:t>★ Both are used; よん is safer in daily speech.</w:t>
+            </w:r>
+          </w:p>
+          <w:p>
+            <w:pPr>
+              <w:spacing w:before="0" w:after="0"/>
+              <w:ind w:left="113"/>
+            </w:pPr>
+            <w:r>
+              <w:rPr>
+                <w:rFonts w:ascii="Calibri" w:hAnsi="Calibri"/>
+                <w:b/>
+                <w:i w:val="0"/>
+                <w:color w:val="007A87"/>
+                <w:sz w:val="18"/>
+              </w:rPr>
+              <w:t xml:space="preserve">Kanji:    </w:t>
+            </w:r>
+            <w:r>
+              <w:rPr>
+                <w:rFonts w:ascii="Calibri" w:hAnsi="Calibri"/>
+                <w:b w:val="0"/>
+                <w:i w:val="0"/>
+                <w:color w:val="1A1A2E"/>
+                <w:sz w:val="18"/>
+              </w:rPr>
+              <w:t>_____________________</w:t>
+            </w:r>
+          </w:p>
+          <w:p>
+            <w:pPr>
+              <w:spacing w:before="0" w:after="0"/>
+              <w:ind w:left="113"/>
+            </w:pPr>
+            <w:r>
+              <w:rPr>
+                <w:rFonts w:ascii="Calibri" w:hAnsi="Calibri"/>
+                <w:b/>
+                <w:i w:val="0"/>
+                <w:color w:val="007A87"/>
+                <w:sz w:val="18"/>
+              </w:rPr>
+              <w:t>Hiragana:</w:t>
+            </w:r>
+            <w:r>
+              <w:rPr>
+                <w:rFonts w:ascii="Calibri" w:hAnsi="Calibri"/>
+                <w:b w:val="0"/>
+                <w:i w:val="0"/>
+                <w:color w:val="1A1A2E"/>
+                <w:sz w:val="18"/>
+              </w:rPr>
+              <w:t>_____________________</w:t>
+            </w:r>
+          </w:p>
+          <w:p>
+            <w:pPr>
+              <w:spacing w:before="0" w:after="0"/>
+              <w:ind w:left="113"/>
+            </w:pPr>
+            <w:r>
+              <w:rPr>
+                <w:rFonts w:ascii="Calibri" w:hAnsi="Calibri"/>
+                <w:b/>
+                <w:i w:val="0"/>
+                <w:color w:val="007A87"/>
+                <w:sz w:val="18"/>
+              </w:rPr>
+              <w:t xml:space="preserve">Romaji:  </w:t>
+            </w:r>
+            <w:r>
+              <w:rPr>
+                <w:rFonts w:ascii="Calibri" w:hAnsi="Calibri"/>
+                <w:b w:val="0"/>
+                <w:i w:val="0"/>
+                <w:color w:val="1A1A2E"/>
+                <w:sz w:val="18"/>
+              </w:rPr>
+              <w:t>_____________________</w:t>
+            </w:r>
+            <w:r>
+              <w:rPr>
+                <w:rFonts w:ascii="Calibri" w:hAnsi="Calibri"/>
+                <w:b w:val="0"/>
+                <w:i/>
+                <w:color w:val="6B7B8D"/>
+                <w:sz w:val="14"/>
+              </w:rPr>
+              <w:t xml:space="preserve">  (shi / yon)</w:t>
+            </w:r>
+          </w:p>
+        </w:tc>
+      </w:tr>
+      <w:tr>
+        <w:tc>
+          <w:tcPr>
+            <w:tcW w:type="dxa" w:w="4986"/>
+            <w:tcBorders>
+              <w:top w:val="nil"/>
+              <w:left w:val="nil"/>
+              <w:bottom w:val="nil"/>
+              <w:right w:val="nil"/>
+            </w:tcBorders>
+            <w:shd w:val="clear" w:color="auto" w:fill="F0F6FA"/>
+            <w:vAlign w:val="top"/>
+          </w:tcPr>
+          <w:p>
+            <w:pPr>
+              <w:spacing w:before="40" w:after="0"/>
+            </w:pPr>
+            <w:r>
+              <w:rPr>
+                <w:rFonts w:ascii="Calibri" w:hAnsi="Calibri"/>
+                <w:b/>
+                <w:i w:val="0"/>
+                <w:color w:val="007A87"/>
+                <w:sz w:val="20"/>
+              </w:rPr>
+              <w:t xml:space="preserve">5. </w:t>
+            </w:r>
+            <w:r>
+              <w:rPr>
+                <w:rFonts w:ascii="Calibri" w:hAnsi="Calibri"/>
+                <w:b w:val="0"/>
+                <w:i w:val="0"/>
+                <w:color w:val="1A1A2E"/>
+                <w:sz w:val="20"/>
+              </w:rPr>
+              <w:t>5  — Five</w:t>
+            </w:r>
+          </w:p>
+          <w:p>
+            <w:pPr>
+              <w:spacing w:before="0" w:after="0"/>
+              <w:ind w:left="113"/>
+            </w:pPr>
+            <w:r>
+              <w:rPr>
+                <w:rFonts w:ascii="Calibri" w:hAnsi="Calibri"/>
+                <w:b/>
+                <w:i w:val="0"/>
+                <w:color w:val="007A87"/>
+                <w:sz w:val="18"/>
+              </w:rPr>
+              <w:t xml:space="preserve">Kanji:    </w:t>
+            </w:r>
+            <w:r>
+              <w:rPr>
+                <w:rFonts w:ascii="Calibri" w:hAnsi="Calibri"/>
+                <w:b w:val="0"/>
+                <w:i w:val="0"/>
+                <w:color w:val="1A1A2E"/>
+                <w:sz w:val="18"/>
+              </w:rPr>
+              <w:t>_____________________</w:t>
+            </w:r>
+          </w:p>
+          <w:p>
+            <w:pPr>
+              <w:spacing w:before="0" w:after="0"/>
+              <w:ind w:left="113"/>
+            </w:pPr>
+            <w:r>
+              <w:rPr>
+                <w:rFonts w:ascii="Calibri" w:hAnsi="Calibri"/>
+                <w:b/>
+                <w:i w:val="0"/>
+                <w:color w:val="007A87"/>
+                <w:sz w:val="18"/>
+              </w:rPr>
+              <w:t>Hiragana:</w:t>
+            </w:r>
+            <w:r>
+              <w:rPr>
+                <w:rFonts w:ascii="Calibri" w:hAnsi="Calibri"/>
+                <w:b w:val="0"/>
+                <w:i w:val="0"/>
+                <w:color w:val="1A1A2E"/>
+                <w:sz w:val="18"/>
+              </w:rPr>
+              <w:t>_____________________</w:t>
+            </w:r>
+          </w:p>
+          <w:p>
+            <w:pPr>
+              <w:spacing w:before="0" w:after="0"/>
+              <w:ind w:left="113"/>
+            </w:pPr>
+            <w:r>
+              <w:rPr>
+                <w:rFonts w:ascii="Calibri" w:hAnsi="Calibri"/>
+                <w:b/>
+                <w:i w:val="0"/>
+                <w:color w:val="007A87"/>
+                <w:sz w:val="18"/>
+              </w:rPr>
+              <w:t xml:space="preserve">Romaji:  </w:t>
+            </w:r>
+            <w:r>
+              <w:rPr>
+                <w:rFonts w:ascii="Calibri" w:hAnsi="Calibri"/>
+                <w:b w:val="0"/>
+                <w:i w:val="0"/>
+                <w:color w:val="1A1A2E"/>
+                <w:sz w:val="18"/>
+              </w:rPr>
+              <w:t>_____________________</w:t>
+            </w:r>
+            <w:r>
+              <w:rPr>
+                <w:rFonts w:ascii="Calibri" w:hAnsi="Calibri"/>
+                <w:b w:val="0"/>
+                <w:i/>
+                <w:color w:val="6B7B8D"/>
+                <w:sz w:val="14"/>
+              </w:rPr>
+              <w:t xml:space="preserve">  (go)</w:t>
+            </w:r>
+          </w:p>
+        </w:tc>
+        <w:tc>
+          <w:tcPr>
+            <w:tcW w:type="dxa" w:w="4986"/>
+            <w:tcBorders>
+              <w:top w:val="nil"/>
+              <w:left w:val="nil"/>
+              <w:bottom w:val="nil"/>
+              <w:right w:val="nil"/>
+            </w:tcBorders>
+            <w:shd w:val="clear" w:color="auto" w:fill="F0F6FA"/>
+            <w:vAlign w:val="top"/>
+          </w:tcPr>
+          <w:p>
+            <w:pPr>
+              <w:spacing w:before="40" w:after="0"/>
+            </w:pPr>
+            <w:r>
+              <w:rPr>
+                <w:rFonts w:ascii="Calibri" w:hAnsi="Calibri"/>
+                <w:b/>
+                <w:i w:val="0"/>
+                <w:color w:val="007A87"/>
+                <w:sz w:val="20"/>
+              </w:rPr>
+              <w:t xml:space="preserve">6. </w:t>
+            </w:r>
+            <w:r>
+              <w:rPr>
+                <w:rFonts w:ascii="Calibri" w:hAnsi="Calibri"/>
+                <w:b w:val="0"/>
+                <w:i w:val="0"/>
+                <w:color w:val="1A1A2E"/>
+                <w:sz w:val="20"/>
+              </w:rPr>
+              <w:t>6  — Six</w:t>
+            </w:r>
+          </w:p>
+          <w:p>
+            <w:pPr>
+              <w:spacing w:before="0" w:after="0"/>
+              <w:ind w:left="113"/>
+            </w:pPr>
+            <w:r>
+              <w:rPr>
+                <w:rFonts w:ascii="Calibri" w:hAnsi="Calibri"/>
+                <w:b/>
+                <w:i w:val="0"/>
+                <w:color w:val="007A87"/>
+                <w:sz w:val="18"/>
+              </w:rPr>
+              <w:t xml:space="preserve">Kanji:    </w:t>
+            </w:r>
+            <w:r>
+              <w:rPr>
+                <w:rFonts w:ascii="Calibri" w:hAnsi="Calibri"/>
+                <w:b w:val="0"/>
+                <w:i w:val="0"/>
+                <w:color w:val="1A1A2E"/>
+                <w:sz w:val="18"/>
+              </w:rPr>
+              <w:t>_____________________</w:t>
+            </w:r>
+          </w:p>
+          <w:p>
+            <w:pPr>
+              <w:spacing w:before="0" w:after="0"/>
+              <w:ind w:left="113"/>
+            </w:pPr>
+            <w:r>
+              <w:rPr>
+                <w:rFonts w:ascii="Calibri" w:hAnsi="Calibri"/>
+                <w:b/>
+                <w:i w:val="0"/>
+                <w:color w:val="007A87"/>
+                <w:sz w:val="18"/>
+              </w:rPr>
+              <w:t>Hiragana:</w:t>
+            </w:r>
+            <w:r>
+              <w:rPr>
+                <w:rFonts w:ascii="Calibri" w:hAnsi="Calibri"/>
+                <w:b w:val="0"/>
+                <w:i w:val="0"/>
+                <w:color w:val="1A1A2E"/>
+                <w:sz w:val="18"/>
+              </w:rPr>
+              <w:t>_____________________</w:t>
+            </w:r>
+          </w:p>
+          <w:p>
+            <w:pPr>
+              <w:spacing w:before="0" w:after="0"/>
+              <w:ind w:left="113"/>
+            </w:pPr>
+            <w:r>
+              <w:rPr>
+                <w:rFonts w:ascii="Calibri" w:hAnsi="Calibri"/>
+                <w:b/>
+                <w:i w:val="0"/>
+                <w:color w:val="007A87"/>
+                <w:sz w:val="18"/>
+              </w:rPr>
+              <w:t xml:space="preserve">Romaji:  </w:t>
+            </w:r>
+            <w:r>
+              <w:rPr>
+                <w:rFonts w:ascii="Calibri" w:hAnsi="Calibri"/>
+                <w:b w:val="0"/>
+                <w:i w:val="0"/>
+                <w:color w:val="1A1A2E"/>
+                <w:sz w:val="18"/>
+              </w:rPr>
+              <w:t>_____________________</w:t>
+            </w:r>
+            <w:r>
+              <w:rPr>
+                <w:rFonts w:ascii="Calibri" w:hAnsi="Calibri"/>
+                <w:b w:val="0"/>
+                <w:i/>
+                <w:color w:val="6B7B8D"/>
+                <w:sz w:val="14"/>
+              </w:rPr>
+              <w:t xml:space="preserve">  (roku)</w:t>
+            </w:r>
+          </w:p>
+        </w:tc>
+      </w:tr>
+      <w:tr>
+        <w:tc>
+          <w:tcPr>
+            <w:tcW w:type="dxa" w:w="4986"/>
+            <w:tcBorders>
+              <w:top w:val="nil"/>
+              <w:left w:val="nil"/>
+              <w:bottom w:val="nil"/>
+              <w:right w:val="nil"/>
+            </w:tcBorders>
+            <w:shd w:val="clear" w:color="auto" w:fill="FFFFFF"/>
+            <w:vAlign w:val="top"/>
+          </w:tcPr>
+          <w:p>
+            <w:pPr>
+              <w:spacing w:before="40" w:after="0"/>
+            </w:pPr>
+            <w:r>
+              <w:rPr>
+                <w:rFonts w:ascii="Calibri" w:hAnsi="Calibri"/>
+                <w:b/>
+                <w:i w:val="0"/>
+                <w:color w:val="007A87"/>
+                <w:sz w:val="20"/>
+              </w:rPr>
+              <w:t xml:space="preserve">7. </w:t>
+            </w:r>
+            <w:r>
+              <w:rPr>
+                <w:rFonts w:ascii="Calibri" w:hAnsi="Calibri"/>
+                <w:b w:val="0"/>
+                <w:i w:val="0"/>
+                <w:color w:val="1A1A2E"/>
+                <w:sz w:val="20"/>
+              </w:rPr>
+              <w:t>7  — Seven</w:t>
+            </w:r>
+          </w:p>
+          <w:p>
+            <w:pPr>
+              <w:spacing w:before="0" w:after="20"/>
+            </w:pPr>
+            <w:r>
+              <w:rPr>
+                <w:rFonts w:ascii="Calibri" w:hAnsi="Calibri"/>
+                <w:b w:val="0"/>
+                <w:i/>
+                <w:color w:val="6B7B8D"/>
+                <w:sz w:val="14"/>
+              </w:rPr>
+              <w:t>★ なな is more common in daily speech.</w:t>
+            </w:r>
+          </w:p>
+          <w:p>
+            <w:pPr>
+              <w:spacing w:before="0" w:after="0"/>
+              <w:ind w:left="113"/>
+            </w:pPr>
+            <w:r>
+              <w:rPr>
+                <w:rFonts w:ascii="Calibri" w:hAnsi="Calibri"/>
+                <w:b/>
+                <w:i w:val="0"/>
+                <w:color w:val="007A87"/>
+                <w:sz w:val="18"/>
+              </w:rPr>
+              <w:t xml:space="preserve">Kanji:    </w:t>
+            </w:r>
+            <w:r>
+              <w:rPr>
+                <w:rFonts w:ascii="Calibri" w:hAnsi="Calibri"/>
+                <w:b w:val="0"/>
+                <w:i w:val="0"/>
+                <w:color w:val="1A1A2E"/>
+                <w:sz w:val="18"/>
+              </w:rPr>
+              <w:t>_____________________</w:t>
+            </w:r>
+          </w:p>
+          <w:p>
+            <w:pPr>
+              <w:spacing w:before="0" w:after="0"/>
+              <w:ind w:left="113"/>
+            </w:pPr>
+            <w:r>
+              <w:rPr>
+                <w:rFonts w:ascii="Calibri" w:hAnsi="Calibri"/>
+                <w:b/>
+                <w:i w:val="0"/>
+                <w:color w:val="007A87"/>
+                <w:sz w:val="18"/>
+              </w:rPr>
+              <w:t>Hiragana:</w:t>
+            </w:r>
+            <w:r>
+              <w:rPr>
+                <w:rFonts w:ascii="Calibri" w:hAnsi="Calibri"/>
+                <w:b w:val="0"/>
+                <w:i w:val="0"/>
+                <w:color w:val="1A1A2E"/>
+                <w:sz w:val="18"/>
+              </w:rPr>
+              <w:t>_____________________</w:t>
+            </w:r>
+          </w:p>
+          <w:p>
+            <w:pPr>
+              <w:spacing w:before="0" w:after="0"/>
+              <w:ind w:left="113"/>
+            </w:pPr>
+            <w:r>
+              <w:rPr>
+                <w:rFonts w:ascii="Calibri" w:hAnsi="Calibri"/>
+                <w:b/>
+                <w:i w:val="0"/>
+                <w:color w:val="007A87"/>
+                <w:sz w:val="18"/>
+              </w:rPr>
+              <w:t xml:space="preserve">Romaji:  </w:t>
+            </w:r>
+            <w:r>
+              <w:rPr>
+                <w:rFonts w:ascii="Calibri" w:hAnsi="Calibri"/>
+                <w:b w:val="0"/>
+                <w:i w:val="0"/>
+                <w:color w:val="1A1A2E"/>
+                <w:sz w:val="18"/>
+              </w:rPr>
+              <w:t>_____________________</w:t>
+            </w:r>
+            <w:r>
+              <w:rPr>
+                <w:rFonts w:ascii="Calibri" w:hAnsi="Calibri"/>
+                <w:b w:val="0"/>
+                <w:i/>
+                <w:color w:val="6B7B8D"/>
+                <w:sz w:val="14"/>
+              </w:rPr>
+              <w:t xml:space="preserve">  (shichi / nana)</w:t>
+            </w:r>
+          </w:p>
+        </w:tc>
+        <w:tc>
+          <w:tcPr>
+            <w:tcW w:type="dxa" w:w="4986"/>
+            <w:tcBorders>
+              <w:top w:val="nil"/>
+              <w:left w:val="nil"/>
+              <w:bottom w:val="nil"/>
+              <w:right w:val="nil"/>
+            </w:tcBorders>
+            <w:shd w:val="clear" w:color="auto" w:fill="FFFFFF"/>
+            <w:vAlign w:val="top"/>
+          </w:tcPr>
+          <w:p>
+            <w:pPr>
+              <w:spacing w:before="40" w:after="0"/>
+            </w:pPr>
+            <w:r>
+              <w:rPr>
+                <w:rFonts w:ascii="Calibri" w:hAnsi="Calibri"/>
+                <w:b/>
+                <w:i w:val="0"/>
+                <w:color w:val="007A87"/>
+                <w:sz w:val="20"/>
+              </w:rPr>
+              <w:t xml:space="preserve">8. </w:t>
+            </w:r>
+            <w:r>
+              <w:rPr>
+                <w:rFonts w:ascii="Calibri" w:hAnsi="Calibri"/>
+                <w:b w:val="0"/>
+                <w:i w:val="0"/>
+                <w:color w:val="1A1A2E"/>
+                <w:sz w:val="20"/>
+              </w:rPr>
+              <w:t>8  — Eight</w:t>
+            </w:r>
+          </w:p>
+          <w:p>
+            <w:pPr>
+              <w:spacing w:before="0" w:after="0"/>
+              <w:ind w:left="113"/>
+            </w:pPr>
+            <w:r>
+              <w:rPr>
+                <w:rFonts w:ascii="Calibri" w:hAnsi="Calibri"/>
+                <w:b/>
+                <w:i w:val="0"/>
+                <w:color w:val="007A87"/>
+                <w:sz w:val="18"/>
+              </w:rPr>
+              <w:t xml:space="preserve">Kanji:    </w:t>
+            </w:r>
+            <w:r>
+              <w:rPr>
+                <w:rFonts w:ascii="Calibri" w:hAnsi="Calibri"/>
+                <w:b w:val="0"/>
+                <w:i w:val="0"/>
+                <w:color w:val="1A1A2E"/>
+                <w:sz w:val="18"/>
+              </w:rPr>
+              <w:t>_____________________</w:t>
+            </w:r>
+          </w:p>
+          <w:p>
+            <w:pPr>
+              <w:spacing w:before="0" w:after="0"/>
+              <w:ind w:left="113"/>
+            </w:pPr>
+            <w:r>
+              <w:rPr>
+                <w:rFonts w:ascii="Calibri" w:hAnsi="Calibri"/>
+                <w:b/>
+                <w:i w:val="0"/>
+                <w:color w:val="007A87"/>
+                <w:sz w:val="18"/>
+              </w:rPr>
+              <w:t>Hiragana:</w:t>
+            </w:r>
+            <w:r>
+              <w:rPr>
+                <w:rFonts w:ascii="Calibri" w:hAnsi="Calibri"/>
+                <w:b w:val="0"/>
+                <w:i w:val="0"/>
+                <w:color w:val="1A1A2E"/>
+                <w:sz w:val="18"/>
+              </w:rPr>
+              <w:t>_____________________</w:t>
+            </w:r>
+          </w:p>
+          <w:p>
+            <w:pPr>
+              <w:spacing w:before="0" w:after="0"/>
+              <w:ind w:left="113"/>
+            </w:pPr>
+            <w:r>
+              <w:rPr>
+                <w:rFonts w:ascii="Calibri" w:hAnsi="Calibri"/>
+                <w:b/>
+                <w:i w:val="0"/>
+                <w:color w:val="007A87"/>
+                <w:sz w:val="18"/>
+              </w:rPr>
+              <w:t xml:space="preserve">Romaji:  </w:t>
+            </w:r>
+            <w:r>
+              <w:rPr>
+                <w:rFonts w:ascii="Calibri" w:hAnsi="Calibri"/>
+                <w:b w:val="0"/>
+                <w:i w:val="0"/>
+                <w:color w:val="1A1A2E"/>
+                <w:sz w:val="18"/>
+              </w:rPr>
+              <w:t>_____________________</w:t>
+            </w:r>
+            <w:r>
+              <w:rPr>
+                <w:rFonts w:ascii="Calibri" w:hAnsi="Calibri"/>
+                <w:b w:val="0"/>
+                <w:i/>
+                <w:color w:val="6B7B8D"/>
+                <w:sz w:val="14"/>
+              </w:rPr>
+              <w:t xml:space="preserve">  (hachi)</w:t>
+            </w:r>
+          </w:p>
+        </w:tc>
+      </w:tr>
+      <w:tr>
+        <w:tc>
+          <w:tcPr>
+            <w:tcW w:type="dxa" w:w="4986"/>
+            <w:tcBorders>
+              <w:top w:val="nil"/>
+              <w:left w:val="nil"/>
+              <w:bottom w:val="nil"/>
+              <w:right w:val="nil"/>
+            </w:tcBorders>
+            <w:shd w:val="clear" w:color="auto" w:fill="F0F6FA"/>
+            <w:vAlign w:val="top"/>
+          </w:tcPr>
+          <w:p>
+            <w:pPr>
+              <w:spacing w:before="40" w:after="0"/>
+            </w:pPr>
+            <w:r>
+              <w:rPr>
+                <w:rFonts w:ascii="Calibri" w:hAnsi="Calibri"/>
+                <w:b/>
+                <w:i w:val="0"/>
+                <w:color w:val="007A87"/>
+                <w:sz w:val="20"/>
+              </w:rPr>
+              <w:t xml:space="preserve">9. </w:t>
+            </w:r>
+            <w:r>
+              <w:rPr>
+                <w:rFonts w:ascii="Calibri" w:hAnsi="Calibri"/>
+                <w:b w:val="0"/>
+                <w:i w:val="0"/>
+                <w:color w:val="1A1A2E"/>
+                <w:sz w:val="20"/>
+              </w:rPr>
+              <w:t>9  — Nine</w:t>
+            </w:r>
+          </w:p>
+          <w:p>
+            <w:pPr>
+              <w:spacing w:before="0" w:after="20"/>
+            </w:pPr>
+            <w:r>
+              <w:rPr>
+                <w:rFonts w:ascii="Calibri" w:hAnsi="Calibri"/>
+                <w:b w:val="0"/>
+                <w:i/>
+                <w:color w:val="6B7B8D"/>
+                <w:sz w:val="14"/>
+              </w:rPr>
+              <w:t>★ きゅう is preferred in most contexts.</w:t>
+            </w:r>
+          </w:p>
+          <w:p>
+            <w:pPr>
+              <w:spacing w:before="0" w:after="0"/>
+              <w:ind w:left="113"/>
+            </w:pPr>
+            <w:r>
+              <w:rPr>
+                <w:rFonts w:ascii="Calibri" w:hAnsi="Calibri"/>
+                <w:b/>
+                <w:i w:val="0"/>
+                <w:color w:val="007A87"/>
+                <w:sz w:val="18"/>
+              </w:rPr>
+              <w:t xml:space="preserve">Kanji:    </w:t>
+            </w:r>
+            <w:r>
+              <w:rPr>
+                <w:rFonts w:ascii="Calibri" w:hAnsi="Calibri"/>
+                <w:b w:val="0"/>
+                <w:i w:val="0"/>
+                <w:color w:val="1A1A2E"/>
+                <w:sz w:val="18"/>
+              </w:rPr>
+              <w:t>_____________________</w:t>
+            </w:r>
+          </w:p>
+          <w:p>
+            <w:pPr>
+              <w:spacing w:before="0" w:after="0"/>
+              <w:ind w:left="113"/>
+            </w:pPr>
+            <w:r>
+              <w:rPr>
+                <w:rFonts w:ascii="Calibri" w:hAnsi="Calibri"/>
+                <w:b/>
+                <w:i w:val="0"/>
+                <w:color w:val="007A87"/>
+                <w:sz w:val="18"/>
+              </w:rPr>
+              <w:t>Hiragana:</w:t>
+            </w:r>
+            <w:r>
+              <w:rPr>
+                <w:rFonts w:ascii="Calibri" w:hAnsi="Calibri"/>
+                <w:b w:val="0"/>
+                <w:i w:val="0"/>
+                <w:color w:val="1A1A2E"/>
+                <w:sz w:val="18"/>
+              </w:rPr>
+              <w:t>_____________________</w:t>
+            </w:r>
+          </w:p>
+          <w:p>
+            <w:pPr>
+              <w:spacing w:before="0" w:after="0"/>
+              <w:ind w:left="113"/>
+            </w:pPr>
+            <w:r>
+              <w:rPr>
+                <w:rFonts w:ascii="Calibri" w:hAnsi="Calibri"/>
+                <w:b/>
+                <w:i w:val="0"/>
+                <w:color w:val="007A87"/>
+                <w:sz w:val="18"/>
+              </w:rPr>
+              <w:t xml:space="preserve">Romaji:  </w:t>
+            </w:r>
+            <w:r>
+              <w:rPr>
+                <w:rFonts w:ascii="Calibri" w:hAnsi="Calibri"/>
+                <w:b w:val="0"/>
+                <w:i w:val="0"/>
+                <w:color w:val="1A1A2E"/>
+                <w:sz w:val="18"/>
+              </w:rPr>
+              <w:t>_____________________</w:t>
+            </w:r>
+            <w:r>
+              <w:rPr>
+                <w:rFonts w:ascii="Calibri" w:hAnsi="Calibri"/>
+                <w:b w:val="0"/>
+                <w:i/>
+                <w:color w:val="6B7B8D"/>
+                <w:sz w:val="14"/>
+              </w:rPr>
+              <w:t xml:space="preserve">  (ku / kyuu)</w:t>
+            </w:r>
+          </w:p>
+        </w:tc>
+        <w:tc>
+          <w:tcPr>
+            <w:tcW w:type="dxa" w:w="4986"/>
+            <w:tcBorders>
+              <w:top w:val="nil"/>
+              <w:left w:val="nil"/>
+              <w:bottom w:val="nil"/>
+              <w:right w:val="nil"/>
+            </w:tcBorders>
+            <w:shd w:val="clear" w:color="auto" w:fill="F0F6FA"/>
+            <w:vAlign w:val="top"/>
+          </w:tcPr>
+          <w:p>
+            <w:pPr>
+              <w:spacing w:before="40" w:after="0"/>
+            </w:pPr>
+            <w:r>
+              <w:rPr>
+                <w:rFonts w:ascii="Calibri" w:hAnsi="Calibri"/>
+                <w:b/>
+                <w:i w:val="0"/>
+                <w:color w:val="007A87"/>
+                <w:sz w:val="20"/>
+              </w:rPr>
+              <w:t xml:space="preserve">10. </w:t>
+            </w:r>
+            <w:r>
+              <w:rPr>
+                <w:rFonts w:ascii="Calibri" w:hAnsi="Calibri"/>
+                <w:b w:val="0"/>
+                <w:i w:val="0"/>
+                <w:color w:val="1A1A2E"/>
+                <w:sz w:val="20"/>
+              </w:rPr>
+              <w:t>10 — Ten</w:t>
+            </w:r>
+          </w:p>
+          <w:p>
+            <w:pPr>
+              <w:spacing w:before="0" w:after="0"/>
+              <w:ind w:left="113"/>
+            </w:pPr>
+            <w:r>
+              <w:rPr>
+                <w:rFonts w:ascii="Calibri" w:hAnsi="Calibri"/>
+                <w:b/>
+                <w:i w:val="0"/>
+                <w:color w:val="007A87"/>
+                <w:sz w:val="18"/>
+              </w:rPr>
+              <w:t xml:space="preserve">Kanji:    </w:t>
+            </w:r>
+            <w:r>
+              <w:rPr>
+                <w:rFonts w:ascii="Calibri" w:hAnsi="Calibri"/>
+                <w:b w:val="0"/>
+                <w:i w:val="0"/>
+                <w:color w:val="1A1A2E"/>
+                <w:sz w:val="18"/>
+              </w:rPr>
+              <w:t>_____________________</w:t>
+            </w:r>
+          </w:p>
+          <w:p>
+            <w:pPr>
+              <w:spacing w:before="0" w:after="0"/>
+              <w:ind w:left="113"/>
+            </w:pPr>
+            <w:r>
+              <w:rPr>
+                <w:rFonts w:ascii="Calibri" w:hAnsi="Calibri"/>
+                <w:b/>
+                <w:i w:val="0"/>
+                <w:color w:val="007A87"/>
+                <w:sz w:val="18"/>
+              </w:rPr>
+              <w:t>Hiragana:</w:t>
+            </w:r>
+            <w:r>
+              <w:rPr>
+                <w:rFonts w:ascii="Calibri" w:hAnsi="Calibri"/>
+                <w:b w:val="0"/>
+                <w:i w:val="0"/>
+                <w:color w:val="1A1A2E"/>
+                <w:sz w:val="18"/>
+              </w:rPr>
+              <w:t>_____________________</w:t>
+            </w:r>
+          </w:p>
+          <w:p>
+            <w:pPr>
+              <w:spacing w:before="0" w:after="0"/>
+              <w:ind w:left="113"/>
+            </w:pPr>
+            <w:r>
+              <w:rPr>
+                <w:rFonts w:ascii="Calibri" w:hAnsi="Calibri"/>
+                <w:b/>
+                <w:i w:val="0"/>
+                <w:color w:val="007A87"/>
+                <w:sz w:val="18"/>
+              </w:rPr>
+              <w:t xml:space="preserve">Romaji:  </w:t>
+            </w:r>
+            <w:r>
+              <w:rPr>
+                <w:rFonts w:ascii="Calibri" w:hAnsi="Calibri"/>
+                <w:b w:val="0"/>
+                <w:i w:val="0"/>
+                <w:color w:val="1A1A2E"/>
+                <w:sz w:val="18"/>
+              </w:rPr>
+              <w:t>_____________________</w:t>
+            </w:r>
+            <w:r>
+              <w:rPr>
+                <w:rFonts w:ascii="Calibri" w:hAnsi="Calibri"/>
+                <w:b w:val="0"/>
+                <w:i/>
+                <w:color w:val="6B7B8D"/>
+                <w:sz w:val="14"/>
+              </w:rPr>
+              <w:t xml:space="preserve">  (juu)</w:t>
+            </w:r>
+          </w:p>
+        </w:tc>
+      </w:tr>
+      <w:tr>
+        <w:tc>
+          <w:tcPr>
+            <w:tcW w:type="dxa" w:w="4986"/>
+            <w:tcBorders>
+              <w:top w:val="nil"/>
+              <w:left w:val="nil"/>
+              <w:bottom w:val="nil"/>
+              <w:right w:val="nil"/>
+            </w:tcBorders>
+            <w:shd w:val="clear" w:color="auto" w:fill="FFFFFF"/>
+            <w:vAlign w:val="top"/>
+          </w:tcPr>
+          <w:p>
+            <w:pPr>
+              <w:spacing w:before="40" w:after="0"/>
+            </w:pPr>
+            <w:r>
+              <w:rPr>
+                <w:rFonts w:ascii="Calibri" w:hAnsi="Calibri"/>
+                <w:b/>
+                <w:i w:val="0"/>
+                <w:color w:val="007A87"/>
+                <w:sz w:val="20"/>
+              </w:rPr>
+              <w:t xml:space="preserve">11. </w:t>
+            </w:r>
+            <w:r>
+              <w:rPr>
+                <w:rFonts w:ascii="Calibri" w:hAnsi="Calibri"/>
+                <w:b w:val="0"/>
+                <w:i w:val="0"/>
+                <w:color w:val="1A1A2E"/>
+                <w:sz w:val="20"/>
+              </w:rPr>
+              <w:t>11 — Eleven</w:t>
+            </w:r>
+          </w:p>
+          <w:p>
+            <w:pPr>
+              <w:spacing w:before="0" w:after="20"/>
+            </w:pPr>
+            <w:r>
+              <w:rPr>
+                <w:rFonts w:ascii="Calibri" w:hAnsi="Calibri"/>
+                <w:b w:val="0"/>
+                <w:i/>
+                <w:color w:val="6B7B8D"/>
+                <w:sz w:val="14"/>
+              </w:rPr>
+              <w:t>★ Ten + one.</w:t>
+            </w:r>
+          </w:p>
+          <w:p>
+            <w:pPr>
+              <w:spacing w:before="0" w:after="0"/>
+              <w:ind w:left="113"/>
+            </w:pPr>
+            <w:r>
+              <w:rPr>
+                <w:rFonts w:ascii="Calibri" w:hAnsi="Calibri"/>
+                <w:b/>
+                <w:i w:val="0"/>
+                <w:color w:val="007A87"/>
+                <w:sz w:val="18"/>
+              </w:rPr>
+              <w:t xml:space="preserve">Kanji:    </w:t>
+            </w:r>
+            <w:r>
+              <w:rPr>
+                <w:rFonts w:ascii="Calibri" w:hAnsi="Calibri"/>
+                <w:b w:val="0"/>
+                <w:i w:val="0"/>
+                <w:color w:val="1A1A2E"/>
+                <w:sz w:val="18"/>
+              </w:rPr>
+              <w:t>_____________________</w:t>
+            </w:r>
+          </w:p>
+          <w:p>
+            <w:pPr>
+              <w:spacing w:before="0" w:after="0"/>
+              <w:ind w:left="113"/>
+            </w:pPr>
+            <w:r>
+              <w:rPr>
+                <w:rFonts w:ascii="Calibri" w:hAnsi="Calibri"/>
+                <w:b/>
+                <w:i w:val="0"/>
+                <w:color w:val="007A87"/>
+                <w:sz w:val="18"/>
+              </w:rPr>
+              <w:t>Hiragana:</w:t>
+            </w:r>
+            <w:r>
+              <w:rPr>
+                <w:rFonts w:ascii="Calibri" w:hAnsi="Calibri"/>
+                <w:b w:val="0"/>
+                <w:i w:val="0"/>
+                <w:color w:val="1A1A2E"/>
+                <w:sz w:val="18"/>
+              </w:rPr>
+              <w:t>_____________________</w:t>
+            </w:r>
+          </w:p>
+          <w:p>
+            <w:pPr>
+              <w:spacing w:before="0" w:after="0"/>
+              <w:ind w:left="113"/>
+            </w:pPr>
+            <w:r>
+              <w:rPr>
+                <w:rFonts w:ascii="Calibri" w:hAnsi="Calibri"/>
+                <w:b/>
+                <w:i w:val="0"/>
+                <w:color w:val="007A87"/>
+                <w:sz w:val="18"/>
+              </w:rPr>
+              <w:t xml:space="preserve">Romaji:  </w:t>
+            </w:r>
+            <w:r>
+              <w:rPr>
+                <w:rFonts w:ascii="Calibri" w:hAnsi="Calibri"/>
+                <w:b w:val="0"/>
+                <w:i w:val="0"/>
+                <w:color w:val="1A1A2E"/>
+                <w:sz w:val="18"/>
+              </w:rPr>
+              <w:t>_____________________</w:t>
+            </w:r>
+            <w:r>
+              <w:rPr>
+                <w:rFonts w:ascii="Calibri" w:hAnsi="Calibri"/>
+                <w:b w:val="0"/>
+                <w:i/>
+                <w:color w:val="6B7B8D"/>
+                <w:sz w:val="14"/>
+              </w:rPr>
+              <w:t xml:space="preserve">  (juu-ichi)</w:t>
+            </w:r>
+          </w:p>
+        </w:tc>
+        <w:tc>
+          <w:tcPr>
+            <w:tcW w:type="dxa" w:w="4986"/>
+            <w:tcBorders>
+              <w:top w:val="nil"/>
+              <w:left w:val="nil"/>
+              <w:bottom w:val="nil"/>
+              <w:right w:val="nil"/>
+            </w:tcBorders>
+            <w:shd w:val="clear" w:color="auto" w:fill="FFFFFF"/>
+            <w:vAlign w:val="top"/>
+          </w:tcPr>
+          <w:p>
+            <w:pPr>
+              <w:spacing w:before="40" w:after="0"/>
+            </w:pPr>
+            <w:r>
+              <w:rPr>
+                <w:rFonts w:ascii="Calibri" w:hAnsi="Calibri"/>
+                <w:b/>
+                <w:i w:val="0"/>
+                <w:color w:val="007A87"/>
+                <w:sz w:val="20"/>
+              </w:rPr>
+              <w:t xml:space="preserve">12. </w:t>
+            </w:r>
+            <w:r>
+              <w:rPr>
+                <w:rFonts w:ascii="Calibri" w:hAnsi="Calibri"/>
+                <w:b w:val="0"/>
+                <w:i w:val="0"/>
+                <w:color w:val="1A1A2E"/>
+                <w:sz w:val="20"/>
+              </w:rPr>
+              <w:t>12 — Twelve</w:t>
+            </w:r>
+          </w:p>
+          <w:p>
+            <w:pPr>
+              <w:spacing w:before="0" w:after="20"/>
+            </w:pPr>
+            <w:r>
+              <w:rPr>
+                <w:rFonts w:ascii="Calibri" w:hAnsi="Calibri"/>
+                <w:b w:val="0"/>
+                <w:i/>
+                <w:color w:val="6B7B8D"/>
+                <w:sz w:val="14"/>
+              </w:rPr>
+              <w:t>★ Ten + two.</w:t>
+            </w:r>
+          </w:p>
+          <w:p>
+            <w:pPr>
+              <w:spacing w:before="0" w:after="0"/>
+              <w:ind w:left="113"/>
+            </w:pPr>
+            <w:r>
+              <w:rPr>
+                <w:rFonts w:ascii="Calibri" w:hAnsi="Calibri"/>
+                <w:b/>
+                <w:i w:val="0"/>
+                <w:color w:val="007A87"/>
+                <w:sz w:val="18"/>
+              </w:rPr>
+              <w:t xml:space="preserve">Kanji:    </w:t>
+            </w:r>
+            <w:r>
+              <w:rPr>
+                <w:rFonts w:ascii="Calibri" w:hAnsi="Calibri"/>
+                <w:b w:val="0"/>
+                <w:i w:val="0"/>
+                <w:color w:val="1A1A2E"/>
+                <w:sz w:val="18"/>
+              </w:rPr>
+              <w:t>_____________________</w:t>
+            </w:r>
+          </w:p>
+          <w:p>
+            <w:pPr>
+              <w:spacing w:before="0" w:after="0"/>
+              <w:ind w:left="113"/>
+            </w:pPr>
+            <w:r>
+              <w:rPr>
+                <w:rFonts w:ascii="Calibri" w:hAnsi="Calibri"/>
+                <w:b/>
+                <w:i w:val="0"/>
+                <w:color w:val="007A87"/>
+                <w:sz w:val="18"/>
+              </w:rPr>
+              <w:t>Hiragana:</w:t>
+            </w:r>
+            <w:r>
+              <w:rPr>
+                <w:rFonts w:ascii="Calibri" w:hAnsi="Calibri"/>
+                <w:b w:val="0"/>
+                <w:i w:val="0"/>
+                <w:color w:val="1A1A2E"/>
+                <w:sz w:val="18"/>
+              </w:rPr>
+              <w:t>_____________________</w:t>
+            </w:r>
+          </w:p>
+          <w:p>
+            <w:pPr>
+              <w:spacing w:before="0" w:after="0"/>
+              <w:ind w:left="113"/>
+            </w:pPr>
+            <w:r>
+              <w:rPr>
+                <w:rFonts w:ascii="Calibri" w:hAnsi="Calibri"/>
+                <w:b/>
+                <w:i w:val="0"/>
+                <w:color w:val="007A87"/>
+                <w:sz w:val="18"/>
+              </w:rPr>
+              <w:t xml:space="preserve">Romaji:  </w:t>
+            </w:r>
+            <w:r>
+              <w:rPr>
+                <w:rFonts w:ascii="Calibri" w:hAnsi="Calibri"/>
+                <w:b w:val="0"/>
+                <w:i w:val="0"/>
+                <w:color w:val="1A1A2E"/>
+                <w:sz w:val="18"/>
+              </w:rPr>
+              <w:t>_____________________</w:t>
+            </w:r>
+            <w:r>
+              <w:rPr>
+                <w:rFonts w:ascii="Calibri" w:hAnsi="Calibri"/>
+                <w:b w:val="0"/>
+                <w:i/>
+                <w:color w:val="6B7B8D"/>
+                <w:sz w:val="14"/>
+              </w:rPr>
+              <w:t xml:space="preserve">  (juu-ni)</w:t>
+            </w:r>
+          </w:p>
+        </w:tc>
+      </w:tr>
+      <w:tr>
+        <w:tc>
+          <w:tcPr>
+            <w:tcW w:type="dxa" w:w="4986"/>
+            <w:tcBorders>
+              <w:top w:val="nil"/>
+              <w:left w:val="nil"/>
+              <w:bottom w:val="nil"/>
+              <w:right w:val="nil"/>
+            </w:tcBorders>
+            <w:shd w:val="clear" w:color="auto" w:fill="F0F6FA"/>
+            <w:vAlign w:val="top"/>
+          </w:tcPr>
+          <w:p>
+            <w:pPr>
+              <w:spacing w:before="40" w:after="0"/>
+            </w:pPr>
+            <w:r>
+              <w:rPr>
+                <w:rFonts w:ascii="Calibri" w:hAnsi="Calibri"/>
+                <w:b/>
+                <w:i w:val="0"/>
+                <w:color w:val="007A87"/>
+                <w:sz w:val="20"/>
+              </w:rPr>
+              <w:t xml:space="preserve">13. </w:t>
+            </w:r>
+            <w:r>
+              <w:rPr>
+                <w:rFonts w:ascii="Calibri" w:hAnsi="Calibri"/>
+                <w:b w:val="0"/>
+                <w:i w:val="0"/>
+                <w:color w:val="1A1A2E"/>
+                <w:sz w:val="20"/>
+              </w:rPr>
+              <w:t>20 — Twenty</w:t>
+            </w:r>
+          </w:p>
+          <w:p>
+            <w:pPr>
+              <w:spacing w:before="0" w:after="20"/>
+            </w:pPr>
+            <w:r>
+              <w:rPr>
+                <w:rFonts w:ascii="Calibri" w:hAnsi="Calibri"/>
+                <w:b w:val="0"/>
+                <w:i/>
+                <w:color w:val="6B7B8D"/>
+                <w:sz w:val="14"/>
+              </w:rPr>
+              <w:t>★ Two × ten.</w:t>
+            </w:r>
+          </w:p>
+          <w:p>
+            <w:pPr>
+              <w:spacing w:before="0" w:after="0"/>
+              <w:ind w:left="113"/>
+            </w:pPr>
+            <w:r>
+              <w:rPr>
+                <w:rFonts w:ascii="Calibri" w:hAnsi="Calibri"/>
+                <w:b/>
+                <w:i w:val="0"/>
+                <w:color w:val="007A87"/>
+                <w:sz w:val="18"/>
+              </w:rPr>
+              <w:t xml:space="preserve">Kanji:    </w:t>
+            </w:r>
+            <w:r>
+              <w:rPr>
+                <w:rFonts w:ascii="Calibri" w:hAnsi="Calibri"/>
+                <w:b w:val="0"/>
+                <w:i w:val="0"/>
+                <w:color w:val="1A1A2E"/>
+                <w:sz w:val="18"/>
+              </w:rPr>
+              <w:t>_____________________</w:t>
+            </w:r>
+          </w:p>
+          <w:p>
+            <w:pPr>
+              <w:spacing w:before="0" w:after="0"/>
+              <w:ind w:left="113"/>
+            </w:pPr>
+            <w:r>
+              <w:rPr>
+                <w:rFonts w:ascii="Calibri" w:hAnsi="Calibri"/>
+                <w:b/>
+                <w:i w:val="0"/>
+                <w:color w:val="007A87"/>
+                <w:sz w:val="18"/>
+              </w:rPr>
+              <w:t>Hiragana:</w:t>
+            </w:r>
+            <w:r>
+              <w:rPr>
+                <w:rFonts w:ascii="Calibri" w:hAnsi="Calibri"/>
+                <w:b w:val="0"/>
+                <w:i w:val="0"/>
+                <w:color w:val="1A1A2E"/>
+                <w:sz w:val="18"/>
+              </w:rPr>
+              <w:t>_____________________</w:t>
+            </w:r>
+          </w:p>
+          <w:p>
+            <w:pPr>
+              <w:spacing w:before="0" w:after="0"/>
+              <w:ind w:left="113"/>
+            </w:pPr>
+            <w:r>
+              <w:rPr>
+                <w:rFonts w:ascii="Calibri" w:hAnsi="Calibri"/>
+                <w:b/>
+                <w:i w:val="0"/>
+                <w:color w:val="007A87"/>
+                <w:sz w:val="18"/>
+              </w:rPr>
+              <w:t xml:space="preserve">Romaji:  </w:t>
+            </w:r>
+            <w:r>
+              <w:rPr>
+                <w:rFonts w:ascii="Calibri" w:hAnsi="Calibri"/>
+                <w:b w:val="0"/>
+                <w:i w:val="0"/>
+                <w:color w:val="1A1A2E"/>
+                <w:sz w:val="18"/>
+              </w:rPr>
+              <w:t>_____________________</w:t>
+            </w:r>
+            <w:r>
+              <w:rPr>
+                <w:rFonts w:ascii="Calibri" w:hAnsi="Calibri"/>
+                <w:b w:val="0"/>
+                <w:i/>
+                <w:color w:val="6B7B8D"/>
+                <w:sz w:val="14"/>
+              </w:rPr>
+              <w:t xml:space="preserve">  (ni-juu)</w:t>
+            </w:r>
+          </w:p>
+        </w:tc>
+        <w:tc>
+          <w:tcPr>
+            <w:tcW w:type="dxa" w:w="4986"/>
+            <w:tcBorders>
+              <w:top w:val="nil"/>
+              <w:left w:val="nil"/>
+              <w:bottom w:val="nil"/>
+              <w:right w:val="nil"/>
+            </w:tcBorders>
+            <w:shd w:val="clear" w:color="auto" w:fill="F0F6FA"/>
+            <w:vAlign w:val="top"/>
+          </w:tcPr>
+          <w:p>
+            <w:pPr>
+              <w:spacing w:before="40" w:after="0"/>
+            </w:pPr>
+            <w:r>
+              <w:rPr>
+                <w:rFonts w:ascii="Calibri" w:hAnsi="Calibri"/>
+                <w:b/>
+                <w:i w:val="0"/>
+                <w:color w:val="007A87"/>
+                <w:sz w:val="20"/>
+              </w:rPr>
+              <w:t xml:space="preserve">14. </w:t>
+            </w:r>
+            <w:r>
+              <w:rPr>
+                <w:rFonts w:ascii="Calibri" w:hAnsi="Calibri"/>
+                <w:b w:val="0"/>
+                <w:i w:val="0"/>
+                <w:color w:val="1A1A2E"/>
+                <w:sz w:val="20"/>
+              </w:rPr>
+              <w:t>30 — Thirty</w:t>
+            </w:r>
+          </w:p>
+          <w:p>
+            <w:pPr>
+              <w:spacing w:before="0" w:after="20"/>
+            </w:pPr>
+            <w:r>
+              <w:rPr>
+                <w:rFonts w:ascii="Calibri" w:hAnsi="Calibri"/>
+                <w:b w:val="0"/>
+                <w:i/>
+                <w:color w:val="6B7B8D"/>
+                <w:sz w:val="14"/>
+              </w:rPr>
+              <w:t>★ Three × ten.</w:t>
+            </w:r>
+          </w:p>
+          <w:p>
+            <w:pPr>
+              <w:spacing w:before="0" w:after="0"/>
+              <w:ind w:left="113"/>
+            </w:pPr>
+            <w:r>
+              <w:rPr>
+                <w:rFonts w:ascii="Calibri" w:hAnsi="Calibri"/>
+                <w:b/>
+                <w:i w:val="0"/>
+                <w:color w:val="007A87"/>
+                <w:sz w:val="18"/>
+              </w:rPr>
+              <w:t xml:space="preserve">Kanji:    </w:t>
+            </w:r>
+            <w:r>
+              <w:rPr>
+                <w:rFonts w:ascii="Calibri" w:hAnsi="Calibri"/>
+                <w:b w:val="0"/>
+                <w:i w:val="0"/>
+                <w:color w:val="1A1A2E"/>
+                <w:sz w:val="18"/>
+              </w:rPr>
+              <w:t>_____________________</w:t>
+            </w:r>
+          </w:p>
+          <w:p>
+            <w:pPr>
+              <w:spacing w:before="0" w:after="0"/>
+              <w:ind w:left="113"/>
+            </w:pPr>
+            <w:r>
+              <w:rPr>
+                <w:rFonts w:ascii="Calibri" w:hAnsi="Calibri"/>
+                <w:b/>
+                <w:i w:val="0"/>
+                <w:color w:val="007A87"/>
+                <w:sz w:val="18"/>
+              </w:rPr>
+              <w:t>Hiragana:</w:t>
+            </w:r>
+            <w:r>
+              <w:rPr>
+                <w:rFonts w:ascii="Calibri" w:hAnsi="Calibri"/>
+                <w:b w:val="0"/>
+                <w:i w:val="0"/>
+                <w:color w:val="1A1A2E"/>
+                <w:sz w:val="18"/>
+              </w:rPr>
+              <w:t>_____________________</w:t>
+            </w:r>
+          </w:p>
+          <w:p>
+            <w:pPr>
+              <w:spacing w:before="0" w:after="0"/>
+              <w:ind w:left="113"/>
+            </w:pPr>
+            <w:r>
+              <w:rPr>
+                <w:rFonts w:ascii="Calibri" w:hAnsi="Calibri"/>
+                <w:b/>
+                <w:i w:val="0"/>
+                <w:color w:val="007A87"/>
+                <w:sz w:val="18"/>
+              </w:rPr>
+              <w:t xml:space="preserve">Romaji:  </w:t>
+            </w:r>
+            <w:r>
+              <w:rPr>
+                <w:rFonts w:ascii="Calibri" w:hAnsi="Calibri"/>
+                <w:b w:val="0"/>
+                <w:i w:val="0"/>
+                <w:color w:val="1A1A2E"/>
+                <w:sz w:val="18"/>
+              </w:rPr>
+              <w:t>_____________________</w:t>
+            </w:r>
+            <w:r>
+              <w:rPr>
+                <w:rFonts w:ascii="Calibri" w:hAnsi="Calibri"/>
+                <w:b w:val="0"/>
+                <w:i/>
+                <w:color w:val="6B7B8D"/>
+                <w:sz w:val="14"/>
+              </w:rPr>
+              <w:t xml:space="preserve">  (san-juu)</w:t>
+            </w:r>
+          </w:p>
+        </w:tc>
+      </w:tr>
+      <w:tr>
+        <w:tc>
+          <w:tcPr>
+            <w:tcW w:type="dxa" w:w="4986"/>
+            <w:tcBorders>
+              <w:top w:val="nil"/>
+              <w:left w:val="nil"/>
+              <w:bottom w:val="nil"/>
+              <w:right w:val="nil"/>
+            </w:tcBorders>
+            <w:shd w:val="clear" w:color="auto" w:fill="FFFFFF"/>
+            <w:vAlign w:val="top"/>
+          </w:tcPr>
+          <w:p>
+            <w:pPr>
+              <w:spacing w:before="40" w:after="0"/>
+            </w:pPr>
+            <w:r>
+              <w:rPr>
+                <w:rFonts w:ascii="Calibri" w:hAnsi="Calibri"/>
+                <w:b/>
+                <w:i w:val="0"/>
+                <w:color w:val="007A87"/>
+                <w:sz w:val="20"/>
+              </w:rPr>
+              <w:t xml:space="preserve">15. </w:t>
+            </w:r>
+            <w:r>
+              <w:rPr>
+                <w:rFonts w:ascii="Calibri" w:hAnsi="Calibri"/>
+                <w:b w:val="0"/>
+                <w:i w:val="0"/>
+                <w:color w:val="1A1A2E"/>
+                <w:sz w:val="20"/>
+              </w:rPr>
+              <w:t>100 — One hundred</w:t>
+            </w:r>
+          </w:p>
+          <w:p>
+            <w:pPr>
+              <w:spacing w:before="0" w:after="20"/>
+            </w:pPr>
+            <w:r>
+              <w:rPr>
+                <w:rFonts w:ascii="Calibri" w:hAnsi="Calibri"/>
+                <w:b w:val="0"/>
+                <w:i/>
+                <w:color w:val="6B7B8D"/>
+                <w:sz w:val="14"/>
+              </w:rPr>
+              <w:t>★ New counter word.</w:t>
+            </w:r>
+          </w:p>
+          <w:p>
+            <w:pPr>
+              <w:spacing w:before="0" w:after="0"/>
+              <w:ind w:left="113"/>
+            </w:pPr>
+            <w:r>
+              <w:rPr>
+                <w:rFonts w:ascii="Calibri" w:hAnsi="Calibri"/>
+                <w:b/>
+                <w:i w:val="0"/>
+                <w:color w:val="007A87"/>
+                <w:sz w:val="18"/>
+              </w:rPr>
+              <w:t xml:space="preserve">Kanji:    </w:t>
+            </w:r>
+            <w:r>
+              <w:rPr>
+                <w:rFonts w:ascii="Calibri" w:hAnsi="Calibri"/>
+                <w:b w:val="0"/>
+                <w:i w:val="0"/>
+                <w:color w:val="1A1A2E"/>
+                <w:sz w:val="18"/>
+              </w:rPr>
+              <w:t>_____________________</w:t>
+            </w:r>
+          </w:p>
+          <w:p>
+            <w:pPr>
+              <w:spacing w:before="0" w:after="0"/>
+              <w:ind w:left="113"/>
+            </w:pPr>
+            <w:r>
+              <w:rPr>
+                <w:rFonts w:ascii="Calibri" w:hAnsi="Calibri"/>
+                <w:b/>
+                <w:i w:val="0"/>
+                <w:color w:val="007A87"/>
+                <w:sz w:val="18"/>
+              </w:rPr>
+              <w:t>Hiragana:</w:t>
+            </w:r>
+            <w:r>
+              <w:rPr>
+                <w:rFonts w:ascii="Calibri" w:hAnsi="Calibri"/>
+                <w:b w:val="0"/>
+                <w:i w:val="0"/>
+                <w:color w:val="1A1A2E"/>
+                <w:sz w:val="18"/>
+              </w:rPr>
+              <w:t>_____________________</w:t>
+            </w:r>
+          </w:p>
+          <w:p>
+            <w:pPr>
+              <w:spacing w:before="0" w:after="0"/>
+              <w:ind w:left="113"/>
+            </w:pPr>
+            <w:r>
+              <w:rPr>
+                <w:rFonts w:ascii="Calibri" w:hAnsi="Calibri"/>
+                <w:b/>
+                <w:i w:val="0"/>
+                <w:color w:val="007A87"/>
+                <w:sz w:val="18"/>
+              </w:rPr>
+              <w:t xml:space="preserve">Romaji:  </w:t>
+            </w:r>
+            <w:r>
+              <w:rPr>
+                <w:rFonts w:ascii="Calibri" w:hAnsi="Calibri"/>
+                <w:b w:val="0"/>
+                <w:i w:val="0"/>
+                <w:color w:val="1A1A2E"/>
+                <w:sz w:val="18"/>
+              </w:rPr>
+              <w:t>_____________________</w:t>
+            </w:r>
+            <w:r>
+              <w:rPr>
+                <w:rFonts w:ascii="Calibri" w:hAnsi="Calibri"/>
+                <w:b w:val="0"/>
+                <w:i/>
+                <w:color w:val="6B7B8D"/>
+                <w:sz w:val="14"/>
+              </w:rPr>
+              <w:t xml:space="preserve">  (hyaku)</w:t>
+            </w:r>
+          </w:p>
+        </w:tc>
+        <w:tc>
+          <w:tcPr>
+            <w:tcW w:type="dxa" w:w="4986"/>
+            <w:tcBorders>
+              <w:top w:val="nil"/>
+              <w:left w:val="nil"/>
+              <w:bottom w:val="nil"/>
+              <w:right w:val="nil"/>
+            </w:tcBorders>
+            <w:shd w:val="clear" w:color="auto" w:fill="FFFFFF"/>
+            <w:vAlign w:val="top"/>
+          </w:tcPr>
+          <w:p>
+            <w:pPr>
+              <w:spacing w:before="40" w:after="0"/>
+            </w:pPr>
+            <w:r>
+              <w:rPr>
+                <w:rFonts w:ascii="Calibri" w:hAnsi="Calibri"/>
+                <w:b/>
+                <w:i w:val="0"/>
+                <w:color w:val="007A87"/>
+                <w:sz w:val="20"/>
+              </w:rPr>
+              <w:t xml:space="preserve">16. </w:t>
+            </w:r>
+            <w:r>
+              <w:rPr>
+                <w:rFonts w:ascii="Calibri" w:hAnsi="Calibri"/>
+                <w:b w:val="0"/>
+                <w:i w:val="0"/>
+                <w:color w:val="1A1A2E"/>
+                <w:sz w:val="20"/>
+              </w:rPr>
+              <w:t>1000 — One thousand</w:t>
+            </w:r>
+          </w:p>
+          <w:p>
+            <w:pPr>
+              <w:spacing w:before="0" w:after="20"/>
+            </w:pPr>
+            <w:r>
+              <w:rPr>
+                <w:rFonts w:ascii="Calibri" w:hAnsi="Calibri"/>
+                <w:b w:val="0"/>
+                <w:i/>
+                <w:color w:val="6B7B8D"/>
+                <w:sz w:val="14"/>
+              </w:rPr>
+              <w:t>★ New counter word.</w:t>
+            </w:r>
+          </w:p>
+          <w:p>
+            <w:pPr>
+              <w:spacing w:before="0" w:after="0"/>
+              <w:ind w:left="113"/>
+            </w:pPr>
+            <w:r>
+              <w:rPr>
+                <w:rFonts w:ascii="Calibri" w:hAnsi="Calibri"/>
+                <w:b/>
+                <w:i w:val="0"/>
+                <w:color w:val="007A87"/>
+                <w:sz w:val="18"/>
+              </w:rPr>
+              <w:t xml:space="preserve">Kanji:    </w:t>
+            </w:r>
+            <w:r>
+              <w:rPr>
+                <w:rFonts w:ascii="Calibri" w:hAnsi="Calibri"/>
+                <w:b w:val="0"/>
+                <w:i w:val="0"/>
+                <w:color w:val="1A1A2E"/>
+                <w:sz w:val="18"/>
+              </w:rPr>
+              <w:t>_____________________</w:t>
+            </w:r>
+          </w:p>
+          <w:p>
+            <w:pPr>
+              <w:spacing w:before="0" w:after="0"/>
+              <w:ind w:left="113"/>
+            </w:pPr>
+            <w:r>
+              <w:rPr>
+                <w:rFonts w:ascii="Calibri" w:hAnsi="Calibri"/>
+                <w:b/>
+                <w:i w:val="0"/>
+                <w:color w:val="007A87"/>
+                <w:sz w:val="18"/>
+              </w:rPr>
+              <w:t>Hiragana:</w:t>
+            </w:r>
+            <w:r>
+              <w:rPr>
+                <w:rFonts w:ascii="Calibri" w:hAnsi="Calibri"/>
+                <w:b w:val="0"/>
+                <w:i w:val="0"/>
+                <w:color w:val="1A1A2E"/>
+                <w:sz w:val="18"/>
+              </w:rPr>
+              <w:t>_____________________</w:t>
+            </w:r>
+          </w:p>
+          <w:p>
+            <w:pPr>
+              <w:spacing w:before="0" w:after="0"/>
+              <w:ind w:left="113"/>
+            </w:pPr>
+            <w:r>
+              <w:rPr>
+                <w:rFonts w:ascii="Calibri" w:hAnsi="Calibri"/>
+                <w:b/>
+                <w:i w:val="0"/>
+                <w:color w:val="007A87"/>
+                <w:sz w:val="18"/>
+              </w:rPr>
+              <w:t xml:space="preserve">Romaji:  </w:t>
+            </w:r>
+            <w:r>
+              <w:rPr>
+                <w:rFonts w:ascii="Calibri" w:hAnsi="Calibri"/>
+                <w:b w:val="0"/>
+                <w:i w:val="0"/>
+                <w:color w:val="1A1A2E"/>
+                <w:sz w:val="18"/>
+              </w:rPr>
+              <w:t>_____________________</w:t>
+            </w:r>
+            <w:r>
+              <w:rPr>
+                <w:rFonts w:ascii="Calibri" w:hAnsi="Calibri"/>
+                <w:b w:val="0"/>
+                <w:i/>
+                <w:color w:val="6B7B8D"/>
+                <w:sz w:val="14"/>
+              </w:rPr>
+              <w:t xml:space="preserve">  (sen)</w:t>
+            </w:r>
+          </w:p>
+        </w:tc>
+      </w:tr>
+    </w:tbl>
     <w:p>
       <w:pPr>
         <w:spacing w:before="0" w:after="0"/>

</xml_diff>

<commit_message>
Lock Part 1 worksheet column widths
Co-authored-by: sin-boo <sin-boo@users.noreply.github.com>
</commit_message>
<xml_diff>
--- a/japanese_docs/japanese_numbers_worksheet.docx
+++ b/japanese_docs/japanese_numbers_worksheet.docx
@@ -413,6 +413,7 @@
       <w:tblPr>
         <w:tblStyle w:val="TableGrid"/>
         <w:tblW w:type="auto" w:w="0"/>
+        <w:tblLayout w:type="fixed"/>
         <w:tblLook w:firstColumn="1" w:firstRow="1" w:lastColumn="0" w:lastRow="0" w:noHBand="0" w:noVBand="1" w:val="04A0"/>
       </w:tblPr>
       <w:tblGrid>
@@ -422,7 +423,7 @@
       <w:tr>
         <w:tc>
           <w:tcPr>
-            <w:tcW w:type="dxa" w:w="4986"/>
+            <w:tcW w:type="dxa" w:w="4706"/>
             <w:tcBorders>
               <w:top w:val="nil"/>
               <w:left w:val="nil"/>
@@ -548,7 +549,7 @@
         </w:tc>
         <w:tc>
           <w:tcPr>
-            <w:tcW w:type="dxa" w:w="4986"/>
+            <w:tcW w:type="dxa" w:w="4706"/>
             <w:tcBorders>
               <w:top w:val="nil"/>
               <w:left w:val="nil"/>
@@ -676,7 +677,7 @@
       <w:tr>
         <w:tc>
           <w:tcPr>
-            <w:tcW w:type="dxa" w:w="4986"/>
+            <w:tcW w:type="dxa" w:w="4706"/>
             <w:tcBorders>
               <w:top w:val="nil"/>
               <w:left w:val="nil"/>
@@ -802,7 +803,7 @@
         </w:tc>
         <w:tc>
           <w:tcPr>
-            <w:tcW w:type="dxa" w:w="4986"/>
+            <w:tcW w:type="dxa" w:w="4706"/>
             <w:tcBorders>
               <w:top w:val="nil"/>
               <w:left w:val="nil"/>
@@ -945,7 +946,7 @@
       <w:tr>
         <w:tc>
           <w:tcPr>
-            <w:tcW w:type="dxa" w:w="4986"/>
+            <w:tcW w:type="dxa" w:w="4706"/>
             <w:tcBorders>
               <w:top w:val="nil"/>
               <w:left w:val="nil"/>
@@ -1071,7 +1072,7 @@
         </w:tc>
         <w:tc>
           <w:tcPr>
-            <w:tcW w:type="dxa" w:w="4986"/>
+            <w:tcW w:type="dxa" w:w="4706"/>
             <w:tcBorders>
               <w:top w:val="nil"/>
               <w:left w:val="nil"/>
@@ -1199,7 +1200,7 @@
       <w:tr>
         <w:tc>
           <w:tcPr>
-            <w:tcW w:type="dxa" w:w="4986"/>
+            <w:tcW w:type="dxa" w:w="4706"/>
             <w:tcBorders>
               <w:top w:val="nil"/>
               <w:left w:val="nil"/>
@@ -1340,7 +1341,7 @@
         </w:tc>
         <w:tc>
           <w:tcPr>
-            <w:tcW w:type="dxa" w:w="4986"/>
+            <w:tcW w:type="dxa" w:w="4706"/>
             <w:tcBorders>
               <w:top w:val="nil"/>
               <w:left w:val="nil"/>
@@ -1468,7 +1469,7 @@
       <w:tr>
         <w:tc>
           <w:tcPr>
-            <w:tcW w:type="dxa" w:w="4986"/>
+            <w:tcW w:type="dxa" w:w="4706"/>
             <w:tcBorders>
               <w:top w:val="nil"/>
               <w:left w:val="nil"/>
@@ -1609,7 +1610,7 @@
         </w:tc>
         <w:tc>
           <w:tcPr>
-            <w:tcW w:type="dxa" w:w="4986"/>
+            <w:tcW w:type="dxa" w:w="4706"/>
             <w:tcBorders>
               <w:top w:val="nil"/>
               <w:left w:val="nil"/>
@@ -1737,7 +1738,7 @@
       <w:tr>
         <w:tc>
           <w:tcPr>
-            <w:tcW w:type="dxa" w:w="4986"/>
+            <w:tcW w:type="dxa" w:w="4706"/>
             <w:tcBorders>
               <w:top w:val="nil"/>
               <w:left w:val="nil"/>
@@ -1878,7 +1879,7 @@
         </w:tc>
         <w:tc>
           <w:tcPr>
-            <w:tcW w:type="dxa" w:w="4986"/>
+            <w:tcW w:type="dxa" w:w="4706"/>
             <w:tcBorders>
               <w:top w:val="nil"/>
               <w:left w:val="nil"/>
@@ -2021,7 +2022,7 @@
       <w:tr>
         <w:tc>
           <w:tcPr>
-            <w:tcW w:type="dxa" w:w="4986"/>
+            <w:tcW w:type="dxa" w:w="4706"/>
             <w:tcBorders>
               <w:top w:val="nil"/>
               <w:left w:val="nil"/>
@@ -2162,7 +2163,7 @@
         </w:tc>
         <w:tc>
           <w:tcPr>
-            <w:tcW w:type="dxa" w:w="4986"/>
+            <w:tcW w:type="dxa" w:w="4706"/>
             <w:tcBorders>
               <w:top w:val="nil"/>
               <w:left w:val="nil"/>
@@ -2305,7 +2306,7 @@
       <w:tr>
         <w:tc>
           <w:tcPr>
-            <w:tcW w:type="dxa" w:w="4986"/>
+            <w:tcW w:type="dxa" w:w="4706"/>
             <w:tcBorders>
               <w:top w:val="nil"/>
               <w:left w:val="nil"/>
@@ -2446,7 +2447,7 @@
         </w:tc>
         <w:tc>
           <w:tcPr>
-            <w:tcW w:type="dxa" w:w="4986"/>
+            <w:tcW w:type="dxa" w:w="4706"/>
             <w:tcBorders>
               <w:top w:val="nil"/>
               <w:left w:val="nil"/>

</xml_diff>

<commit_message>
Set worksheet margins to 0.2 inches
Co-authored-by: sin-boo <sin-boo@users.noreply.github.com>
</commit_message>
<xml_diff>
--- a/japanese_docs/japanese_numbers_worksheet.docx
+++ b/japanese_docs/japanese_numbers_worksheet.docx
@@ -9,12 +9,12 @@
         <w:tblLook w:firstColumn="1" w:firstRow="1" w:lastColumn="0" w:lastRow="0" w:noHBand="0" w:noVBand="1" w:val="04A0"/>
       </w:tblPr>
       <w:tblGrid>
-        <w:gridCol w:w="9972"/>
+        <w:gridCol w:w="11664"/>
       </w:tblGrid>
       <w:tr>
         <w:tc>
           <w:tcPr>
-            <w:tcW w:type="dxa" w:w="9972"/>
+            <w:tcW w:type="dxa" w:w="11664"/>
             <w:shd w:val="clear" w:color="auto" w:fill="1A3A5C"/>
             <w:vAlign w:val="center"/>
           </w:tcPr>
@@ -50,7 +50,7 @@
       <w:tr>
         <w:tc>
           <w:tcPr>
-            <w:tcW w:type="dxa" w:w="9972"/>
+            <w:tcW w:type="dxa" w:w="11664"/>
             <w:shd w:val="clear" w:color="auto" w:fill="007A87"/>
           </w:tcPr>
           <w:p>
@@ -84,15 +84,15 @@
         <w:tblLook w:firstColumn="1" w:firstRow="1" w:lastColumn="0" w:lastRow="0" w:noHBand="0" w:noVBand="1" w:val="04A0"/>
       </w:tblPr>
       <w:tblGrid>
-        <w:gridCol w:w="2493"/>
-        <w:gridCol w:w="2493"/>
-        <w:gridCol w:w="2493"/>
-        <w:gridCol w:w="2493"/>
+        <w:gridCol w:w="2916"/>
+        <w:gridCol w:w="2916"/>
+        <w:gridCol w:w="2916"/>
+        <w:gridCol w:w="2916"/>
       </w:tblGrid>
       <w:tr>
         <w:tc>
           <w:tcPr>
-            <w:tcW w:type="dxa" w:w="2493"/>
+            <w:tcW w:type="dxa" w:w="2916"/>
             <w:shd w:val="clear" w:color="auto" w:fill="F0F6FA"/>
             <w:vAlign w:val="center"/>
           </w:tcPr>
@@ -124,7 +124,7 @@
         </w:tc>
         <w:tc>
           <w:tcPr>
-            <w:tcW w:type="dxa" w:w="2493"/>
+            <w:tcW w:type="dxa" w:w="2916"/>
             <w:shd w:val="clear" w:color="auto" w:fill="F0F6FA"/>
             <w:vAlign w:val="center"/>
           </w:tcPr>
@@ -156,7 +156,7 @@
         </w:tc>
         <w:tc>
           <w:tcPr>
-            <w:tcW w:type="dxa" w:w="2493"/>
+            <w:tcW w:type="dxa" w:w="2916"/>
             <w:shd w:val="clear" w:color="auto" w:fill="F0F6FA"/>
             <w:vAlign w:val="center"/>
           </w:tcPr>
@@ -188,7 +188,7 @@
         </w:tc>
         <w:tc>
           <w:tcPr>
-            <w:tcW w:type="dxa" w:w="2493"/>
+            <w:tcW w:type="dxa" w:w="2916"/>
             <w:shd w:val="clear" w:color="auto" w:fill="F0F6FA"/>
             <w:vAlign w:val="center"/>
           </w:tcPr>
@@ -285,8 +285,8 @@
         <w:tblLook w:firstColumn="1" w:firstRow="1" w:lastColumn="0" w:lastRow="0" w:noHBand="0" w:noVBand="1" w:val="04A0"/>
       </w:tblPr>
       <w:tblGrid>
-        <w:gridCol w:w="4986"/>
-        <w:gridCol w:w="4986"/>
+        <w:gridCol w:w="5832"/>
+        <w:gridCol w:w="5832"/>
       </w:tblGrid>
       <w:tr>
         <w:tc>
@@ -1413,8 +1413,8 @@
         <w:tblLook w:firstColumn="1" w:firstRow="1" w:lastColumn="0" w:lastRow="0" w:noHBand="0" w:noVBand="1" w:val="04A0"/>
       </w:tblPr>
       <w:tblGrid>
-        <w:gridCol w:w="4986"/>
-        <w:gridCol w:w="4986"/>
+        <w:gridCol w:w="5832"/>
+        <w:gridCol w:w="5832"/>
       </w:tblGrid>
       <w:tr>
         <w:tc>
@@ -2608,15 +2608,15 @@
         <w:tblLook w:firstColumn="1" w:firstRow="1" w:lastColumn="0" w:lastRow="0" w:noHBand="0" w:noVBand="1" w:val="04A0"/>
       </w:tblPr>
       <w:tblGrid>
-        <w:gridCol w:w="2493"/>
-        <w:gridCol w:w="2493"/>
-        <w:gridCol w:w="2493"/>
-        <w:gridCol w:w="2493"/>
+        <w:gridCol w:w="2916"/>
+        <w:gridCol w:w="2916"/>
+        <w:gridCol w:w="2916"/>
+        <w:gridCol w:w="2916"/>
       </w:tblGrid>
       <w:tr>
         <w:tc>
           <w:tcPr>
-            <w:tcW w:type="dxa" w:w="2493"/>
+            <w:tcW w:type="dxa" w:w="2916"/>
             <w:shd w:val="clear" w:color="auto" w:fill="F0F6FA"/>
             <w:vAlign w:val="center"/>
           </w:tcPr>
@@ -2649,7 +2649,7 @@
         </w:tc>
         <w:tc>
           <w:tcPr>
-            <w:tcW w:type="dxa" w:w="2493"/>
+            <w:tcW w:type="dxa" w:w="2916"/>
             <w:shd w:val="clear" w:color="auto" w:fill="F0F6FA"/>
             <w:vAlign w:val="center"/>
           </w:tcPr>
@@ -2682,7 +2682,7 @@
         </w:tc>
         <w:tc>
           <w:tcPr>
-            <w:tcW w:type="dxa" w:w="2493"/>
+            <w:tcW w:type="dxa" w:w="2916"/>
             <w:shd w:val="clear" w:color="auto" w:fill="F0F6FA"/>
             <w:vAlign w:val="center"/>
           </w:tcPr>
@@ -2715,7 +2715,7 @@
         </w:tc>
         <w:tc>
           <w:tcPr>
-            <w:tcW w:type="dxa" w:w="2493"/>
+            <w:tcW w:type="dxa" w:w="2916"/>
             <w:shd w:val="clear" w:color="auto" w:fill="F0F6FA"/>
             <w:vAlign w:val="center"/>
           </w:tcPr>
@@ -2750,7 +2750,7 @@
       <w:tr>
         <w:tc>
           <w:tcPr>
-            <w:tcW w:type="dxa" w:w="2493"/>
+            <w:tcW w:type="dxa" w:w="2916"/>
             <w:shd w:val="clear" w:color="auto" w:fill="FFFFFF"/>
             <w:vAlign w:val="center"/>
           </w:tcPr>
@@ -2783,7 +2783,7 @@
         </w:tc>
         <w:tc>
           <w:tcPr>
-            <w:tcW w:type="dxa" w:w="2493"/>
+            <w:tcW w:type="dxa" w:w="2916"/>
             <w:shd w:val="clear" w:color="auto" w:fill="FFFFFF"/>
             <w:vAlign w:val="center"/>
           </w:tcPr>
@@ -2816,7 +2816,7 @@
         </w:tc>
         <w:tc>
           <w:tcPr>
-            <w:tcW w:type="dxa" w:w="2493"/>
+            <w:tcW w:type="dxa" w:w="2916"/>
             <w:shd w:val="clear" w:color="auto" w:fill="FFFFFF"/>
             <w:vAlign w:val="center"/>
           </w:tcPr>
@@ -2849,7 +2849,7 @@
         </w:tc>
         <w:tc>
           <w:tcPr>
-            <w:tcW w:type="dxa" w:w="2493"/>
+            <w:tcW w:type="dxa" w:w="2916"/>
             <w:shd w:val="clear" w:color="auto" w:fill="FFFFFF"/>
             <w:vAlign w:val="center"/>
           </w:tcPr>
@@ -2884,7 +2884,7 @@
       <w:tr>
         <w:tc>
           <w:tcPr>
-            <w:tcW w:type="dxa" w:w="2493"/>
+            <w:tcW w:type="dxa" w:w="2916"/>
             <w:shd w:val="clear" w:color="auto" w:fill="F0F6FA"/>
             <w:vAlign w:val="center"/>
           </w:tcPr>
@@ -2917,7 +2917,7 @@
         </w:tc>
         <w:tc>
           <w:tcPr>
-            <w:tcW w:type="dxa" w:w="2493"/>
+            <w:tcW w:type="dxa" w:w="2916"/>
             <w:shd w:val="clear" w:color="auto" w:fill="F0F6FA"/>
             <w:vAlign w:val="center"/>
           </w:tcPr>
@@ -2950,7 +2950,7 @@
         </w:tc>
         <w:tc>
           <w:tcPr>
-            <w:tcW w:type="dxa" w:w="2493"/>
+            <w:tcW w:type="dxa" w:w="2916"/>
             <w:shd w:val="clear" w:color="auto" w:fill="F0F6FA"/>
             <w:vAlign w:val="center"/>
           </w:tcPr>
@@ -2983,7 +2983,7 @@
         </w:tc>
         <w:tc>
           <w:tcPr>
-            <w:tcW w:type="dxa" w:w="2493"/>
+            <w:tcW w:type="dxa" w:w="2916"/>
             <w:shd w:val="clear" w:color="auto" w:fill="F0F6FA"/>
             <w:vAlign w:val="center"/>
           </w:tcPr>
@@ -3018,7 +3018,7 @@
       <w:tr>
         <w:tc>
           <w:tcPr>
-            <w:tcW w:type="dxa" w:w="2493"/>
+            <w:tcW w:type="dxa" w:w="2916"/>
             <w:shd w:val="clear" w:color="auto" w:fill="FFFFFF"/>
             <w:vAlign w:val="center"/>
           </w:tcPr>
@@ -3051,7 +3051,7 @@
         </w:tc>
         <w:tc>
           <w:tcPr>
-            <w:tcW w:type="dxa" w:w="2493"/>
+            <w:tcW w:type="dxa" w:w="2916"/>
             <w:shd w:val="clear" w:color="auto" w:fill="FFFFFF"/>
             <w:vAlign w:val="center"/>
           </w:tcPr>
@@ -3084,7 +3084,7 @@
         </w:tc>
         <w:tc>
           <w:tcPr>
-            <w:tcW w:type="dxa" w:w="2493"/>
+            <w:tcW w:type="dxa" w:w="2916"/>
             <w:shd w:val="clear" w:color="auto" w:fill="FFFFFF"/>
             <w:vAlign w:val="center"/>
           </w:tcPr>
@@ -3117,7 +3117,7 @@
         </w:tc>
         <w:tc>
           <w:tcPr>
-            <w:tcW w:type="dxa" w:w="2493"/>
+            <w:tcW w:type="dxa" w:w="2916"/>
             <w:shd w:val="clear" w:color="auto" w:fill="FFFFFF"/>
             <w:vAlign w:val="center"/>
           </w:tcPr>
@@ -3152,7 +3152,7 @@
       <w:tr>
         <w:tc>
           <w:tcPr>
-            <w:tcW w:type="dxa" w:w="2493"/>
+            <w:tcW w:type="dxa" w:w="2916"/>
             <w:shd w:val="clear" w:color="auto" w:fill="F0F6FA"/>
             <w:vAlign w:val="center"/>
           </w:tcPr>
@@ -3185,7 +3185,7 @@
         </w:tc>
         <w:tc>
           <w:tcPr>
-            <w:tcW w:type="dxa" w:w="2493"/>
+            <w:tcW w:type="dxa" w:w="2916"/>
             <w:shd w:val="clear" w:color="auto" w:fill="F0F6FA"/>
             <w:vAlign w:val="center"/>
           </w:tcPr>
@@ -3218,7 +3218,7 @@
         </w:tc>
         <w:tc>
           <w:tcPr>
-            <w:tcW w:type="dxa" w:w="2493"/>
+            <w:tcW w:type="dxa" w:w="2916"/>
             <w:shd w:val="clear" w:color="auto" w:fill="F0F6FA"/>
             <w:vAlign w:val="center"/>
           </w:tcPr>
@@ -3251,7 +3251,7 @@
         </w:tc>
         <w:tc>
           <w:tcPr>
-            <w:tcW w:type="dxa" w:w="2493"/>
+            <w:tcW w:type="dxa" w:w="2916"/>
             <w:shd w:val="clear" w:color="auto" w:fill="F0F6FA"/>
             <w:vAlign w:val="center"/>
           </w:tcPr>
@@ -3296,13 +3296,13 @@
         <w:tblLook w:firstColumn="1" w:firstRow="1" w:lastColumn="0" w:lastRow="0" w:noHBand="0" w:noVBand="1" w:val="04A0"/>
       </w:tblPr>
       <w:tblGrid>
-        <w:gridCol w:w="4986"/>
-        <w:gridCol w:w="4986"/>
+        <w:gridCol w:w="5832"/>
+        <w:gridCol w:w="5832"/>
       </w:tblGrid>
       <w:tr>
         <w:tc>
           <w:tcPr>
-            <w:tcW w:type="dxa" w:w="4986"/>
+            <w:tcW w:type="dxa" w:w="5832"/>
             <w:shd w:val="clear" w:color="auto" w:fill="D4F1F4"/>
             <w:vAlign w:val="center"/>
           </w:tcPr>
@@ -3371,7 +3371,7 @@
         </w:tc>
         <w:tc>
           <w:tcPr>
-            <w:tcW w:type="dxa" w:w="4986"/>
+            <w:tcW w:type="dxa" w:w="5832"/>
             <w:shd w:val="clear" w:color="auto" w:fill="D4F1F4"/>
             <w:vAlign w:val="center"/>
           </w:tcPr>
@@ -3442,7 +3442,7 @@
       <w:tr>
         <w:tc>
           <w:tcPr>
-            <w:tcW w:type="dxa" w:w="4986"/>
+            <w:tcW w:type="dxa" w:w="5832"/>
             <w:shd w:val="clear" w:color="auto" w:fill="FFFFFF"/>
             <w:vAlign w:val="center"/>
           </w:tcPr>
@@ -3511,7 +3511,7 @@
         </w:tc>
         <w:tc>
           <w:tcPr>
-            <w:tcW w:type="dxa" w:w="4986"/>
+            <w:tcW w:type="dxa" w:w="5832"/>
             <w:shd w:val="clear" w:color="auto" w:fill="FFFFFF"/>
             <w:vAlign w:val="center"/>
           </w:tcPr>
@@ -3582,7 +3582,7 @@
       <w:tr>
         <w:tc>
           <w:tcPr>
-            <w:tcW w:type="dxa" w:w="4986"/>
+            <w:tcW w:type="dxa" w:w="5832"/>
             <w:shd w:val="clear" w:color="auto" w:fill="D4F1F4"/>
             <w:vAlign w:val="center"/>
           </w:tcPr>
@@ -3651,7 +3651,7 @@
         </w:tc>
         <w:tc>
           <w:tcPr>
-            <w:tcW w:type="dxa" w:w="4986"/>
+            <w:tcW w:type="dxa" w:w="5832"/>
             <w:shd w:val="clear" w:color="auto" w:fill="D4F1F4"/>
             <w:vAlign w:val="center"/>
           </w:tcPr>
@@ -3722,7 +3722,7 @@
       <w:tr>
         <w:tc>
           <w:tcPr>
-            <w:tcW w:type="dxa" w:w="4986"/>
+            <w:tcW w:type="dxa" w:w="5832"/>
             <w:shd w:val="clear" w:color="auto" w:fill="FFFFFF"/>
             <w:vAlign w:val="center"/>
           </w:tcPr>
@@ -3791,7 +3791,7 @@
         </w:tc>
         <w:tc>
           <w:tcPr>
-            <w:tcW w:type="dxa" w:w="4986"/>
+            <w:tcW w:type="dxa" w:w="5832"/>
             <w:shd w:val="clear" w:color="auto" w:fill="FFFFFF"/>
             <w:vAlign w:val="center"/>
           </w:tcPr>
@@ -3862,7 +3862,7 @@
       <w:tr>
         <w:tc>
           <w:tcPr>
-            <w:tcW w:type="dxa" w:w="4986"/>
+            <w:tcW w:type="dxa" w:w="5832"/>
             <w:shd w:val="clear" w:color="auto" w:fill="D4F1F4"/>
             <w:vAlign w:val="center"/>
           </w:tcPr>
@@ -3931,7 +3931,7 @@
         </w:tc>
         <w:tc>
           <w:tcPr>
-            <w:tcW w:type="dxa" w:w="4986"/>
+            <w:tcW w:type="dxa" w:w="5832"/>
             <w:shd w:val="clear" w:color="auto" w:fill="D4F1F4"/>
             <w:vAlign w:val="center"/>
           </w:tcPr>
@@ -4002,7 +4002,7 @@
       <w:tr>
         <w:tc>
           <w:tcPr>
-            <w:tcW w:type="dxa" w:w="4986"/>
+            <w:tcW w:type="dxa" w:w="5832"/>
             <w:shd w:val="clear" w:color="auto" w:fill="FFFFFF"/>
             <w:vAlign w:val="center"/>
           </w:tcPr>
@@ -4071,7 +4071,7 @@
         </w:tc>
         <w:tc>
           <w:tcPr>
-            <w:tcW w:type="dxa" w:w="4986"/>
+            <w:tcW w:type="dxa" w:w="5832"/>
             <w:shd w:val="clear" w:color="auto" w:fill="FFFFFF"/>
             <w:vAlign w:val="center"/>
           </w:tcPr>
@@ -4142,7 +4142,7 @@
       <w:tr>
         <w:tc>
           <w:tcPr>
-            <w:tcW w:type="dxa" w:w="4986"/>
+            <w:tcW w:type="dxa" w:w="5832"/>
             <w:shd w:val="clear" w:color="auto" w:fill="D4F1F4"/>
             <w:vAlign w:val="center"/>
           </w:tcPr>
@@ -4211,7 +4211,7 @@
         </w:tc>
         <w:tc>
           <w:tcPr>
-            <w:tcW w:type="dxa" w:w="4986"/>
+            <w:tcW w:type="dxa" w:w="5832"/>
             <w:shd w:val="clear" w:color="auto" w:fill="D4F1F4"/>
             <w:vAlign w:val="center"/>
           </w:tcPr>
@@ -4282,7 +4282,7 @@
       <w:tr>
         <w:tc>
           <w:tcPr>
-            <w:tcW w:type="dxa" w:w="4986"/>
+            <w:tcW w:type="dxa" w:w="5832"/>
             <w:shd w:val="clear" w:color="auto" w:fill="FFFFFF"/>
             <w:vAlign w:val="center"/>
           </w:tcPr>
@@ -4351,7 +4351,7 @@
         </w:tc>
         <w:tc>
           <w:tcPr>
-            <w:tcW w:type="dxa" w:w="4986"/>
+            <w:tcW w:type="dxa" w:w="5832"/>
             <w:shd w:val="clear" w:color="auto" w:fill="FFFFFF"/>
             <w:vAlign w:val="center"/>
           </w:tcPr>
@@ -4422,7 +4422,7 @@
       <w:tr>
         <w:tc>
           <w:tcPr>
-            <w:tcW w:type="dxa" w:w="4986"/>
+            <w:tcW w:type="dxa" w:w="5832"/>
             <w:shd w:val="clear" w:color="auto" w:fill="D4F1F4"/>
             <w:vAlign w:val="center"/>
           </w:tcPr>
@@ -4491,7 +4491,7 @@
         </w:tc>
         <w:tc>
           <w:tcPr>
-            <w:tcW w:type="dxa" w:w="4986"/>
+            <w:tcW w:type="dxa" w:w="5832"/>
             <w:shd w:val="clear" w:color="auto" w:fill="D4F1F4"/>
             <w:vAlign w:val="center"/>
           </w:tcPr>
@@ -4562,7 +4562,7 @@
       <w:tr>
         <w:tc>
           <w:tcPr>
-            <w:tcW w:type="dxa" w:w="4986"/>
+            <w:tcW w:type="dxa" w:w="5832"/>
             <w:shd w:val="clear" w:color="auto" w:fill="FFFFFF"/>
             <w:vAlign w:val="center"/>
           </w:tcPr>
@@ -4631,7 +4631,7 @@
         </w:tc>
         <w:tc>
           <w:tcPr>
-            <w:tcW w:type="dxa" w:w="4986"/>
+            <w:tcW w:type="dxa" w:w="5832"/>
             <w:shd w:val="clear" w:color="auto" w:fill="FFFFFF"/>
             <w:vAlign w:val="center"/>
           </w:tcPr>
@@ -4841,13 +4841,13 @@
         <w:tblLook w:firstColumn="1" w:firstRow="1" w:lastColumn="0" w:lastRow="0" w:noHBand="0" w:noVBand="1" w:val="04A0"/>
       </w:tblPr>
       <w:tblGrid>
-        <w:gridCol w:w="4986"/>
-        <w:gridCol w:w="4986"/>
+        <w:gridCol w:w="5832"/>
+        <w:gridCol w:w="5832"/>
       </w:tblGrid>
       <w:tr>
         <w:tc>
           <w:tcPr>
-            <w:tcW w:type="dxa" w:w="4986"/>
+            <w:tcW w:type="dxa" w:w="5832"/>
             <w:shd w:val="clear" w:color="auto" w:fill="F0F6FA"/>
             <w:vAlign w:val="center"/>
           </w:tcPr>
@@ -4897,7 +4897,7 @@
         </w:tc>
         <w:tc>
           <w:tcPr>
-            <w:tcW w:type="dxa" w:w="4986"/>
+            <w:tcW w:type="dxa" w:w="5832"/>
             <w:shd w:val="clear" w:color="auto" w:fill="F0F6FA"/>
             <w:vAlign w:val="center"/>
           </w:tcPr>
@@ -4949,7 +4949,7 @@
       <w:tr>
         <w:tc>
           <w:tcPr>
-            <w:tcW w:type="dxa" w:w="4986"/>
+            <w:tcW w:type="dxa" w:w="5832"/>
             <w:shd w:val="clear" w:color="auto" w:fill="FFFFFF"/>
             <w:vAlign w:val="center"/>
           </w:tcPr>
@@ -4999,7 +4999,7 @@
         </w:tc>
         <w:tc>
           <w:tcPr>
-            <w:tcW w:type="dxa" w:w="4986"/>
+            <w:tcW w:type="dxa" w:w="5832"/>
             <w:shd w:val="clear" w:color="auto" w:fill="FFFFFF"/>
             <w:vAlign w:val="center"/>
           </w:tcPr>
@@ -5062,7 +5062,7 @@
       <w:tr>
         <w:tc>
           <w:tcPr>
-            <w:tcW w:type="dxa" w:w="4986"/>
+            <w:tcW w:type="dxa" w:w="5832"/>
             <w:shd w:val="clear" w:color="auto" w:fill="F0F6FA"/>
             <w:vAlign w:val="center"/>
           </w:tcPr>
@@ -5112,7 +5112,7 @@
         </w:tc>
         <w:tc>
           <w:tcPr>
-            <w:tcW w:type="dxa" w:w="4986"/>
+            <w:tcW w:type="dxa" w:w="5832"/>
             <w:shd w:val="clear" w:color="auto" w:fill="F0F6FA"/>
             <w:vAlign w:val="center"/>
           </w:tcPr>
@@ -5164,7 +5164,7 @@
       <w:tr>
         <w:tc>
           <w:tcPr>
-            <w:tcW w:type="dxa" w:w="4986"/>
+            <w:tcW w:type="dxa" w:w="5832"/>
             <w:shd w:val="clear" w:color="auto" w:fill="FFFFFF"/>
             <w:vAlign w:val="center"/>
           </w:tcPr>
@@ -5225,7 +5225,7 @@
         </w:tc>
         <w:tc>
           <w:tcPr>
-            <w:tcW w:type="dxa" w:w="4986"/>
+            <w:tcW w:type="dxa" w:w="5832"/>
             <w:shd w:val="clear" w:color="auto" w:fill="FFFFFF"/>
             <w:vAlign w:val="center"/>
           </w:tcPr>
@@ -5277,7 +5277,7 @@
       <w:tr>
         <w:tc>
           <w:tcPr>
-            <w:tcW w:type="dxa" w:w="4986"/>
+            <w:tcW w:type="dxa" w:w="5832"/>
             <w:shd w:val="clear" w:color="auto" w:fill="F0F6FA"/>
             <w:vAlign w:val="center"/>
           </w:tcPr>
@@ -5338,7 +5338,7 @@
         </w:tc>
         <w:tc>
           <w:tcPr>
-            <w:tcW w:type="dxa" w:w="4986"/>
+            <w:tcW w:type="dxa" w:w="5832"/>
             <w:shd w:val="clear" w:color="auto" w:fill="F0F6FA"/>
             <w:vAlign w:val="center"/>
           </w:tcPr>
@@ -5390,7 +5390,7 @@
       <w:tr>
         <w:tc>
           <w:tcPr>
-            <w:tcW w:type="dxa" w:w="4986"/>
+            <w:tcW w:type="dxa" w:w="5832"/>
             <w:shd w:val="clear" w:color="auto" w:fill="FFFFFF"/>
             <w:vAlign w:val="center"/>
           </w:tcPr>
@@ -5451,7 +5451,7 @@
         </w:tc>
         <w:tc>
           <w:tcPr>
-            <w:tcW w:type="dxa" w:w="4986"/>
+            <w:tcW w:type="dxa" w:w="5832"/>
             <w:shd w:val="clear" w:color="auto" w:fill="FFFFFF"/>
             <w:vAlign w:val="center"/>
           </w:tcPr>
@@ -5514,7 +5514,7 @@
       <w:tr>
         <w:tc>
           <w:tcPr>
-            <w:tcW w:type="dxa" w:w="4986"/>
+            <w:tcW w:type="dxa" w:w="5832"/>
             <w:shd w:val="clear" w:color="auto" w:fill="F0F6FA"/>
             <w:vAlign w:val="center"/>
           </w:tcPr>
@@ -5564,7 +5564,7 @@
         </w:tc>
         <w:tc>
           <w:tcPr>
-            <w:tcW w:type="dxa" w:w="4986"/>
+            <w:tcW w:type="dxa" w:w="5832"/>
             <w:shd w:val="clear" w:color="auto" w:fill="F0F6FA"/>
             <w:vAlign w:val="center"/>
           </w:tcPr>
@@ -5616,7 +5616,7 @@
       <w:tr>
         <w:tc>
           <w:tcPr>
-            <w:tcW w:type="dxa" w:w="4986"/>
+            <w:tcW w:type="dxa" w:w="5832"/>
             <w:shd w:val="clear" w:color="auto" w:fill="FFFFFF"/>
             <w:vAlign w:val="center"/>
           </w:tcPr>
@@ -5666,7 +5666,7 @@
         </w:tc>
         <w:tc>
           <w:tcPr>
-            <w:tcW w:type="dxa" w:w="4986"/>
+            <w:tcW w:type="dxa" w:w="5832"/>
             <w:shd w:val="clear" w:color="auto" w:fill="FFFFFF"/>
             <w:vAlign w:val="center"/>
           </w:tcPr>
@@ -5718,7 +5718,7 @@
       <w:tr>
         <w:tc>
           <w:tcPr>
-            <w:tcW w:type="dxa" w:w="4986"/>
+            <w:tcW w:type="dxa" w:w="5832"/>
             <w:shd w:val="clear" w:color="auto" w:fill="F0F6FA"/>
             <w:vAlign w:val="center"/>
           </w:tcPr>
@@ -5768,7 +5768,7 @@
         </w:tc>
         <w:tc>
           <w:tcPr>
-            <w:tcW w:type="dxa" w:w="4986"/>
+            <w:tcW w:type="dxa" w:w="5832"/>
             <w:shd w:val="clear" w:color="auto" w:fill="F0F6FA"/>
             <w:vAlign w:val="center"/>
           </w:tcPr>
@@ -5820,7 +5820,7 @@
       <w:tr>
         <w:tc>
           <w:tcPr>
-            <w:tcW w:type="dxa" w:w="4986"/>
+            <w:tcW w:type="dxa" w:w="5832"/>
             <w:shd w:val="clear" w:color="auto" w:fill="FFFFFF"/>
             <w:vAlign w:val="center"/>
           </w:tcPr>
@@ -5870,7 +5870,7 @@
         </w:tc>
         <w:tc>
           <w:tcPr>
-            <w:tcW w:type="dxa" w:w="4986"/>
+            <w:tcW w:type="dxa" w:w="5832"/>
             <w:shd w:val="clear" w:color="auto" w:fill="FFFFFF"/>
             <w:vAlign w:val="center"/>
           </w:tcPr>
@@ -5979,15 +5979,15 @@
         <w:tblLook w:firstColumn="1" w:firstRow="1" w:lastColumn="0" w:lastRow="0" w:noHBand="0" w:noVBand="1" w:val="04A0"/>
       </w:tblPr>
       <w:tblGrid>
-        <w:gridCol w:w="2493"/>
-        <w:gridCol w:w="2493"/>
-        <w:gridCol w:w="2493"/>
-        <w:gridCol w:w="2493"/>
+        <w:gridCol w:w="2916"/>
+        <w:gridCol w:w="2916"/>
+        <w:gridCol w:w="2916"/>
+        <w:gridCol w:w="2916"/>
       </w:tblGrid>
       <w:tr>
         <w:tc>
           <w:tcPr>
-            <w:tcW w:type="dxa" w:w="2493"/>
+            <w:tcW w:type="dxa" w:w="2916"/>
             <w:shd w:val="clear" w:color="auto" w:fill="1A3A5C"/>
             <w:vAlign w:val="center"/>
           </w:tcPr>
@@ -6010,7 +6010,7 @@
         </w:tc>
         <w:tc>
           <w:tcPr>
-            <w:tcW w:type="dxa" w:w="2493"/>
+            <w:tcW w:type="dxa" w:w="2916"/>
             <w:shd w:val="clear" w:color="auto" w:fill="1A3A5C"/>
             <w:vAlign w:val="center"/>
           </w:tcPr>
@@ -6033,7 +6033,7 @@
         </w:tc>
         <w:tc>
           <w:tcPr>
-            <w:tcW w:type="dxa" w:w="2493"/>
+            <w:tcW w:type="dxa" w:w="2916"/>
             <w:shd w:val="clear" w:color="auto" w:fill="1A3A5C"/>
             <w:vAlign w:val="center"/>
           </w:tcPr>
@@ -6056,7 +6056,7 @@
         </w:tc>
         <w:tc>
           <w:tcPr>
-            <w:tcW w:type="dxa" w:w="2493"/>
+            <w:tcW w:type="dxa" w:w="2916"/>
             <w:shd w:val="clear" w:color="auto" w:fill="1A3A5C"/>
             <w:vAlign w:val="center"/>
           </w:tcPr>
@@ -6081,7 +6081,7 @@
       <w:tr>
         <w:tc>
           <w:tcPr>
-            <w:tcW w:type="dxa" w:w="2493"/>
+            <w:tcW w:type="dxa" w:w="2916"/>
             <w:shd w:val="clear" w:color="auto" w:fill="F0F6FA"/>
             <w:vAlign w:val="center"/>
           </w:tcPr>
@@ -6103,7 +6103,7 @@
         </w:tc>
         <w:tc>
           <w:tcPr>
-            <w:tcW w:type="dxa" w:w="2493"/>
+            <w:tcW w:type="dxa" w:w="2916"/>
             <w:shd w:val="clear" w:color="auto" w:fill="F0F6FA"/>
             <w:vAlign w:val="center"/>
           </w:tcPr>
@@ -6125,7 +6125,7 @@
         </w:tc>
         <w:tc>
           <w:tcPr>
-            <w:tcW w:type="dxa" w:w="2493"/>
+            <w:tcW w:type="dxa" w:w="2916"/>
             <w:shd w:val="clear" w:color="auto" w:fill="F0F6FA"/>
             <w:vAlign w:val="center"/>
           </w:tcPr>
@@ -6148,7 +6148,7 @@
         </w:tc>
         <w:tc>
           <w:tcPr>
-            <w:tcW w:type="dxa" w:w="2493"/>
+            <w:tcW w:type="dxa" w:w="2916"/>
             <w:shd w:val="clear" w:color="auto" w:fill="F0F6FA"/>
             <w:vAlign w:val="center"/>
           </w:tcPr>
@@ -6172,7 +6172,7 @@
       <w:tr>
         <w:tc>
           <w:tcPr>
-            <w:tcW w:type="dxa" w:w="2493"/>
+            <w:tcW w:type="dxa" w:w="2916"/>
             <w:shd w:val="clear" w:color="auto" w:fill="FFFFFF"/>
             <w:vAlign w:val="center"/>
           </w:tcPr>
@@ -6194,7 +6194,7 @@
         </w:tc>
         <w:tc>
           <w:tcPr>
-            <w:tcW w:type="dxa" w:w="2493"/>
+            <w:tcW w:type="dxa" w:w="2916"/>
             <w:shd w:val="clear" w:color="auto" w:fill="FFFFFF"/>
             <w:vAlign w:val="center"/>
           </w:tcPr>
@@ -6216,7 +6216,7 @@
         </w:tc>
         <w:tc>
           <w:tcPr>
-            <w:tcW w:type="dxa" w:w="2493"/>
+            <w:tcW w:type="dxa" w:w="2916"/>
             <w:shd w:val="clear" w:color="auto" w:fill="FFFFFF"/>
             <w:vAlign w:val="center"/>
           </w:tcPr>
@@ -6239,7 +6239,7 @@
         </w:tc>
         <w:tc>
           <w:tcPr>
-            <w:tcW w:type="dxa" w:w="2493"/>
+            <w:tcW w:type="dxa" w:w="2916"/>
             <w:shd w:val="clear" w:color="auto" w:fill="FFFFFF"/>
             <w:vAlign w:val="center"/>
           </w:tcPr>
@@ -6263,7 +6263,7 @@
       <w:tr>
         <w:tc>
           <w:tcPr>
-            <w:tcW w:type="dxa" w:w="2493"/>
+            <w:tcW w:type="dxa" w:w="2916"/>
             <w:shd w:val="clear" w:color="auto" w:fill="F0F6FA"/>
             <w:vAlign w:val="center"/>
           </w:tcPr>
@@ -6285,7 +6285,7 @@
         </w:tc>
         <w:tc>
           <w:tcPr>
-            <w:tcW w:type="dxa" w:w="2493"/>
+            <w:tcW w:type="dxa" w:w="2916"/>
             <w:shd w:val="clear" w:color="auto" w:fill="F0F6FA"/>
             <w:vAlign w:val="center"/>
           </w:tcPr>
@@ -6307,7 +6307,7 @@
         </w:tc>
         <w:tc>
           <w:tcPr>
-            <w:tcW w:type="dxa" w:w="2493"/>
+            <w:tcW w:type="dxa" w:w="2916"/>
             <w:shd w:val="clear" w:color="auto" w:fill="F0F6FA"/>
             <w:vAlign w:val="center"/>
           </w:tcPr>
@@ -6330,7 +6330,7 @@
         </w:tc>
         <w:tc>
           <w:tcPr>
-            <w:tcW w:type="dxa" w:w="2493"/>
+            <w:tcW w:type="dxa" w:w="2916"/>
             <w:shd w:val="clear" w:color="auto" w:fill="F0F6FA"/>
             <w:vAlign w:val="center"/>
           </w:tcPr>
@@ -6354,7 +6354,7 @@
       <w:tr>
         <w:tc>
           <w:tcPr>
-            <w:tcW w:type="dxa" w:w="2493"/>
+            <w:tcW w:type="dxa" w:w="2916"/>
             <w:shd w:val="clear" w:color="auto" w:fill="FFFFFF"/>
             <w:vAlign w:val="center"/>
           </w:tcPr>
@@ -6376,7 +6376,7 @@
         </w:tc>
         <w:tc>
           <w:tcPr>
-            <w:tcW w:type="dxa" w:w="2493"/>
+            <w:tcW w:type="dxa" w:w="2916"/>
             <w:shd w:val="clear" w:color="auto" w:fill="FFFFFF"/>
             <w:vAlign w:val="center"/>
           </w:tcPr>
@@ -6398,7 +6398,7 @@
         </w:tc>
         <w:tc>
           <w:tcPr>
-            <w:tcW w:type="dxa" w:w="2493"/>
+            <w:tcW w:type="dxa" w:w="2916"/>
             <w:shd w:val="clear" w:color="auto" w:fill="FFFFFF"/>
             <w:vAlign w:val="center"/>
           </w:tcPr>
@@ -6421,7 +6421,7 @@
         </w:tc>
         <w:tc>
           <w:tcPr>
-            <w:tcW w:type="dxa" w:w="2493"/>
+            <w:tcW w:type="dxa" w:w="2916"/>
             <w:shd w:val="clear" w:color="auto" w:fill="FFFFFF"/>
             <w:vAlign w:val="center"/>
           </w:tcPr>
@@ -6456,7 +6456,7 @@
       <w:tr>
         <w:tc>
           <w:tcPr>
-            <w:tcW w:type="dxa" w:w="2493"/>
+            <w:tcW w:type="dxa" w:w="2916"/>
             <w:shd w:val="clear" w:color="auto" w:fill="F0F6FA"/>
             <w:vAlign w:val="center"/>
           </w:tcPr>
@@ -6478,7 +6478,7 @@
         </w:tc>
         <w:tc>
           <w:tcPr>
-            <w:tcW w:type="dxa" w:w="2493"/>
+            <w:tcW w:type="dxa" w:w="2916"/>
             <w:shd w:val="clear" w:color="auto" w:fill="F0F6FA"/>
             <w:vAlign w:val="center"/>
           </w:tcPr>
@@ -6500,7 +6500,7 @@
         </w:tc>
         <w:tc>
           <w:tcPr>
-            <w:tcW w:type="dxa" w:w="2493"/>
+            <w:tcW w:type="dxa" w:w="2916"/>
             <w:shd w:val="clear" w:color="auto" w:fill="F0F6FA"/>
             <w:vAlign w:val="center"/>
           </w:tcPr>
@@ -6523,7 +6523,7 @@
         </w:tc>
         <w:tc>
           <w:tcPr>
-            <w:tcW w:type="dxa" w:w="2493"/>
+            <w:tcW w:type="dxa" w:w="2916"/>
             <w:shd w:val="clear" w:color="auto" w:fill="F0F6FA"/>
             <w:vAlign w:val="center"/>
           </w:tcPr>
@@ -6547,7 +6547,7 @@
       <w:tr>
         <w:tc>
           <w:tcPr>
-            <w:tcW w:type="dxa" w:w="2493"/>
+            <w:tcW w:type="dxa" w:w="2916"/>
             <w:shd w:val="clear" w:color="auto" w:fill="FFFFFF"/>
             <w:vAlign w:val="center"/>
           </w:tcPr>
@@ -6569,7 +6569,7 @@
         </w:tc>
         <w:tc>
           <w:tcPr>
-            <w:tcW w:type="dxa" w:w="2493"/>
+            <w:tcW w:type="dxa" w:w="2916"/>
             <w:shd w:val="clear" w:color="auto" w:fill="FFFFFF"/>
             <w:vAlign w:val="center"/>
           </w:tcPr>
@@ -6591,7 +6591,7 @@
         </w:tc>
         <w:tc>
           <w:tcPr>
-            <w:tcW w:type="dxa" w:w="2493"/>
+            <w:tcW w:type="dxa" w:w="2916"/>
             <w:shd w:val="clear" w:color="auto" w:fill="FFFFFF"/>
             <w:vAlign w:val="center"/>
           </w:tcPr>
@@ -6614,7 +6614,7 @@
         </w:tc>
         <w:tc>
           <w:tcPr>
-            <w:tcW w:type="dxa" w:w="2493"/>
+            <w:tcW w:type="dxa" w:w="2916"/>
             <w:shd w:val="clear" w:color="auto" w:fill="FFFFFF"/>
             <w:vAlign w:val="center"/>
           </w:tcPr>
@@ -6638,7 +6638,7 @@
       <w:tr>
         <w:tc>
           <w:tcPr>
-            <w:tcW w:type="dxa" w:w="2493"/>
+            <w:tcW w:type="dxa" w:w="2916"/>
             <w:shd w:val="clear" w:color="auto" w:fill="F0F6FA"/>
             <w:vAlign w:val="center"/>
           </w:tcPr>
@@ -6660,7 +6660,7 @@
         </w:tc>
         <w:tc>
           <w:tcPr>
-            <w:tcW w:type="dxa" w:w="2493"/>
+            <w:tcW w:type="dxa" w:w="2916"/>
             <w:shd w:val="clear" w:color="auto" w:fill="F0F6FA"/>
             <w:vAlign w:val="center"/>
           </w:tcPr>
@@ -6682,7 +6682,7 @@
         </w:tc>
         <w:tc>
           <w:tcPr>
-            <w:tcW w:type="dxa" w:w="2493"/>
+            <w:tcW w:type="dxa" w:w="2916"/>
             <w:shd w:val="clear" w:color="auto" w:fill="F0F6FA"/>
             <w:vAlign w:val="center"/>
           </w:tcPr>
@@ -6705,7 +6705,7 @@
         </w:tc>
         <w:tc>
           <w:tcPr>
-            <w:tcW w:type="dxa" w:w="2493"/>
+            <w:tcW w:type="dxa" w:w="2916"/>
             <w:shd w:val="clear" w:color="auto" w:fill="F0F6FA"/>
             <w:vAlign w:val="center"/>
           </w:tcPr>
@@ -6740,7 +6740,7 @@
       <w:tr>
         <w:tc>
           <w:tcPr>
-            <w:tcW w:type="dxa" w:w="2493"/>
+            <w:tcW w:type="dxa" w:w="2916"/>
             <w:shd w:val="clear" w:color="auto" w:fill="FFFFFF"/>
             <w:vAlign w:val="center"/>
           </w:tcPr>
@@ -6762,7 +6762,7 @@
         </w:tc>
         <w:tc>
           <w:tcPr>
-            <w:tcW w:type="dxa" w:w="2493"/>
+            <w:tcW w:type="dxa" w:w="2916"/>
             <w:shd w:val="clear" w:color="auto" w:fill="FFFFFF"/>
             <w:vAlign w:val="center"/>
           </w:tcPr>
@@ -6784,7 +6784,7 @@
         </w:tc>
         <w:tc>
           <w:tcPr>
-            <w:tcW w:type="dxa" w:w="2493"/>
+            <w:tcW w:type="dxa" w:w="2916"/>
             <w:shd w:val="clear" w:color="auto" w:fill="FFFFFF"/>
             <w:vAlign w:val="center"/>
           </w:tcPr>
@@ -6807,7 +6807,7 @@
         </w:tc>
         <w:tc>
           <w:tcPr>
-            <w:tcW w:type="dxa" w:w="2493"/>
+            <w:tcW w:type="dxa" w:w="2916"/>
             <w:shd w:val="clear" w:color="auto" w:fill="FFFFFF"/>
             <w:vAlign w:val="center"/>
           </w:tcPr>
@@ -6831,7 +6831,7 @@
       <w:tr>
         <w:tc>
           <w:tcPr>
-            <w:tcW w:type="dxa" w:w="2493"/>
+            <w:tcW w:type="dxa" w:w="2916"/>
             <w:shd w:val="clear" w:color="auto" w:fill="F0F6FA"/>
             <w:vAlign w:val="center"/>
           </w:tcPr>
@@ -6853,7 +6853,7 @@
         </w:tc>
         <w:tc>
           <w:tcPr>
-            <w:tcW w:type="dxa" w:w="2493"/>
+            <w:tcW w:type="dxa" w:w="2916"/>
             <w:shd w:val="clear" w:color="auto" w:fill="F0F6FA"/>
             <w:vAlign w:val="center"/>
           </w:tcPr>
@@ -6875,7 +6875,7 @@
         </w:tc>
         <w:tc>
           <w:tcPr>
-            <w:tcW w:type="dxa" w:w="2493"/>
+            <w:tcW w:type="dxa" w:w="2916"/>
             <w:shd w:val="clear" w:color="auto" w:fill="F0F6FA"/>
             <w:vAlign w:val="center"/>
           </w:tcPr>
@@ -6898,7 +6898,7 @@
         </w:tc>
         <w:tc>
           <w:tcPr>
-            <w:tcW w:type="dxa" w:w="2493"/>
+            <w:tcW w:type="dxa" w:w="2916"/>
             <w:shd w:val="clear" w:color="auto" w:fill="F0F6FA"/>
             <w:vAlign w:val="center"/>
           </w:tcPr>
@@ -6933,7 +6933,7 @@
       <w:tr>
         <w:tc>
           <w:tcPr>
-            <w:tcW w:type="dxa" w:w="2493"/>
+            <w:tcW w:type="dxa" w:w="2916"/>
             <w:shd w:val="clear" w:color="auto" w:fill="FFFFFF"/>
             <w:vAlign w:val="center"/>
           </w:tcPr>
@@ -6955,7 +6955,7 @@
         </w:tc>
         <w:tc>
           <w:tcPr>
-            <w:tcW w:type="dxa" w:w="2493"/>
+            <w:tcW w:type="dxa" w:w="2916"/>
             <w:shd w:val="clear" w:color="auto" w:fill="FFFFFF"/>
             <w:vAlign w:val="center"/>
           </w:tcPr>
@@ -6977,7 +6977,7 @@
         </w:tc>
         <w:tc>
           <w:tcPr>
-            <w:tcW w:type="dxa" w:w="2493"/>
+            <w:tcW w:type="dxa" w:w="2916"/>
             <w:shd w:val="clear" w:color="auto" w:fill="FFFFFF"/>
             <w:vAlign w:val="center"/>
           </w:tcPr>
@@ -7000,7 +7000,7 @@
         </w:tc>
         <w:tc>
           <w:tcPr>
-            <w:tcW w:type="dxa" w:w="2493"/>
+            <w:tcW w:type="dxa" w:w="2916"/>
             <w:shd w:val="clear" w:color="auto" w:fill="FFFFFF"/>
             <w:vAlign w:val="center"/>
           </w:tcPr>
@@ -7024,7 +7024,7 @@
       <w:tr>
         <w:tc>
           <w:tcPr>
-            <w:tcW w:type="dxa" w:w="2493"/>
+            <w:tcW w:type="dxa" w:w="2916"/>
             <w:shd w:val="clear" w:color="auto" w:fill="F0F6FA"/>
             <w:vAlign w:val="center"/>
           </w:tcPr>
@@ -7046,7 +7046,7 @@
         </w:tc>
         <w:tc>
           <w:tcPr>
-            <w:tcW w:type="dxa" w:w="2493"/>
+            <w:tcW w:type="dxa" w:w="2916"/>
             <w:shd w:val="clear" w:color="auto" w:fill="F0F6FA"/>
             <w:vAlign w:val="center"/>
           </w:tcPr>
@@ -7068,7 +7068,7 @@
         </w:tc>
         <w:tc>
           <w:tcPr>
-            <w:tcW w:type="dxa" w:w="2493"/>
+            <w:tcW w:type="dxa" w:w="2916"/>
             <w:shd w:val="clear" w:color="auto" w:fill="F0F6FA"/>
             <w:vAlign w:val="center"/>
           </w:tcPr>
@@ -7091,7 +7091,7 @@
         </w:tc>
         <w:tc>
           <w:tcPr>
-            <w:tcW w:type="dxa" w:w="2493"/>
+            <w:tcW w:type="dxa" w:w="2916"/>
             <w:shd w:val="clear" w:color="auto" w:fill="F0F6FA"/>
             <w:vAlign w:val="center"/>
           </w:tcPr>
@@ -7126,7 +7126,7 @@
       <w:tr>
         <w:tc>
           <w:tcPr>
-            <w:tcW w:type="dxa" w:w="2493"/>
+            <w:tcW w:type="dxa" w:w="2916"/>
             <w:shd w:val="clear" w:color="auto" w:fill="FFFFFF"/>
             <w:vAlign w:val="center"/>
           </w:tcPr>
@@ -7148,7 +7148,7 @@
         </w:tc>
         <w:tc>
           <w:tcPr>
-            <w:tcW w:type="dxa" w:w="2493"/>
+            <w:tcW w:type="dxa" w:w="2916"/>
             <w:shd w:val="clear" w:color="auto" w:fill="FFFFFF"/>
             <w:vAlign w:val="center"/>
           </w:tcPr>
@@ -7170,7 +7170,7 @@
         </w:tc>
         <w:tc>
           <w:tcPr>
-            <w:tcW w:type="dxa" w:w="2493"/>
+            <w:tcW w:type="dxa" w:w="2916"/>
             <w:shd w:val="clear" w:color="auto" w:fill="FFFFFF"/>
             <w:vAlign w:val="center"/>
           </w:tcPr>
@@ -7193,7 +7193,7 @@
         </w:tc>
         <w:tc>
           <w:tcPr>
-            <w:tcW w:type="dxa" w:w="2493"/>
+            <w:tcW w:type="dxa" w:w="2916"/>
             <w:shd w:val="clear" w:color="auto" w:fill="FFFFFF"/>
             <w:vAlign w:val="center"/>
           </w:tcPr>
@@ -7228,7 +7228,7 @@
       <w:tr>
         <w:tc>
           <w:tcPr>
-            <w:tcW w:type="dxa" w:w="2493"/>
+            <w:tcW w:type="dxa" w:w="2916"/>
             <w:shd w:val="clear" w:color="auto" w:fill="F0F6FA"/>
             <w:vAlign w:val="center"/>
           </w:tcPr>
@@ -7250,7 +7250,7 @@
         </w:tc>
         <w:tc>
           <w:tcPr>
-            <w:tcW w:type="dxa" w:w="2493"/>
+            <w:tcW w:type="dxa" w:w="2916"/>
             <w:shd w:val="clear" w:color="auto" w:fill="F0F6FA"/>
             <w:vAlign w:val="center"/>
           </w:tcPr>
@@ -7272,7 +7272,7 @@
         </w:tc>
         <w:tc>
           <w:tcPr>
-            <w:tcW w:type="dxa" w:w="2493"/>
+            <w:tcW w:type="dxa" w:w="2916"/>
             <w:shd w:val="clear" w:color="auto" w:fill="F0F6FA"/>
             <w:vAlign w:val="center"/>
           </w:tcPr>
@@ -7295,7 +7295,7 @@
         </w:tc>
         <w:tc>
           <w:tcPr>
-            <w:tcW w:type="dxa" w:w="2493"/>
+            <w:tcW w:type="dxa" w:w="2916"/>
             <w:shd w:val="clear" w:color="auto" w:fill="F0F6FA"/>
             <w:vAlign w:val="center"/>
           </w:tcPr>
@@ -7330,7 +7330,7 @@
       <w:tr>
         <w:tc>
           <w:tcPr>
-            <w:tcW w:type="dxa" w:w="2493"/>
+            <w:tcW w:type="dxa" w:w="2916"/>
             <w:shd w:val="clear" w:color="auto" w:fill="FFFFFF"/>
             <w:vAlign w:val="center"/>
           </w:tcPr>
@@ -7352,7 +7352,7 @@
         </w:tc>
         <w:tc>
           <w:tcPr>
-            <w:tcW w:type="dxa" w:w="2493"/>
+            <w:tcW w:type="dxa" w:w="2916"/>
             <w:shd w:val="clear" w:color="auto" w:fill="FFFFFF"/>
             <w:vAlign w:val="center"/>
           </w:tcPr>
@@ -7374,7 +7374,7 @@
         </w:tc>
         <w:tc>
           <w:tcPr>
-            <w:tcW w:type="dxa" w:w="2493"/>
+            <w:tcW w:type="dxa" w:w="2916"/>
             <w:shd w:val="clear" w:color="auto" w:fill="FFFFFF"/>
             <w:vAlign w:val="center"/>
           </w:tcPr>
@@ -7397,7 +7397,7 @@
         </w:tc>
         <w:tc>
           <w:tcPr>
-            <w:tcW w:type="dxa" w:w="2493"/>
+            <w:tcW w:type="dxa" w:w="2916"/>
             <w:shd w:val="clear" w:color="auto" w:fill="FFFFFF"/>
             <w:vAlign w:val="center"/>
           </w:tcPr>
@@ -7432,7 +7432,7 @@
       <w:tr>
         <w:tc>
           <w:tcPr>
-            <w:tcW w:type="dxa" w:w="2493"/>
+            <w:tcW w:type="dxa" w:w="2916"/>
             <w:shd w:val="clear" w:color="auto" w:fill="F0F6FA"/>
             <w:vAlign w:val="center"/>
           </w:tcPr>
@@ -7454,7 +7454,7 @@
         </w:tc>
         <w:tc>
           <w:tcPr>
-            <w:tcW w:type="dxa" w:w="2493"/>
+            <w:tcW w:type="dxa" w:w="2916"/>
             <w:shd w:val="clear" w:color="auto" w:fill="F0F6FA"/>
             <w:vAlign w:val="center"/>
           </w:tcPr>
@@ -7476,7 +7476,7 @@
         </w:tc>
         <w:tc>
           <w:tcPr>
-            <w:tcW w:type="dxa" w:w="2493"/>
+            <w:tcW w:type="dxa" w:w="2916"/>
             <w:shd w:val="clear" w:color="auto" w:fill="F0F6FA"/>
             <w:vAlign w:val="center"/>
           </w:tcPr>
@@ -7499,7 +7499,7 @@
         </w:tc>
         <w:tc>
           <w:tcPr>
-            <w:tcW w:type="dxa" w:w="2493"/>
+            <w:tcW w:type="dxa" w:w="2916"/>
             <w:shd w:val="clear" w:color="auto" w:fill="F0F6FA"/>
             <w:vAlign w:val="center"/>
           </w:tcPr>
@@ -7534,7 +7534,7 @@
       <w:tr>
         <w:tc>
           <w:tcPr>
-            <w:tcW w:type="dxa" w:w="2493"/>
+            <w:tcW w:type="dxa" w:w="2916"/>
             <w:shd w:val="clear" w:color="auto" w:fill="FFFFFF"/>
             <w:vAlign w:val="center"/>
           </w:tcPr>
@@ -7556,7 +7556,7 @@
         </w:tc>
         <w:tc>
           <w:tcPr>
-            <w:tcW w:type="dxa" w:w="2493"/>
+            <w:tcW w:type="dxa" w:w="2916"/>
             <w:shd w:val="clear" w:color="auto" w:fill="FFFFFF"/>
             <w:vAlign w:val="center"/>
           </w:tcPr>
@@ -7578,7 +7578,7 @@
         </w:tc>
         <w:tc>
           <w:tcPr>
-            <w:tcW w:type="dxa" w:w="2493"/>
+            <w:tcW w:type="dxa" w:w="2916"/>
             <w:shd w:val="clear" w:color="auto" w:fill="FFFFFF"/>
             <w:vAlign w:val="center"/>
           </w:tcPr>
@@ -7601,7 +7601,7 @@
         </w:tc>
         <w:tc>
           <w:tcPr>
-            <w:tcW w:type="dxa" w:w="2493"/>
+            <w:tcW w:type="dxa" w:w="2916"/>
             <w:shd w:val="clear" w:color="auto" w:fill="FFFFFF"/>
             <w:vAlign w:val="center"/>
           </w:tcPr>
@@ -7682,16 +7682,16 @@
         <w:tblLook w:firstColumn="1" w:firstRow="1" w:lastColumn="0" w:lastRow="0" w:noHBand="0" w:noVBand="1" w:val="04A0"/>
       </w:tblPr>
       <w:tblGrid>
-        <w:gridCol w:w="1994"/>
-        <w:gridCol w:w="1994"/>
-        <w:gridCol w:w="1994"/>
-        <w:gridCol w:w="1994"/>
-        <w:gridCol w:w="1994"/>
+        <w:gridCol w:w="2333"/>
+        <w:gridCol w:w="2333"/>
+        <w:gridCol w:w="2333"/>
+        <w:gridCol w:w="2333"/>
+        <w:gridCol w:w="2333"/>
       </w:tblGrid>
       <w:tr>
         <w:tc>
           <w:tcPr>
-            <w:tcW w:type="dxa" w:w="1994"/>
+            <w:tcW w:type="dxa" w:w="2333"/>
             <w:shd w:val="clear" w:color="auto" w:fill="007A87"/>
             <w:vAlign w:val="center"/>
           </w:tcPr>
@@ -7714,7 +7714,7 @@
         </w:tc>
         <w:tc>
           <w:tcPr>
-            <w:tcW w:type="dxa" w:w="1994"/>
+            <w:tcW w:type="dxa" w:w="2333"/>
             <w:shd w:val="clear" w:color="auto" w:fill="007A87"/>
             <w:vAlign w:val="center"/>
           </w:tcPr>
@@ -7737,7 +7737,7 @@
         </w:tc>
         <w:tc>
           <w:tcPr>
-            <w:tcW w:type="dxa" w:w="1994"/>
+            <w:tcW w:type="dxa" w:w="2333"/>
             <w:shd w:val="clear" w:color="auto" w:fill="007A87"/>
             <w:vAlign w:val="center"/>
           </w:tcPr>
@@ -7760,7 +7760,7 @@
         </w:tc>
         <w:tc>
           <w:tcPr>
-            <w:tcW w:type="dxa" w:w="1994"/>
+            <w:tcW w:type="dxa" w:w="2333"/>
             <w:shd w:val="clear" w:color="auto" w:fill="007A87"/>
             <w:vAlign w:val="center"/>
           </w:tcPr>
@@ -7783,7 +7783,7 @@
         </w:tc>
         <w:tc>
           <w:tcPr>
-            <w:tcW w:type="dxa" w:w="1994"/>
+            <w:tcW w:type="dxa" w:w="2333"/>
             <w:shd w:val="clear" w:color="auto" w:fill="007A87"/>
             <w:vAlign w:val="center"/>
           </w:tcPr>
@@ -7808,7 +7808,7 @@
       <w:tr>
         <w:tc>
           <w:tcPr>
-            <w:tcW w:type="dxa" w:w="1994"/>
+            <w:tcW w:type="dxa" w:w="2333"/>
             <w:shd w:val="clear" w:color="auto" w:fill="D4F1F4"/>
             <w:vAlign w:val="center"/>
           </w:tcPr>
@@ -7831,7 +7831,7 @@
         </w:tc>
         <w:tc>
           <w:tcPr>
-            <w:tcW w:type="dxa" w:w="1994"/>
+            <w:tcW w:type="dxa" w:w="2333"/>
             <w:shd w:val="clear" w:color="auto" w:fill="D4F1F4"/>
             <w:vAlign w:val="center"/>
           </w:tcPr>
@@ -7854,7 +7854,7 @@
         </w:tc>
         <w:tc>
           <w:tcPr>
-            <w:tcW w:type="dxa" w:w="1994"/>
+            <w:tcW w:type="dxa" w:w="2333"/>
             <w:shd w:val="clear" w:color="auto" w:fill="D4F1F4"/>
             <w:vAlign w:val="center"/>
           </w:tcPr>
@@ -7877,7 +7877,7 @@
         </w:tc>
         <w:tc>
           <w:tcPr>
-            <w:tcW w:type="dxa" w:w="1994"/>
+            <w:tcW w:type="dxa" w:w="2333"/>
             <w:shd w:val="clear" w:color="auto" w:fill="D4F1F4"/>
             <w:vAlign w:val="center"/>
           </w:tcPr>
@@ -7900,7 +7900,7 @@
         </w:tc>
         <w:tc>
           <w:tcPr>
-            <w:tcW w:type="dxa" w:w="1994"/>
+            <w:tcW w:type="dxa" w:w="2333"/>
             <w:shd w:val="clear" w:color="auto" w:fill="D4F1F4"/>
             <w:vAlign w:val="center"/>
           </w:tcPr>
@@ -7925,7 +7925,7 @@
       <w:tr>
         <w:tc>
           <w:tcPr>
-            <w:tcW w:type="dxa" w:w="1994"/>
+            <w:tcW w:type="dxa" w:w="2333"/>
             <w:shd w:val="clear" w:color="auto" w:fill="FFFFFF"/>
             <w:vAlign w:val="center"/>
           </w:tcPr>
@@ -7948,7 +7948,7 @@
         </w:tc>
         <w:tc>
           <w:tcPr>
-            <w:tcW w:type="dxa" w:w="1994"/>
+            <w:tcW w:type="dxa" w:w="2333"/>
             <w:shd w:val="clear" w:color="auto" w:fill="FFFFFF"/>
             <w:vAlign w:val="center"/>
           </w:tcPr>
@@ -7971,7 +7971,7 @@
         </w:tc>
         <w:tc>
           <w:tcPr>
-            <w:tcW w:type="dxa" w:w="1994"/>
+            <w:tcW w:type="dxa" w:w="2333"/>
             <w:shd w:val="clear" w:color="auto" w:fill="FFFFFF"/>
             <w:vAlign w:val="center"/>
           </w:tcPr>
@@ -7994,7 +7994,7 @@
         </w:tc>
         <w:tc>
           <w:tcPr>
-            <w:tcW w:type="dxa" w:w="1994"/>
+            <w:tcW w:type="dxa" w:w="2333"/>
             <w:shd w:val="clear" w:color="auto" w:fill="FFFFFF"/>
             <w:vAlign w:val="center"/>
           </w:tcPr>
@@ -8017,7 +8017,7 @@
         </w:tc>
         <w:tc>
           <w:tcPr>
-            <w:tcW w:type="dxa" w:w="1994"/>
+            <w:tcW w:type="dxa" w:w="2333"/>
             <w:shd w:val="clear" w:color="auto" w:fill="FFFFFF"/>
             <w:vAlign w:val="center"/>
           </w:tcPr>
@@ -8042,7 +8042,7 @@
       <w:tr>
         <w:tc>
           <w:tcPr>
-            <w:tcW w:type="dxa" w:w="1994"/>
+            <w:tcW w:type="dxa" w:w="2333"/>
             <w:shd w:val="clear" w:color="auto" w:fill="D4F1F4"/>
             <w:vAlign w:val="center"/>
           </w:tcPr>
@@ -8065,7 +8065,7 @@
         </w:tc>
         <w:tc>
           <w:tcPr>
-            <w:tcW w:type="dxa" w:w="1994"/>
+            <w:tcW w:type="dxa" w:w="2333"/>
             <w:shd w:val="clear" w:color="auto" w:fill="D4F1F4"/>
             <w:vAlign w:val="center"/>
           </w:tcPr>
@@ -8088,7 +8088,7 @@
         </w:tc>
         <w:tc>
           <w:tcPr>
-            <w:tcW w:type="dxa" w:w="1994"/>
+            <w:tcW w:type="dxa" w:w="2333"/>
             <w:shd w:val="clear" w:color="auto" w:fill="D4F1F4"/>
             <w:vAlign w:val="center"/>
           </w:tcPr>
@@ -8111,7 +8111,7 @@
         </w:tc>
         <w:tc>
           <w:tcPr>
-            <w:tcW w:type="dxa" w:w="1994"/>
+            <w:tcW w:type="dxa" w:w="2333"/>
             <w:shd w:val="clear" w:color="auto" w:fill="D4F1F4"/>
             <w:vAlign w:val="center"/>
           </w:tcPr>
@@ -8134,7 +8134,7 @@
         </w:tc>
         <w:tc>
           <w:tcPr>
-            <w:tcW w:type="dxa" w:w="1994"/>
+            <w:tcW w:type="dxa" w:w="2333"/>
             <w:shd w:val="clear" w:color="auto" w:fill="D4F1F4"/>
             <w:vAlign w:val="center"/>
           </w:tcPr>
@@ -8159,7 +8159,7 @@
       <w:tr>
         <w:tc>
           <w:tcPr>
-            <w:tcW w:type="dxa" w:w="1994"/>
+            <w:tcW w:type="dxa" w:w="2333"/>
             <w:shd w:val="clear" w:color="auto" w:fill="FFFFFF"/>
             <w:vAlign w:val="center"/>
           </w:tcPr>
@@ -8182,7 +8182,7 @@
         </w:tc>
         <w:tc>
           <w:tcPr>
-            <w:tcW w:type="dxa" w:w="1994"/>
+            <w:tcW w:type="dxa" w:w="2333"/>
             <w:shd w:val="clear" w:color="auto" w:fill="FFFFFF"/>
             <w:vAlign w:val="center"/>
           </w:tcPr>
@@ -8205,7 +8205,7 @@
         </w:tc>
         <w:tc>
           <w:tcPr>
-            <w:tcW w:type="dxa" w:w="1994"/>
+            <w:tcW w:type="dxa" w:w="2333"/>
             <w:shd w:val="clear" w:color="auto" w:fill="FFFFFF"/>
             <w:vAlign w:val="center"/>
           </w:tcPr>
@@ -8228,7 +8228,7 @@
         </w:tc>
         <w:tc>
           <w:tcPr>
-            <w:tcW w:type="dxa" w:w="1994"/>
+            <w:tcW w:type="dxa" w:w="2333"/>
             <w:shd w:val="clear" w:color="auto" w:fill="FFFFFF"/>
             <w:vAlign w:val="center"/>
           </w:tcPr>
@@ -8251,7 +8251,7 @@
         </w:tc>
         <w:tc>
           <w:tcPr>
-            <w:tcW w:type="dxa" w:w="1994"/>
+            <w:tcW w:type="dxa" w:w="2333"/>
             <w:shd w:val="clear" w:color="auto" w:fill="FFFFFF"/>
             <w:vAlign w:val="center"/>
           </w:tcPr>
@@ -8276,7 +8276,7 @@
       <w:tr>
         <w:tc>
           <w:tcPr>
-            <w:tcW w:type="dxa" w:w="1994"/>
+            <w:tcW w:type="dxa" w:w="2333"/>
             <w:shd w:val="clear" w:color="auto" w:fill="D4F1F4"/>
             <w:vAlign w:val="center"/>
           </w:tcPr>
@@ -8299,7 +8299,7 @@
         </w:tc>
         <w:tc>
           <w:tcPr>
-            <w:tcW w:type="dxa" w:w="1994"/>
+            <w:tcW w:type="dxa" w:w="2333"/>
             <w:shd w:val="clear" w:color="auto" w:fill="D4F1F4"/>
             <w:vAlign w:val="center"/>
           </w:tcPr>
@@ -8322,7 +8322,7 @@
         </w:tc>
         <w:tc>
           <w:tcPr>
-            <w:tcW w:type="dxa" w:w="1994"/>
+            <w:tcW w:type="dxa" w:w="2333"/>
             <w:shd w:val="clear" w:color="auto" w:fill="D4F1F4"/>
             <w:vAlign w:val="center"/>
           </w:tcPr>
@@ -8345,7 +8345,7 @@
         </w:tc>
         <w:tc>
           <w:tcPr>
-            <w:tcW w:type="dxa" w:w="1994"/>
+            <w:tcW w:type="dxa" w:w="2333"/>
             <w:shd w:val="clear" w:color="auto" w:fill="D4F1F4"/>
             <w:vAlign w:val="center"/>
           </w:tcPr>
@@ -8368,7 +8368,7 @@
         </w:tc>
         <w:tc>
           <w:tcPr>
-            <w:tcW w:type="dxa" w:w="1994"/>
+            <w:tcW w:type="dxa" w:w="2333"/>
             <w:shd w:val="clear" w:color="auto" w:fill="D4F1F4"/>
             <w:vAlign w:val="center"/>
           </w:tcPr>
@@ -8393,7 +8393,7 @@
       <w:tr>
         <w:tc>
           <w:tcPr>
-            <w:tcW w:type="dxa" w:w="1994"/>
+            <w:tcW w:type="dxa" w:w="2333"/>
             <w:shd w:val="clear" w:color="auto" w:fill="FFFFFF"/>
             <w:vAlign w:val="center"/>
           </w:tcPr>
@@ -8416,7 +8416,7 @@
         </w:tc>
         <w:tc>
           <w:tcPr>
-            <w:tcW w:type="dxa" w:w="1994"/>
+            <w:tcW w:type="dxa" w:w="2333"/>
             <w:shd w:val="clear" w:color="auto" w:fill="FFFFFF"/>
             <w:vAlign w:val="center"/>
           </w:tcPr>
@@ -8439,7 +8439,7 @@
         </w:tc>
         <w:tc>
           <w:tcPr>
-            <w:tcW w:type="dxa" w:w="1994"/>
+            <w:tcW w:type="dxa" w:w="2333"/>
             <w:shd w:val="clear" w:color="auto" w:fill="FFFFFF"/>
             <w:vAlign w:val="center"/>
           </w:tcPr>
@@ -8462,7 +8462,7 @@
         </w:tc>
         <w:tc>
           <w:tcPr>
-            <w:tcW w:type="dxa" w:w="1994"/>
+            <w:tcW w:type="dxa" w:w="2333"/>
             <w:shd w:val="clear" w:color="auto" w:fill="FFFFFF"/>
             <w:vAlign w:val="center"/>
           </w:tcPr>
@@ -8485,7 +8485,7 @@
         </w:tc>
         <w:tc>
           <w:tcPr>
-            <w:tcW w:type="dxa" w:w="1994"/>
+            <w:tcW w:type="dxa" w:w="2333"/>
             <w:shd w:val="clear" w:color="auto" w:fill="FFFFFF"/>
             <w:vAlign w:val="center"/>
           </w:tcPr>
@@ -8510,7 +8510,7 @@
       <w:tr>
         <w:tc>
           <w:tcPr>
-            <w:tcW w:type="dxa" w:w="1994"/>
+            <w:tcW w:type="dxa" w:w="2333"/>
             <w:shd w:val="clear" w:color="auto" w:fill="D4F1F4"/>
             <w:vAlign w:val="center"/>
           </w:tcPr>
@@ -8533,7 +8533,7 @@
         </w:tc>
         <w:tc>
           <w:tcPr>
-            <w:tcW w:type="dxa" w:w="1994"/>
+            <w:tcW w:type="dxa" w:w="2333"/>
             <w:shd w:val="clear" w:color="auto" w:fill="D4F1F4"/>
             <w:vAlign w:val="center"/>
           </w:tcPr>
@@ -8556,7 +8556,7 @@
         </w:tc>
         <w:tc>
           <w:tcPr>
-            <w:tcW w:type="dxa" w:w="1994"/>
+            <w:tcW w:type="dxa" w:w="2333"/>
             <w:shd w:val="clear" w:color="auto" w:fill="D4F1F4"/>
             <w:vAlign w:val="center"/>
           </w:tcPr>
@@ -8579,7 +8579,7 @@
         </w:tc>
         <w:tc>
           <w:tcPr>
-            <w:tcW w:type="dxa" w:w="1994"/>
+            <w:tcW w:type="dxa" w:w="2333"/>
             <w:shd w:val="clear" w:color="auto" w:fill="D4F1F4"/>
             <w:vAlign w:val="center"/>
           </w:tcPr>
@@ -8602,7 +8602,7 @@
         </w:tc>
         <w:tc>
           <w:tcPr>
-            <w:tcW w:type="dxa" w:w="1994"/>
+            <w:tcW w:type="dxa" w:w="2333"/>
             <w:shd w:val="clear" w:color="auto" w:fill="D4F1F4"/>
             <w:vAlign w:val="center"/>
           </w:tcPr>
@@ -8627,7 +8627,7 @@
       <w:tr>
         <w:tc>
           <w:tcPr>
-            <w:tcW w:type="dxa" w:w="1994"/>
+            <w:tcW w:type="dxa" w:w="2333"/>
             <w:shd w:val="clear" w:color="auto" w:fill="FFFFFF"/>
             <w:vAlign w:val="center"/>
           </w:tcPr>
@@ -8650,7 +8650,7 @@
         </w:tc>
         <w:tc>
           <w:tcPr>
-            <w:tcW w:type="dxa" w:w="1994"/>
+            <w:tcW w:type="dxa" w:w="2333"/>
             <w:shd w:val="clear" w:color="auto" w:fill="FFFFFF"/>
             <w:vAlign w:val="center"/>
           </w:tcPr>
@@ -8673,7 +8673,7 @@
         </w:tc>
         <w:tc>
           <w:tcPr>
-            <w:tcW w:type="dxa" w:w="1994"/>
+            <w:tcW w:type="dxa" w:w="2333"/>
             <w:shd w:val="clear" w:color="auto" w:fill="FFFFFF"/>
             <w:vAlign w:val="center"/>
           </w:tcPr>
@@ -8696,7 +8696,7 @@
         </w:tc>
         <w:tc>
           <w:tcPr>
-            <w:tcW w:type="dxa" w:w="1994"/>
+            <w:tcW w:type="dxa" w:w="2333"/>
             <w:shd w:val="clear" w:color="auto" w:fill="FFFFFF"/>
             <w:vAlign w:val="center"/>
           </w:tcPr>
@@ -8719,7 +8719,7 @@
         </w:tc>
         <w:tc>
           <w:tcPr>
-            <w:tcW w:type="dxa" w:w="1994"/>
+            <w:tcW w:type="dxa" w:w="2333"/>
             <w:shd w:val="clear" w:color="auto" w:fill="FFFFFF"/>
             <w:vAlign w:val="center"/>
           </w:tcPr>
@@ -8744,7 +8744,7 @@
       <w:tr>
         <w:tc>
           <w:tcPr>
-            <w:tcW w:type="dxa" w:w="1994"/>
+            <w:tcW w:type="dxa" w:w="2333"/>
             <w:shd w:val="clear" w:color="auto" w:fill="D4F1F4"/>
             <w:vAlign w:val="center"/>
           </w:tcPr>
@@ -8767,7 +8767,7 @@
         </w:tc>
         <w:tc>
           <w:tcPr>
-            <w:tcW w:type="dxa" w:w="1994"/>
+            <w:tcW w:type="dxa" w:w="2333"/>
             <w:shd w:val="clear" w:color="auto" w:fill="D4F1F4"/>
             <w:vAlign w:val="center"/>
           </w:tcPr>
@@ -8790,7 +8790,7 @@
         </w:tc>
         <w:tc>
           <w:tcPr>
-            <w:tcW w:type="dxa" w:w="1994"/>
+            <w:tcW w:type="dxa" w:w="2333"/>
             <w:shd w:val="clear" w:color="auto" w:fill="D4F1F4"/>
             <w:vAlign w:val="center"/>
           </w:tcPr>
@@ -8813,7 +8813,7 @@
         </w:tc>
         <w:tc>
           <w:tcPr>
-            <w:tcW w:type="dxa" w:w="1994"/>
+            <w:tcW w:type="dxa" w:w="2333"/>
             <w:shd w:val="clear" w:color="auto" w:fill="D4F1F4"/>
             <w:vAlign w:val="center"/>
           </w:tcPr>
@@ -8836,7 +8836,7 @@
         </w:tc>
         <w:tc>
           <w:tcPr>
-            <w:tcW w:type="dxa" w:w="1994"/>
+            <w:tcW w:type="dxa" w:w="2333"/>
             <w:shd w:val="clear" w:color="auto" w:fill="D4F1F4"/>
             <w:vAlign w:val="center"/>
           </w:tcPr>
@@ -8861,7 +8861,7 @@
       <w:tr>
         <w:tc>
           <w:tcPr>
-            <w:tcW w:type="dxa" w:w="1994"/>
+            <w:tcW w:type="dxa" w:w="2333"/>
             <w:shd w:val="clear" w:color="auto" w:fill="FFFFFF"/>
             <w:vAlign w:val="center"/>
           </w:tcPr>
@@ -8884,7 +8884,7 @@
         </w:tc>
         <w:tc>
           <w:tcPr>
-            <w:tcW w:type="dxa" w:w="1994"/>
+            <w:tcW w:type="dxa" w:w="2333"/>
             <w:shd w:val="clear" w:color="auto" w:fill="FFFFFF"/>
             <w:vAlign w:val="center"/>
           </w:tcPr>
@@ -8907,7 +8907,7 @@
         </w:tc>
         <w:tc>
           <w:tcPr>
-            <w:tcW w:type="dxa" w:w="1994"/>
+            <w:tcW w:type="dxa" w:w="2333"/>
             <w:shd w:val="clear" w:color="auto" w:fill="FFFFFF"/>
             <w:vAlign w:val="center"/>
           </w:tcPr>
@@ -8930,7 +8930,7 @@
         </w:tc>
         <w:tc>
           <w:tcPr>
-            <w:tcW w:type="dxa" w:w="1994"/>
+            <w:tcW w:type="dxa" w:w="2333"/>
             <w:shd w:val="clear" w:color="auto" w:fill="FFFFFF"/>
             <w:vAlign w:val="center"/>
           </w:tcPr>
@@ -8953,7 +8953,7 @@
         </w:tc>
         <w:tc>
           <w:tcPr>
-            <w:tcW w:type="dxa" w:w="1994"/>
+            <w:tcW w:type="dxa" w:w="2333"/>
             <w:shd w:val="clear" w:color="auto" w:fill="FFFFFF"/>
             <w:vAlign w:val="center"/>
           </w:tcPr>
@@ -8978,7 +8978,7 @@
       <w:tr>
         <w:tc>
           <w:tcPr>
-            <w:tcW w:type="dxa" w:w="1994"/>
+            <w:tcW w:type="dxa" w:w="2333"/>
             <w:shd w:val="clear" w:color="auto" w:fill="D4F1F4"/>
             <w:vAlign w:val="center"/>
           </w:tcPr>
@@ -9001,7 +9001,7 @@
         </w:tc>
         <w:tc>
           <w:tcPr>
-            <w:tcW w:type="dxa" w:w="1994"/>
+            <w:tcW w:type="dxa" w:w="2333"/>
             <w:shd w:val="clear" w:color="auto" w:fill="D4F1F4"/>
             <w:vAlign w:val="center"/>
           </w:tcPr>
@@ -9024,7 +9024,7 @@
         </w:tc>
         <w:tc>
           <w:tcPr>
-            <w:tcW w:type="dxa" w:w="1994"/>
+            <w:tcW w:type="dxa" w:w="2333"/>
             <w:shd w:val="clear" w:color="auto" w:fill="D4F1F4"/>
             <w:vAlign w:val="center"/>
           </w:tcPr>
@@ -9047,7 +9047,7 @@
         </w:tc>
         <w:tc>
           <w:tcPr>
-            <w:tcW w:type="dxa" w:w="1994"/>
+            <w:tcW w:type="dxa" w:w="2333"/>
             <w:shd w:val="clear" w:color="auto" w:fill="D4F1F4"/>
             <w:vAlign w:val="center"/>
           </w:tcPr>
@@ -9070,7 +9070,7 @@
         </w:tc>
         <w:tc>
           <w:tcPr>
-            <w:tcW w:type="dxa" w:w="1994"/>
+            <w:tcW w:type="dxa" w:w="2333"/>
             <w:shd w:val="clear" w:color="auto" w:fill="D4F1F4"/>
             <w:vAlign w:val="center"/>
           </w:tcPr>
@@ -9095,7 +9095,7 @@
       <w:tr>
         <w:tc>
           <w:tcPr>
-            <w:tcW w:type="dxa" w:w="1994"/>
+            <w:tcW w:type="dxa" w:w="2333"/>
             <w:shd w:val="clear" w:color="auto" w:fill="FFFFFF"/>
             <w:vAlign w:val="center"/>
           </w:tcPr>
@@ -9118,7 +9118,7 @@
         </w:tc>
         <w:tc>
           <w:tcPr>
-            <w:tcW w:type="dxa" w:w="1994"/>
+            <w:tcW w:type="dxa" w:w="2333"/>
             <w:shd w:val="clear" w:color="auto" w:fill="FFFFFF"/>
             <w:vAlign w:val="center"/>
           </w:tcPr>
@@ -9141,7 +9141,7 @@
         </w:tc>
         <w:tc>
           <w:tcPr>
-            <w:tcW w:type="dxa" w:w="1994"/>
+            <w:tcW w:type="dxa" w:w="2333"/>
             <w:shd w:val="clear" w:color="auto" w:fill="FFFFFF"/>
             <w:vAlign w:val="center"/>
           </w:tcPr>
@@ -9164,7 +9164,7 @@
         </w:tc>
         <w:tc>
           <w:tcPr>
-            <w:tcW w:type="dxa" w:w="1994"/>
+            <w:tcW w:type="dxa" w:w="2333"/>
             <w:shd w:val="clear" w:color="auto" w:fill="FFFFFF"/>
             <w:vAlign w:val="center"/>
           </w:tcPr>
@@ -9187,7 +9187,7 @@
         </w:tc>
         <w:tc>
           <w:tcPr>
-            <w:tcW w:type="dxa" w:w="1994"/>
+            <w:tcW w:type="dxa" w:w="2333"/>
             <w:shd w:val="clear" w:color="auto" w:fill="FFFFFF"/>
             <w:vAlign w:val="center"/>
           </w:tcPr>
@@ -9212,7 +9212,7 @@
       <w:tr>
         <w:tc>
           <w:tcPr>
-            <w:tcW w:type="dxa" w:w="1994"/>
+            <w:tcW w:type="dxa" w:w="2333"/>
             <w:shd w:val="clear" w:color="auto" w:fill="D4F1F4"/>
             <w:vAlign w:val="center"/>
           </w:tcPr>
@@ -9235,7 +9235,7 @@
         </w:tc>
         <w:tc>
           <w:tcPr>
-            <w:tcW w:type="dxa" w:w="1994"/>
+            <w:tcW w:type="dxa" w:w="2333"/>
             <w:shd w:val="clear" w:color="auto" w:fill="D4F1F4"/>
             <w:vAlign w:val="center"/>
           </w:tcPr>
@@ -9258,7 +9258,7 @@
         </w:tc>
         <w:tc>
           <w:tcPr>
-            <w:tcW w:type="dxa" w:w="1994"/>
+            <w:tcW w:type="dxa" w:w="2333"/>
             <w:shd w:val="clear" w:color="auto" w:fill="D4F1F4"/>
             <w:vAlign w:val="center"/>
           </w:tcPr>
@@ -9281,7 +9281,7 @@
         </w:tc>
         <w:tc>
           <w:tcPr>
-            <w:tcW w:type="dxa" w:w="1994"/>
+            <w:tcW w:type="dxa" w:w="2333"/>
             <w:shd w:val="clear" w:color="auto" w:fill="D4F1F4"/>
             <w:vAlign w:val="center"/>
           </w:tcPr>
@@ -9304,7 +9304,7 @@
         </w:tc>
         <w:tc>
           <w:tcPr>
-            <w:tcW w:type="dxa" w:w="1994"/>
+            <w:tcW w:type="dxa" w:w="2333"/>
             <w:shd w:val="clear" w:color="auto" w:fill="D4F1F4"/>
             <w:vAlign w:val="center"/>
           </w:tcPr>
@@ -9329,7 +9329,7 @@
       <w:tr>
         <w:tc>
           <w:tcPr>
-            <w:tcW w:type="dxa" w:w="1994"/>
+            <w:tcW w:type="dxa" w:w="2333"/>
             <w:shd w:val="clear" w:color="auto" w:fill="FFFFFF"/>
             <w:vAlign w:val="center"/>
           </w:tcPr>
@@ -9352,7 +9352,7 @@
         </w:tc>
         <w:tc>
           <w:tcPr>
-            <w:tcW w:type="dxa" w:w="1994"/>
+            <w:tcW w:type="dxa" w:w="2333"/>
             <w:shd w:val="clear" w:color="auto" w:fill="FFFFFF"/>
             <w:vAlign w:val="center"/>
           </w:tcPr>
@@ -9375,7 +9375,7 @@
         </w:tc>
         <w:tc>
           <w:tcPr>
-            <w:tcW w:type="dxa" w:w="1994"/>
+            <w:tcW w:type="dxa" w:w="2333"/>
             <w:shd w:val="clear" w:color="auto" w:fill="FFFFFF"/>
             <w:vAlign w:val="center"/>
           </w:tcPr>
@@ -9398,7 +9398,7 @@
         </w:tc>
         <w:tc>
           <w:tcPr>
-            <w:tcW w:type="dxa" w:w="1994"/>
+            <w:tcW w:type="dxa" w:w="2333"/>
             <w:shd w:val="clear" w:color="auto" w:fill="FFFFFF"/>
             <w:vAlign w:val="center"/>
           </w:tcPr>
@@ -9421,7 +9421,7 @@
         </w:tc>
         <w:tc>
           <w:tcPr>
-            <w:tcW w:type="dxa" w:w="1994"/>
+            <w:tcW w:type="dxa" w:w="2333"/>
             <w:shd w:val="clear" w:color="auto" w:fill="FFFFFF"/>
             <w:vAlign w:val="center"/>
           </w:tcPr>
@@ -9446,7 +9446,7 @@
       <w:tr>
         <w:tc>
           <w:tcPr>
-            <w:tcW w:type="dxa" w:w="1994"/>
+            <w:tcW w:type="dxa" w:w="2333"/>
             <w:shd w:val="clear" w:color="auto" w:fill="D4F1F4"/>
             <w:vAlign w:val="center"/>
           </w:tcPr>
@@ -9469,7 +9469,7 @@
         </w:tc>
         <w:tc>
           <w:tcPr>
-            <w:tcW w:type="dxa" w:w="1994"/>
+            <w:tcW w:type="dxa" w:w="2333"/>
             <w:shd w:val="clear" w:color="auto" w:fill="D4F1F4"/>
             <w:vAlign w:val="center"/>
           </w:tcPr>
@@ -9492,7 +9492,7 @@
         </w:tc>
         <w:tc>
           <w:tcPr>
-            <w:tcW w:type="dxa" w:w="1994"/>
+            <w:tcW w:type="dxa" w:w="2333"/>
             <w:shd w:val="clear" w:color="auto" w:fill="D4F1F4"/>
             <w:vAlign w:val="center"/>
           </w:tcPr>
@@ -9515,7 +9515,7 @@
         </w:tc>
         <w:tc>
           <w:tcPr>
-            <w:tcW w:type="dxa" w:w="1994"/>
+            <w:tcW w:type="dxa" w:w="2333"/>
             <w:shd w:val="clear" w:color="auto" w:fill="D4F1F4"/>
             <w:vAlign w:val="center"/>
           </w:tcPr>
@@ -9538,7 +9538,7 @@
         </w:tc>
         <w:tc>
           <w:tcPr>
-            <w:tcW w:type="dxa" w:w="1994"/>
+            <w:tcW w:type="dxa" w:w="2333"/>
             <w:shd w:val="clear" w:color="auto" w:fill="D4F1F4"/>
             <w:vAlign w:val="center"/>
           </w:tcPr>
@@ -9563,7 +9563,7 @@
       <w:tr>
         <w:tc>
           <w:tcPr>
-            <w:tcW w:type="dxa" w:w="1994"/>
+            <w:tcW w:type="dxa" w:w="2333"/>
             <w:shd w:val="clear" w:color="auto" w:fill="FFFFFF"/>
             <w:vAlign w:val="center"/>
           </w:tcPr>
@@ -9586,7 +9586,7 @@
         </w:tc>
         <w:tc>
           <w:tcPr>
-            <w:tcW w:type="dxa" w:w="1994"/>
+            <w:tcW w:type="dxa" w:w="2333"/>
             <w:shd w:val="clear" w:color="auto" w:fill="FFFFFF"/>
             <w:vAlign w:val="center"/>
           </w:tcPr>
@@ -9609,7 +9609,7 @@
         </w:tc>
         <w:tc>
           <w:tcPr>
-            <w:tcW w:type="dxa" w:w="1994"/>
+            <w:tcW w:type="dxa" w:w="2333"/>
             <w:shd w:val="clear" w:color="auto" w:fill="FFFFFF"/>
             <w:vAlign w:val="center"/>
           </w:tcPr>
@@ -9632,7 +9632,7 @@
         </w:tc>
         <w:tc>
           <w:tcPr>
-            <w:tcW w:type="dxa" w:w="1994"/>
+            <w:tcW w:type="dxa" w:w="2333"/>
             <w:shd w:val="clear" w:color="auto" w:fill="FFFFFF"/>
             <w:vAlign w:val="center"/>
           </w:tcPr>
@@ -9655,7 +9655,7 @@
         </w:tc>
         <w:tc>
           <w:tcPr>
-            <w:tcW w:type="dxa" w:w="1994"/>
+            <w:tcW w:type="dxa" w:w="2333"/>
             <w:shd w:val="clear" w:color="auto" w:fill="FFFFFF"/>
             <w:vAlign w:val="center"/>
           </w:tcPr>
@@ -9680,7 +9680,7 @@
       <w:tr>
         <w:tc>
           <w:tcPr>
-            <w:tcW w:type="dxa" w:w="1994"/>
+            <w:tcW w:type="dxa" w:w="2333"/>
             <w:shd w:val="clear" w:color="auto" w:fill="D4F1F4"/>
             <w:vAlign w:val="center"/>
           </w:tcPr>
@@ -9703,7 +9703,7 @@
         </w:tc>
         <w:tc>
           <w:tcPr>
-            <w:tcW w:type="dxa" w:w="1994"/>
+            <w:tcW w:type="dxa" w:w="2333"/>
             <w:shd w:val="clear" w:color="auto" w:fill="D4F1F4"/>
             <w:vAlign w:val="center"/>
           </w:tcPr>
@@ -9726,7 +9726,7 @@
         </w:tc>
         <w:tc>
           <w:tcPr>
-            <w:tcW w:type="dxa" w:w="1994"/>
+            <w:tcW w:type="dxa" w:w="2333"/>
             <w:shd w:val="clear" w:color="auto" w:fill="D4F1F4"/>
             <w:vAlign w:val="center"/>
           </w:tcPr>
@@ -9749,7 +9749,7 @@
         </w:tc>
         <w:tc>
           <w:tcPr>
-            <w:tcW w:type="dxa" w:w="1994"/>
+            <w:tcW w:type="dxa" w:w="2333"/>
             <w:shd w:val="clear" w:color="auto" w:fill="D4F1F4"/>
             <w:vAlign w:val="center"/>
           </w:tcPr>
@@ -9772,7 +9772,7 @@
         </w:tc>
         <w:tc>
           <w:tcPr>
-            <w:tcW w:type="dxa" w:w="1994"/>
+            <w:tcW w:type="dxa" w:w="2333"/>
             <w:shd w:val="clear" w:color="auto" w:fill="D4F1F4"/>
             <w:vAlign w:val="center"/>
           </w:tcPr>
@@ -9797,7 +9797,7 @@
       <w:tr>
         <w:tc>
           <w:tcPr>
-            <w:tcW w:type="dxa" w:w="1994"/>
+            <w:tcW w:type="dxa" w:w="2333"/>
             <w:shd w:val="clear" w:color="auto" w:fill="FFFFFF"/>
             <w:vAlign w:val="center"/>
           </w:tcPr>
@@ -9820,7 +9820,7 @@
         </w:tc>
         <w:tc>
           <w:tcPr>
-            <w:tcW w:type="dxa" w:w="1994"/>
+            <w:tcW w:type="dxa" w:w="2333"/>
             <w:shd w:val="clear" w:color="auto" w:fill="FFFFFF"/>
             <w:vAlign w:val="center"/>
           </w:tcPr>
@@ -9843,7 +9843,7 @@
         </w:tc>
         <w:tc>
           <w:tcPr>
-            <w:tcW w:type="dxa" w:w="1994"/>
+            <w:tcW w:type="dxa" w:w="2333"/>
             <w:shd w:val="clear" w:color="auto" w:fill="FFFFFF"/>
             <w:vAlign w:val="center"/>
           </w:tcPr>
@@ -9866,7 +9866,7 @@
         </w:tc>
         <w:tc>
           <w:tcPr>
-            <w:tcW w:type="dxa" w:w="1994"/>
+            <w:tcW w:type="dxa" w:w="2333"/>
             <w:shd w:val="clear" w:color="auto" w:fill="FFFFFF"/>
             <w:vAlign w:val="center"/>
           </w:tcPr>
@@ -9889,7 +9889,7 @@
         </w:tc>
         <w:tc>
           <w:tcPr>
-            <w:tcW w:type="dxa" w:w="1994"/>
+            <w:tcW w:type="dxa" w:w="2333"/>
             <w:shd w:val="clear" w:color="auto" w:fill="FFFFFF"/>
             <w:vAlign w:val="center"/>
           </w:tcPr>
@@ -9914,7 +9914,7 @@
       <w:tr>
         <w:tc>
           <w:tcPr>
-            <w:tcW w:type="dxa" w:w="1994"/>
+            <w:tcW w:type="dxa" w:w="2333"/>
             <w:shd w:val="clear" w:color="auto" w:fill="D4F1F4"/>
             <w:vAlign w:val="center"/>
           </w:tcPr>
@@ -9937,7 +9937,7 @@
         </w:tc>
         <w:tc>
           <w:tcPr>
-            <w:tcW w:type="dxa" w:w="1994"/>
+            <w:tcW w:type="dxa" w:w="2333"/>
             <w:shd w:val="clear" w:color="auto" w:fill="D4F1F4"/>
             <w:vAlign w:val="center"/>
           </w:tcPr>
@@ -9960,7 +9960,7 @@
         </w:tc>
         <w:tc>
           <w:tcPr>
-            <w:tcW w:type="dxa" w:w="1994"/>
+            <w:tcW w:type="dxa" w:w="2333"/>
             <w:shd w:val="clear" w:color="auto" w:fill="D4F1F4"/>
             <w:vAlign w:val="center"/>
           </w:tcPr>
@@ -9983,7 +9983,7 @@
         </w:tc>
         <w:tc>
           <w:tcPr>
-            <w:tcW w:type="dxa" w:w="1994"/>
+            <w:tcW w:type="dxa" w:w="2333"/>
             <w:shd w:val="clear" w:color="auto" w:fill="D4F1F4"/>
             <w:vAlign w:val="center"/>
           </w:tcPr>
@@ -10006,7 +10006,7 @@
         </w:tc>
         <w:tc>
           <w:tcPr>
-            <w:tcW w:type="dxa" w:w="1994"/>
+            <w:tcW w:type="dxa" w:w="2333"/>
             <w:shd w:val="clear" w:color="auto" w:fill="D4F1F4"/>
             <w:vAlign w:val="center"/>
           </w:tcPr>
@@ -10031,7 +10031,7 @@
       <w:tr>
         <w:tc>
           <w:tcPr>
-            <w:tcW w:type="dxa" w:w="1994"/>
+            <w:tcW w:type="dxa" w:w="2333"/>
             <w:shd w:val="clear" w:color="auto" w:fill="FFFFFF"/>
             <w:vAlign w:val="center"/>
           </w:tcPr>
@@ -10054,7 +10054,7 @@
         </w:tc>
         <w:tc>
           <w:tcPr>
-            <w:tcW w:type="dxa" w:w="1994"/>
+            <w:tcW w:type="dxa" w:w="2333"/>
             <w:shd w:val="clear" w:color="auto" w:fill="FFFFFF"/>
             <w:vAlign w:val="center"/>
           </w:tcPr>
@@ -10077,7 +10077,7 @@
         </w:tc>
         <w:tc>
           <w:tcPr>
-            <w:tcW w:type="dxa" w:w="1994"/>
+            <w:tcW w:type="dxa" w:w="2333"/>
             <w:shd w:val="clear" w:color="auto" w:fill="FFFFFF"/>
             <w:vAlign w:val="center"/>
           </w:tcPr>
@@ -10100,7 +10100,7 @@
         </w:tc>
         <w:tc>
           <w:tcPr>
-            <w:tcW w:type="dxa" w:w="1994"/>
+            <w:tcW w:type="dxa" w:w="2333"/>
             <w:shd w:val="clear" w:color="auto" w:fill="FFFFFF"/>
             <w:vAlign w:val="center"/>
           </w:tcPr>
@@ -10123,7 +10123,7 @@
         </w:tc>
         <w:tc>
           <w:tcPr>
-            <w:tcW w:type="dxa" w:w="1994"/>
+            <w:tcW w:type="dxa" w:w="2333"/>
             <w:shd w:val="clear" w:color="auto" w:fill="FFFFFF"/>
             <w:vAlign w:val="center"/>
           </w:tcPr>
@@ -10209,13 +10209,13 @@
         <w:tblLook w:firstColumn="1" w:firstRow="1" w:lastColumn="0" w:lastRow="0" w:noHBand="0" w:noVBand="1" w:val="04A0"/>
       </w:tblPr>
       <w:tblGrid>
-        <w:gridCol w:w="4986"/>
-        <w:gridCol w:w="4986"/>
+        <w:gridCol w:w="5832"/>
+        <w:gridCol w:w="5832"/>
       </w:tblGrid>
       <w:tr>
         <w:tc>
           <w:tcPr>
-            <w:tcW w:type="dxa" w:w="4986"/>
+            <w:tcW w:type="dxa" w:w="5832"/>
             <w:shd w:val="clear" w:color="auto" w:fill="F0F6FA"/>
             <w:vAlign w:val="top"/>
           </w:tcPr>
@@ -10252,7 +10252,7 @@
         </w:tc>
         <w:tc>
           <w:tcPr>
-            <w:tcW w:type="dxa" w:w="4986"/>
+            <w:tcW w:type="dxa" w:w="5832"/>
             <w:shd w:val="clear" w:color="auto" w:fill="F0F6FA"/>
             <w:vAlign w:val="top"/>
           </w:tcPr>
@@ -10291,7 +10291,7 @@
       <w:tr>
         <w:tc>
           <w:tcPr>
-            <w:tcW w:type="dxa" w:w="4986"/>
+            <w:tcW w:type="dxa" w:w="5832"/>
             <w:shd w:val="clear" w:color="auto" w:fill="FFFFFF"/>
             <w:vAlign w:val="top"/>
           </w:tcPr>
@@ -10328,7 +10328,7 @@
         </w:tc>
         <w:tc>
           <w:tcPr>
-            <w:tcW w:type="dxa" w:w="4986"/>
+            <w:tcW w:type="dxa" w:w="5832"/>
             <w:shd w:val="clear" w:color="auto" w:fill="FFFFFF"/>
             <w:vAlign w:val="top"/>
           </w:tcPr>
@@ -10367,7 +10367,7 @@
       <w:tr>
         <w:tc>
           <w:tcPr>
-            <w:tcW w:type="dxa" w:w="4986"/>
+            <w:tcW w:type="dxa" w:w="5832"/>
             <w:shd w:val="clear" w:color="auto" w:fill="F0F6FA"/>
             <w:vAlign w:val="top"/>
           </w:tcPr>
@@ -10404,7 +10404,7 @@
         </w:tc>
         <w:tc>
           <w:tcPr>
-            <w:tcW w:type="dxa" w:w="4986"/>
+            <w:tcW w:type="dxa" w:w="5832"/>
             <w:shd w:val="clear" w:color="auto" w:fill="F0F6FA"/>
             <w:vAlign w:val="top"/>
           </w:tcPr>
@@ -10443,7 +10443,7 @@
     </w:tbl>
     <w:sectPr>
       <w:pgSz w:w="12240" w:h="15840"/>
-      <w:pgMar w:top="1134" w:right="1134" w:bottom="1134" w:left="1134" w:header="720" w:footer="720" w:gutter="0"/>
+      <w:pgMar w:top="288" w:right="288" w:bottom="288" w:left="288" w:header="720" w:footer="720" w:gutter="0"/>
       <w:cols w:space="720"/>
       <w:docGrid w:linePitch="360"/>
     </w:sectPr>

</xml_diff>